<commit_message>
Actualiza claude y manuales tecnico y usuario
</commit_message>
<xml_diff>
--- a/Manual_Usuario_Sistema_RRHH.docx
+++ b/Manual_Usuario_Sistema_RRHH.docx
@@ -6227,6 +6227,533 @@
         <w:t>Consejo de Comunicación — Manual de Usuario — Uso Interno</w:t>
         <w:br/>
         <w:t>Versión 1.0   |   11/06/2026</w:t>
+      </w:r>
+    </w:p>
+    <w:p>
+      <w:r>
+        <w:br w:type="page"/>
+      </w:r>
+    </w:p>
+    <w:p>
+      <w:pPr>
+        <w:pStyle w:val="Heading1"/>
+      </w:pPr>
+      <w:r>
+        <w:rPr>
+          <w:color w:val="0B5547"/>
+        </w:rPr>
+        <w:t>11. Asistente de Ayuda del Sistema</w:t>
+      </w:r>
+    </w:p>
+    <w:p>
+      <w:r>
+        <w:rPr>
+          <w:sz w:val="21"/>
+        </w:rPr>
+        <w:t>El sistema incluye un asistente de ayuda accesible desde cualquier pantalla. Puede reconocerlo por el botón circular verde con ícono de chat ubicado en la esquina inferior derecha de la pantalla.</w:t>
+      </w:r>
+    </w:p>
+    <w:p>
+      <w:pPr>
+        <w:pStyle w:val="Heading2"/>
+      </w:pPr>
+      <w:r>
+        <w:rPr>
+          <w:color w:val="068174"/>
+        </w:rPr>
+        <w:t>11.1 ¿Cómo acceder al asistente?</w:t>
+      </w:r>
+    </w:p>
+    <w:p>
+      <w:pPr>
+        <w:pStyle w:val="ListNumber"/>
+      </w:pPr>
+      <w:r>
+        <w:rPr>
+          <w:sz w:val="21"/>
+        </w:rPr>
+        <w:t>Haga clic en el botón circular verde con ícono de chat (esquina inferior derecha).</w:t>
+      </w:r>
+    </w:p>
+    <w:p>
+      <w:pPr>
+        <w:pStyle w:val="ListNumber"/>
+      </w:pPr>
+      <w:r>
+        <w:rPr>
+          <w:sz w:val="21"/>
+        </w:rPr>
+        <w:t>Se abrirá una ventana de chat con un mensaje de bienvenida.</w:t>
+      </w:r>
+    </w:p>
+    <w:p>
+      <w:pPr>
+        <w:pStyle w:val="ListNumber"/>
+      </w:pPr>
+      <w:r>
+        <w:rPr>
+          <w:sz w:val="21"/>
+        </w:rPr>
+        <w:t>Verá 4 botones de acceso rápido para las consultas más frecuentes.</w:t>
+      </w:r>
+    </w:p>
+    <w:p>
+      <w:pPr>
+        <w:pStyle w:val="ListNumber"/>
+      </w:pPr>
+      <w:r>
+        <w:rPr>
+          <w:sz w:val="21"/>
+        </w:rPr>
+        <w:t>Haga clic en uno de los botones rápidos, o escriba su pregunta y presione Enter.</w:t>
+      </w:r>
+    </w:p>
+    <w:p>
+      <w:pPr>
+        <w:pStyle w:val="ListNumber"/>
+      </w:pPr>
+      <w:r>
+        <w:rPr>
+          <w:sz w:val="21"/>
+        </w:rPr>
+        <w:t>El asistente responderá con instrucciones paso a paso.</w:t>
+      </w:r>
+    </w:p>
+    <w:p>
+      <w:pPr>
+        <w:pStyle w:val="ListNumber"/>
+      </w:pPr>
+      <w:r>
+        <w:rPr>
+          <w:sz w:val="21"/>
+        </w:rPr>
+        <w:t>Para cerrar, haga clic en el botón X del encabezado o en el botón FAB nuevamente.</w:t>
+      </w:r>
+    </w:p>
+    <w:p>
+      <w:r>
+        <w:rPr>
+          <w:i/>
+          <w:color w:val="0B5547"/>
+          <w:sz w:val="20"/>
+        </w:rPr>
+        <w:t>ℹ  El asistente conserva el historial de la conversación mientras no cambie de módulo o recargue la página.</w:t>
+      </w:r>
+    </w:p>
+    <w:p>
+      <w:pPr>
+        <w:pStyle w:val="Heading2"/>
+      </w:pPr>
+      <w:r>
+        <w:rPr>
+          <w:color w:val="068174"/>
+        </w:rPr>
+        <w:t>11.2 ¿Qué puede preguntarle al asistente?</w:t>
+      </w:r>
+    </w:p>
+    <w:p>
+      <w:r>
+        <w:rPr>
+          <w:sz w:val="21"/>
+        </w:rPr>
+        <w:t>El asistente puede responder preguntas sobre el uso del sistema, por ejemplo:</w:t>
+      </w:r>
+    </w:p>
+    <w:tbl>
+      <w:tblPr>
+        <w:tblStyle w:val="TableGrid"/>
+        <w:tblW w:type="auto" w:w="0"/>
+        <w:tblLook w:firstColumn="1" w:firstRow="1" w:lastColumn="0" w:lastRow="0" w:noHBand="0" w:noVBand="1" w:val="04A0"/>
+      </w:tblPr>
+      <w:tblGrid>
+        <w:gridCol w:w="4561"/>
+        <w:gridCol w:w="4561"/>
+      </w:tblGrid>
+      <w:tr>
+        <w:tc>
+          <w:tcPr>
+            <w:tcW w:type="dxa" w:w="4561"/>
+            <w:shd w:val="clear" w:color="auto" w:fill="0b5547"/>
+          </w:tcPr>
+          <w:p>
+            <w:pPr>
+              <w:jc w:val="center"/>
+            </w:pPr>
+            <w:r>
+              <w:rPr>
+                <w:b/>
+                <w:color w:val="FFFFFF"/>
+                <w:sz w:val="20"/>
+              </w:rPr>
+              <w:t>Área</w:t>
+            </w:r>
+          </w:p>
+        </w:tc>
+        <w:tc>
+          <w:tcPr>
+            <w:tcW w:type="dxa" w:w="4561"/>
+            <w:shd w:val="clear" w:color="auto" w:fill="0b5547"/>
+          </w:tcPr>
+          <w:p>
+            <w:pPr>
+              <w:jc w:val="center"/>
+            </w:pPr>
+            <w:r>
+              <w:rPr>
+                <w:b/>
+                <w:color w:val="FFFFFF"/>
+                <w:sz w:val="20"/>
+              </w:rPr>
+              <w:t>Ejemplos de preguntas</w:t>
+            </w:r>
+          </w:p>
+        </w:tc>
+      </w:tr>
+      <w:tr>
+        <w:tc>
+          <w:tcPr>
+            <w:tcW w:type="dxa" w:w="4561"/>
+          </w:tcPr>
+          <w:p>
+            <w:r>
+              <w:rPr>
+                <w:b/>
+                <w:sz w:val="19"/>
+              </w:rPr>
+              <w:t>Asistencia</w:t>
+            </w:r>
+          </w:p>
+        </w:tc>
+        <w:tc>
+          <w:tcPr>
+            <w:tcW w:type="dxa" w:w="4561"/>
+          </w:tcPr>
+          <w:p>
+            <w:r>
+              <w:rPr>
+                <w:sz w:val="19"/>
+              </w:rPr>
+              <w:t>"¿Cómo marco mi asistencia?" / "¿Por qué no puedo marcar?" / "¿Qué es el reloj biométrico?"</w:t>
+            </w:r>
+          </w:p>
+        </w:tc>
+      </w:tr>
+      <w:tr>
+        <w:tc>
+          <w:tcPr>
+            <w:tcW w:type="dxa" w:w="4561"/>
+          </w:tcPr>
+          <w:p>
+            <w:r>
+              <w:rPr>
+                <w:b/>
+                <w:sz w:val="19"/>
+              </w:rPr>
+              <w:t>Permisos</w:t>
+            </w:r>
+          </w:p>
+        </w:tc>
+        <w:tc>
+          <w:tcPr>
+            <w:tcW w:type="dxa" w:w="4561"/>
+          </w:tcPr>
+          <w:p>
+            <w:r>
+              <w:rPr>
+                <w:sz w:val="19"/>
+              </w:rPr>
+              <w:t>"¿Cómo solicito un permiso?" / "¿Qué es un permiso descontable?" / "¿Cómo se anula un permiso?"</w:t>
+            </w:r>
+          </w:p>
+        </w:tc>
+      </w:tr>
+      <w:tr>
+        <w:tc>
+          <w:tcPr>
+            <w:tcW w:type="dxa" w:w="4561"/>
+          </w:tcPr>
+          <w:p>
+            <w:r>
+              <w:rPr>
+                <w:b/>
+                <w:sz w:val="19"/>
+              </w:rPr>
+              <w:t>Vacaciones</w:t>
+            </w:r>
+          </w:p>
+        </w:tc>
+        <w:tc>
+          <w:tcPr>
+            <w:tcW w:type="dxa" w:w="4561"/>
+          </w:tcPr>
+          <w:p>
+            <w:r>
+              <w:rPr>
+                <w:sz w:val="19"/>
+              </w:rPr>
+              <w:t>"¿Cuántos días de vacaciones tengo?" / "¿Cómo solicito vacaciones?" / "¿Qué es la planificación anual?"</w:t>
+            </w:r>
+          </w:p>
+        </w:tc>
+      </w:tr>
+      <w:tr>
+        <w:tc>
+          <w:tcPr>
+            <w:tcW w:type="dxa" w:w="4561"/>
+          </w:tcPr>
+          <w:p>
+            <w:r>
+              <w:rPr>
+                <w:b/>
+                <w:sz w:val="19"/>
+              </w:rPr>
+              <w:t>Horas Extras</w:t>
+            </w:r>
+          </w:p>
+        </w:tc>
+        <w:tc>
+          <w:tcPr>
+            <w:tcW w:type="dxa" w:w="4561"/>
+          </w:tcPr>
+          <w:p>
+            <w:r>
+              <w:rPr>
+                <w:sz w:val="19"/>
+              </w:rPr>
+              <w:t>"¿Cómo creo una planificación de horas extras?" / "¿Qué son horas suplementarias?"</w:t>
+            </w:r>
+          </w:p>
+        </w:tc>
+      </w:tr>
+      <w:tr>
+        <w:tc>
+          <w:tcPr>
+            <w:tcW w:type="dxa" w:w="4561"/>
+          </w:tcPr>
+          <w:p>
+            <w:r>
+              <w:rPr>
+                <w:b/>
+                <w:sz w:val="19"/>
+              </w:rPr>
+              <w:t>Nómina</w:t>
+            </w:r>
+          </w:p>
+        </w:tc>
+        <w:tc>
+          <w:tcPr>
+            <w:tcW w:type="dxa" w:w="4561"/>
+          </w:tcPr>
+          <w:p>
+            <w:r>
+              <w:rPr>
+                <w:sz w:val="19"/>
+              </w:rPr>
+              <w:t>"¿Cómo se calcula el Décimo Tercero?" / "¿Qué es el Rol de Pagos?"</w:t>
+            </w:r>
+          </w:p>
+        </w:tc>
+      </w:tr>
+      <w:tr>
+        <w:tc>
+          <w:tcPr>
+            <w:tcW w:type="dxa" w:w="4561"/>
+          </w:tcPr>
+          <w:p>
+            <w:r>
+              <w:rPr>
+                <w:b/>
+                <w:sz w:val="19"/>
+              </w:rPr>
+              <w:t>Adquisiciones</w:t>
+            </w:r>
+          </w:p>
+        </w:tc>
+        <w:tc>
+          <w:tcPr>
+            <w:tcW w:type="dxa" w:w="4561"/>
+          </w:tcPr>
+          <w:p>
+            <w:r>
+              <w:rPr>
+                <w:sz w:val="19"/>
+              </w:rPr>
+              <w:t>"¿Cómo registro un ingreso de bienes?" / "¿Cómo solicito materiales?" / "¿Qué es el kardex NIC 2?"</w:t>
+            </w:r>
+          </w:p>
+        </w:tc>
+      </w:tr>
+      <w:tr>
+        <w:tc>
+          <w:tcPr>
+            <w:tcW w:type="dxa" w:w="4561"/>
+          </w:tcPr>
+          <w:p>
+            <w:r>
+              <w:rPr>
+                <w:b/>
+                <w:sz w:val="19"/>
+              </w:rPr>
+              <w:t>Transportes</w:t>
+            </w:r>
+          </w:p>
+        </w:tc>
+        <w:tc>
+          <w:tcPr>
+            <w:tcW w:type="dxa" w:w="4561"/>
+          </w:tcPr>
+          <w:p>
+            <w:r>
+              <w:rPr>
+                <w:sz w:val="19"/>
+              </w:rPr>
+              <w:t>"¿Cómo solicito un vehículo?" / "¿Cómo registro la hoja de ruta?" / "¿Cómo emito un vale de combustible?"</w:t>
+            </w:r>
+          </w:p>
+        </w:tc>
+      </w:tr>
+      <w:tr>
+        <w:tc>
+          <w:tcPr>
+            <w:tcW w:type="dxa" w:w="4561"/>
+          </w:tcPr>
+          <w:p>
+            <w:r>
+              <w:rPr>
+                <w:b/>
+                <w:sz w:val="19"/>
+              </w:rPr>
+              <w:t>Sistema</w:t>
+            </w:r>
+          </w:p>
+        </w:tc>
+        <w:tc>
+          <w:tcPr>
+            <w:tcW w:type="dxa" w:w="4561"/>
+          </w:tcPr>
+          <w:p>
+            <w:r>
+              <w:rPr>
+                <w:sz w:val="19"/>
+              </w:rPr>
+              <w:t>"¿Qué significa el modo mantenimiento?" / "¿Cómo subo un documento firmado?"</w:t>
+            </w:r>
+          </w:p>
+        </w:tc>
+      </w:tr>
+    </w:tbl>
+    <w:p/>
+    <w:p>
+      <w:pPr>
+        <w:pStyle w:val="Heading2"/>
+      </w:pPr>
+      <w:r>
+        <w:rPr>
+          <w:color w:val="068174"/>
+        </w:rPr>
+        <w:t>11.3 Preguntas fuera del sistema</w:t>
+      </w:r>
+    </w:p>
+    <w:p>
+      <w:r>
+        <w:rPr>
+          <w:sz w:val="21"/>
+        </w:rPr>
+        <w:t>Si hace una pregunta que no esté relacionada con el uso del aplicativo (por ejemplo, preguntas sobre otros sistemas, sobre contabilidad, o temas personales), el asistente responderá únicamente:</w:t>
+      </w:r>
+    </w:p>
+    <w:p>
+      <w:r>
+        <w:rPr>
+          <w:b/>
+          <w:i/>
+          <w:color w:val="0B5547"/>
+          <w:sz w:val="22"/>
+        </w:rPr>
+        <w:t>"Para esta consulta comuníquese con la Dirección de Tecnologías de la Información."</w:t>
+      </w:r>
+    </w:p>
+    <w:p>
+      <w:r>
+        <w:rPr>
+          <w:i/>
+          <w:color w:val="B8860B"/>
+          <w:sz w:val="20"/>
+        </w:rPr>
+        <w:t>⚠  El asistente NO puede realizar acciones en el sistema: no solicita permisos, no genera reportes, no aprueba solicitudes. Solo proporciona guías sobre cómo usar el sistema.</w:t>
+      </w:r>
+    </w:p>
+    <w:p>
+      <w:pPr>
+        <w:pStyle w:val="Heading2"/>
+      </w:pPr>
+      <w:r>
+        <w:rPr>
+          <w:color w:val="068174"/>
+        </w:rPr>
+        <w:t>11.4 Disponibilidad</w:t>
+      </w:r>
+    </w:p>
+    <w:p>
+      <w:r>
+        <w:rPr>
+          <w:sz w:val="21"/>
+        </w:rPr>
+        <w:t>El asistente está disponible en:</w:t>
+      </w:r>
+    </w:p>
+    <w:p>
+      <w:pPr>
+        <w:pStyle w:val="ListBullet"/>
+      </w:pPr>
+      <w:r>
+        <w:rPr>
+          <w:sz w:val="21"/>
+        </w:rPr>
+        <w:t>Pantalla de selección de módulos (Launcher)</w:t>
+      </w:r>
+    </w:p>
+    <w:p>
+      <w:pPr>
+        <w:pStyle w:val="ListBullet"/>
+      </w:pPr>
+      <w:r>
+        <w:rPr>
+          <w:sz w:val="21"/>
+        </w:rPr>
+        <w:t>Módulo Talento Humano (todas las vistas)</w:t>
+      </w:r>
+    </w:p>
+    <w:p>
+      <w:pPr>
+        <w:pStyle w:val="ListBullet"/>
+      </w:pPr>
+      <w:r>
+        <w:rPr>
+          <w:sz w:val="21"/>
+        </w:rPr>
+        <w:t>Módulo Adquisiciones (todas las vistas)</w:t>
+      </w:r>
+    </w:p>
+    <w:p>
+      <w:pPr>
+        <w:pStyle w:val="ListBullet"/>
+      </w:pPr>
+      <w:r>
+        <w:rPr>
+          <w:sz w:val="21"/>
+        </w:rPr>
+        <w:t>Módulo Transportes (todas las vistas)</w:t>
+      </w:r>
+    </w:p>
+    <w:p>
+      <w:r>
+        <w:rPr>
+          <w:i/>
+          <w:color w:val="0B5547"/>
+          <w:sz w:val="20"/>
+        </w:rPr>
+        <w:t>ℹ  Durante el modo de mantenimiento del sistema, el asistente no está disponible (queda tapado por la pantalla de mantenimiento).</w:t>
       </w:r>
     </w:p>
     <w:sectPr>

</xml_diff>

<commit_message>
Añade boton descargar en excel en el inventario mensual
</commit_message>
<xml_diff>
--- a/Manual_Usuario_Sistema_RRHH.docx
+++ b/Manual_Usuario_Sistema_RRHH.docx
@@ -108,10 +108,7 @@
         <w:jc w:val="center"/>
       </w:pPr>
       <w:r>
-        <w:t xml:space="preserve">Versión 1.0   |   11 de June </w:t>
-      </w:r>
-      <w:r>
-        <w:t>de 2026</w:t>
+        <w:t>Versión 1.0   |   11 de June de 2026</w:t>
       </w:r>
     </w:p>
     <w:p>
@@ -121,8 +118,6 @@
       <w:r>
         <w:br w:type="page"/>
       </w:r>
-      <w:bookmarkStart w:id="0" w:name="_GoBack"/>
-      <w:bookmarkEnd w:id="0"/>
     </w:p>
     <w:p>
       <w:pPr>
@@ -145,13 +140,7 @@
         <w:rPr>
           <w:sz w:val="21"/>
         </w:rPr>
-        <w:t>El Sistema Integrado de Gestión Institucional es la plataforma web del Consejo de Comunicación del Ecuador para administrar los procesos de Talento Humano, Adquisiciones de Bienes y Transportes institucionales. Centraliza en una s</w:t>
-      </w:r>
-      <w:r>
-        <w:rPr>
-          <w:sz w:val="21"/>
-        </w:rPr>
-        <w:t>ola aplicación la información de todos los empleados, permisos, asistencia, nómina, inventario y parque vehicular.</w:t>
+        <w:t>El Sistema Integrado de Gestión Institucional es la plataforma web del Consejo de Comunicación del Ecuador para administrar los procesos de Talento Humano, Adquisiciones de Bienes y Transportes institucionales. Centraliza en una sola aplicación la información de todos los empleados, permisos, asistencia, nómina, inventario y parque vehicular.</w:t>
       </w:r>
     </w:p>
     <w:p>
@@ -265,14 +254,7 @@
                 <w:b/>
                 <w:sz w:val="19"/>
               </w:rPr>
-              <w:t>TALENTO</w:t>
-            </w:r>
-            <w:r>
-              <w:rPr>
-                <w:b/>
-                <w:sz w:val="19"/>
-              </w:rPr>
-              <w:t xml:space="preserve"> HUMANO</w:t>
+              <w:t>TALENTO HUMANO</w:t>
             </w:r>
           </w:p>
         </w:tc>
@@ -393,13 +375,7 @@
               <w:rPr>
                 <w:sz w:val="19"/>
               </w:rPr>
-              <w:t>Aprobac</w:t>
-            </w:r>
-            <w:r>
-              <w:rPr>
-                <w:sz w:val="19"/>
-              </w:rPr>
-              <w:t>ión de permisos, vacaciones y horas extras del equipo a su cargo.</w:t>
+              <w:t>Aprobación de permisos, vacaciones y horas extras del equipo a su cargo.</w:t>
             </w:r>
           </w:p>
         </w:tc>
@@ -504,13 +480,7 @@
               <w:rPr>
                 <w:sz w:val="19"/>
               </w:rPr>
-              <w:t>Solicitudes de m</w:t>
-            </w:r>
-            <w:r>
-              <w:rPr>
-                <w:sz w:val="19"/>
-              </w:rPr>
-              <w:t>antenimiento, hoja de ruta y vales de combustible.</w:t>
+              <w:t>Solicitudes de mantenimiento, hoja de ruta y vales de combustible.</w:t>
             </w:r>
           </w:p>
         </w:tc>
@@ -572,13 +542,7 @@
         <w:rPr>
           <w:sz w:val="21"/>
         </w:rPr>
-        <w:t xml:space="preserve">Los textos en negrita indican nombres de botones, menús o </w:t>
-      </w:r>
-      <w:r>
-        <w:rPr>
-          <w:sz w:val="21"/>
-        </w:rPr>
-        <w:t>campos del sistema.</w:t>
+        <w:t>Los textos en negrita indican nombres de botones, menús o campos del sistema.</w:t>
       </w:r>
     </w:p>
     <w:p>
@@ -602,13 +566,7 @@
         <w:rPr>
           <w:sz w:val="21"/>
         </w:rPr>
-        <w:t>ℹ</w:t>
-      </w:r>
-      <w:r>
-        <w:rPr>
-          <w:sz w:val="21"/>
-        </w:rPr>
-        <w:t xml:space="preserve"> indica información adicional o sugerencia.</w:t>
+        <w:t>ℹ indica información adicional o sugerencia.</w:t>
       </w:r>
     </w:p>
     <w:p>
@@ -620,13 +578,7 @@
         <w:rPr>
           <w:sz w:val="21"/>
         </w:rPr>
-        <w:t>⚠</w:t>
-      </w:r>
-      <w:r>
-        <w:rPr>
-          <w:sz w:val="21"/>
-        </w:rPr>
-        <w:t xml:space="preserve"> indica advertencia o punto de atención especial.</w:t>
+        <w:t>⚠ indica advertencia o punto de atención especial.</w:t>
       </w:r>
     </w:p>
     <w:p>
@@ -670,13 +622,7 @@
         <w:rPr>
           <w:sz w:val="21"/>
         </w:rPr>
-        <w:t xml:space="preserve">Para </w:t>
-      </w:r>
-      <w:r>
-        <w:rPr>
-          <w:sz w:val="21"/>
-        </w:rPr>
-        <w:t>ingresar al sistema:</w:t>
+        <w:t>Para ingresar al sistema:</w:t>
       </w:r>
     </w:p>
     <w:p>
@@ -724,13 +670,7 @@
         <w:rPr>
           <w:sz w:val="21"/>
         </w:rPr>
-        <w:t>Haga clic en el botón "</w:t>
-      </w:r>
-      <w:r>
-        <w:rPr>
-          <w:sz w:val="21"/>
-        </w:rPr>
-        <w:t>Iniciar sesión".</w:t>
+        <w:t>Haga clic en el botón "Iniciar sesión".</w:t>
       </w:r>
     </w:p>
     <w:p>
@@ -743,44 +683,56 @@
           <w:color w:val="0B5547"/>
           <w:sz w:val="20"/>
         </w:rPr>
-        <w:t>ℹ</w:t>
-      </w:r>
+        <w:t>ℹ  La sesión se cierra automáticamente cuando cierra la pestaña o ventana del navegador. Si necesita mantener la sesión activa, no cierre el navegador.</w:t>
+      </w:r>
+    </w:p>
+    <w:p>
+      <w:pPr>
+        <w:jc w:val="both"/>
+      </w:pPr>
+      <w:r>
+        <w:rPr>
+          <w:i/>
+          <w:color w:val="B8860B"/>
+          <w:sz w:val="20"/>
+        </w:rPr>
+        <w:t>⚠  Si olvidó su contraseña, contacte al administrador del sistema para que la restablezca.</w:t>
+      </w:r>
+    </w:p>
+    <w:p>
+      <w:pPr>
+        <w:pStyle w:val="Ttulo2"/>
+        <w:jc w:val="both"/>
+      </w:pPr>
+      <w:r>
+        <w:rPr>
+          <w:color w:val="068174"/>
+        </w:rPr>
+        <w:t>2.2 Selección de módulo (Launcher)</w:t>
+      </w:r>
+    </w:p>
+    <w:p>
+      <w:pPr>
+        <w:jc w:val="both"/>
+      </w:pPr>
+      <w:r>
+        <w:rPr>
+          <w:sz w:val="21"/>
+        </w:rPr>
+        <w:t>Una vez autenticado, el sistema muestra la pantalla de selección de módulos (Launcher). Aquí aparecen las tarjetas de los módulos a los que tiene acceso según su rol: Talento Humano, Adquisiciones y/o Transportes. Haga clic en la tarjeta del módulo que desea usar.</w:t>
+      </w:r>
+    </w:p>
+    <w:p>
+      <w:pPr>
+        <w:jc w:val="both"/>
+      </w:pPr>
       <w:r>
         <w:rPr>
           <w:i/>
           <w:color w:val="0B5547"/>
           <w:sz w:val="20"/>
         </w:rPr>
-        <w:t xml:space="preserve">  La sesión se cierra automáticamente cuando cierra la pestaña o ventana del navegador. Si necesita mantener la sesión activa, no cierre el navegador.</w:t>
-      </w:r>
-    </w:p>
-    <w:p>
-      <w:pPr>
-        <w:jc w:val="both"/>
-      </w:pPr>
-      <w:r>
-        <w:rPr>
-          <w:i/>
-          <w:color w:val="B8860B"/>
-          <w:sz w:val="20"/>
-        </w:rPr>
-        <w:t>⚠</w:t>
-      </w:r>
-      <w:r>
-        <w:rPr>
-          <w:i/>
-          <w:color w:val="B8860B"/>
-          <w:sz w:val="20"/>
-        </w:rPr>
-        <w:t xml:space="preserve">  Si olvidó su contraseña, contacte al administrador del sistema para que la restablez</w:t>
-      </w:r>
-      <w:r>
-        <w:rPr>
-          <w:i/>
-          <w:color w:val="B8860B"/>
-          <w:sz w:val="20"/>
-        </w:rPr>
-        <w:t>ca.</w:t>
+        <w:t>ℹ  En la parte inferior de la pantalla se muestran los avisos informativos institucionales.</w:t>
       </w:r>
     </w:p>
     <w:p>
@@ -792,45 +744,18 @@
         <w:rPr>
           <w:color w:val="068174"/>
         </w:rPr>
-        <w:t>2.2 Selección de módulo (Launcher)</w:t>
-      </w:r>
-    </w:p>
-    <w:p>
-      <w:pPr>
-        <w:jc w:val="both"/>
-      </w:pPr>
-      <w:r>
-        <w:rPr>
-          <w:sz w:val="21"/>
-        </w:rPr>
-        <w:t>Una vez autenticado, el sistema muestra la pantalla de selección de módulos (Launcher). Aquí aparecen las tarjetas de los módulos a los que tiene acceso según su rol: Talento Humano, Adquisiciones y/o Transportes. Hag</w:t>
-      </w:r>
-      <w:r>
-        <w:rPr>
-          <w:sz w:val="21"/>
-        </w:rPr>
-        <w:t>a clic en la tarjeta del módulo que desea usar.</w:t>
-      </w:r>
-    </w:p>
-    <w:p>
-      <w:pPr>
-        <w:jc w:val="both"/>
-      </w:pPr>
-      <w:r>
-        <w:rPr>
-          <w:i/>
-          <w:color w:val="0B5547"/>
-          <w:sz w:val="20"/>
-        </w:rPr>
-        <w:t>ℹ</w:t>
-      </w:r>
-      <w:r>
-        <w:rPr>
-          <w:i/>
-          <w:color w:val="0B5547"/>
-          <w:sz w:val="20"/>
-        </w:rPr>
-        <w:t xml:space="preserve">  En la parte inferior de la pantalla se muestran los avisos informativos institucionales.</w:t>
+        <w:t>2.3 Cierre de sesión</w:t>
+      </w:r>
+    </w:p>
+    <w:p>
+      <w:pPr>
+        <w:jc w:val="both"/>
+      </w:pPr>
+      <w:r>
+        <w:rPr>
+          <w:sz w:val="21"/>
+        </w:rPr>
+        <w:t>Para cerrar sesión de forma segura, haga clic en el ícono de usuario en la esquina superior derecha del menú y seleccione "Cerrar sesión". Esto invalida su token de acceso.</w:t>
       </w:r>
     </w:p>
     <w:p>
@@ -842,35 +767,6 @@
         <w:rPr>
           <w:color w:val="068174"/>
         </w:rPr>
-        <w:t>2.3 Cierre de sesión</w:t>
-      </w:r>
-    </w:p>
-    <w:p>
-      <w:pPr>
-        <w:jc w:val="both"/>
-      </w:pPr>
-      <w:r>
-        <w:rPr>
-          <w:sz w:val="21"/>
-        </w:rPr>
-        <w:t>Para cerrar sesión de forma segura, haga clic en el ícono de usuario en la esquina superior der</w:t>
-      </w:r>
-      <w:r>
-        <w:rPr>
-          <w:sz w:val="21"/>
-        </w:rPr>
-        <w:t>echa del menú y seleccione "Cerrar sesión". Esto invalida su token de acceso.</w:t>
-      </w:r>
-    </w:p>
-    <w:p>
-      <w:pPr>
-        <w:pStyle w:val="Ttulo2"/>
-        <w:jc w:val="both"/>
-      </w:pPr>
-      <w:r>
-        <w:rPr>
-          <w:color w:val="068174"/>
-        </w:rPr>
         <w:t>2.4 Modo mantenimiento</w:t>
       </w:r>
     </w:p>
@@ -882,13 +778,7 @@
         <w:rPr>
           <w:sz w:val="21"/>
         </w:rPr>
-        <w:t xml:space="preserve">Cuando el sistema se encuentra en mantenimiento programado, los empleados sin rol especial verán una pantalla verde que indica que el sistema está </w:t>
-      </w:r>
-      <w:r>
-        <w:rPr>
-          <w:sz w:val="21"/>
-        </w:rPr>
-        <w:t>temporalmente fuera de servicio. Los administradores y usuarios de TH/Adquisiciones/Transporte verán un banner naranja de aviso pero podrán continuar trabajando.</w:t>
+        <w:t>Cuando el sistema se encuentra en mantenimiento programado, los empleados sin rol especial verán una pantalla verde que indica que el sistema está temporalmente fuera de servicio. Los administradores y usuarios de TH/Adquisiciones/Transporte verán un banner naranja de aviso pero podrán continuar trabajando.</w:t>
       </w:r>
     </w:p>
     <w:p>
@@ -920,13 +810,7 @@
         <w:rPr>
           <w:sz w:val="21"/>
         </w:rPr>
-        <w:t>El módulo de Talento Humano es el núcleo del sistema. Gestiona el c</w:t>
-      </w:r>
-      <w:r>
-        <w:rPr>
-          <w:sz w:val="21"/>
-        </w:rPr>
-        <w:t>iclo completo del empleado: desde el ingreso hasta la desvinculación, incluyendo asistencia diaria, permisos, vacaciones, acciones de personal, horas extras y certificados laborales.</w:t>
+        <w:t>El módulo de Talento Humano es el núcleo del sistema. Gestiona el ciclo completo del empleado: desde el ingreso hasta la desvinculación, incluyendo asistencia diaria, permisos, vacaciones, acciones de personal, horas extras y certificados laborales.</w:t>
       </w:r>
     </w:p>
     <w:p>
@@ -949,13 +833,7 @@
         <w:rPr>
           <w:sz w:val="21"/>
         </w:rPr>
-        <w:t>La pantalla de inicio del módulo muestra información resumi</w:t>
-      </w:r>
-      <w:r>
-        <w:rPr>
-          <w:sz w:val="21"/>
-        </w:rPr>
-        <w:t>da según su rol:</w:t>
+        <w:t>La pantalla de inicio del módulo muestra información resumida según su rol:</w:t>
       </w:r>
     </w:p>
     <w:tbl>
@@ -1071,13 +949,7 @@
               <w:rPr>
                 <w:sz w:val="19"/>
               </w:rPr>
-              <w:t>4 contadores de pendientes (permisos, vacaciones, horas extras, materiales), estado del equipo</w:t>
-            </w:r>
-            <w:r>
-              <w:rPr>
-                <w:sz w:val="19"/>
-              </w:rPr>
-              <w:t xml:space="preserve"> hoy y vacaciones próximas del equipo.</w:t>
+              <w:t>4 contadores de pendientes (permisos, vacaciones, horas extras, materiales), estado del equipo hoy y vacaciones próximas del equipo.</w:t>
             </w:r>
           </w:p>
         </w:tc>
@@ -1137,13 +1009,7 @@
         <w:rPr>
           <w:sz w:val="21"/>
         </w:rPr>
-        <w:t xml:space="preserve">Accesible para los roles ADMINISTRADOR y TALENTO HUMANO. Permite </w:t>
-      </w:r>
-      <w:r>
-        <w:rPr>
-          <w:sz w:val="21"/>
-        </w:rPr>
-        <w:t>registrar, consultar y actualizar la información de todos los empleados de la institución.</w:t>
+        <w:t>Accesible para los roles ADMINISTRADOR y TALENTO HUMANO. Permite registrar, consultar y actualizar la información de todos los empleados de la institución.</w:t>
       </w:r>
     </w:p>
     <w:p>
@@ -1200,13 +1066,7 @@
         <w:rPr>
           <w:sz w:val="21"/>
         </w:rPr>
-        <w:t>Pest</w:t>
-      </w:r>
-      <w:r>
-        <w:rPr>
-          <w:sz w:val="21"/>
-        </w:rPr>
-        <w:t>aña 1 "Datos Personales": nombres, apellidos, cédula, teléfono, email, dirección, sexo, tipo de sangre. Aquí también se registran grupos vulnerables, discapacidades, enfermedades catastróficas y persona sustituta.</w:t>
+        <w:t>Pestaña 1 "Datos Personales": nombres, apellidos, cédula, teléfono, email, dirección, sexo, tipo de sangre. Aquí también se registran grupos vulnerables, discapacidades, enfermedades catastróficas y persona sustituta.</w:t>
       </w:r>
     </w:p>
     <w:p>
@@ -1218,13 +1078,7 @@
         <w:rPr>
           <w:sz w:val="21"/>
         </w:rPr>
-        <w:t>Pestaña 2 "Cargo y Contrato": departamento</w:t>
-      </w:r>
-      <w:r>
-        <w:rPr>
-          <w:sz w:val="21"/>
-        </w:rPr>
-        <w:t>, cargo, tipo de contrato (LOSEP / Código del Trabajo), modalidad laboral, jornada, estado (ACTIVO/INACTIVO), fechas de ingreso y salida, salario. Si el empleado está INACTIVO, se registra el motivo de salida.</w:t>
+        <w:t>Pestaña 2 "Cargo y Contrato": departamento, cargo, tipo de contrato (LOSEP / Código del Trabajo), modalidad laboral, jornada, estado (ACTIVO/INACTIVO), fechas de ingreso y salida, salario. Si el empleado está INACTIVO, se registra el motivo de salida.</w:t>
       </w:r>
     </w:p>
     <w:p>
@@ -1236,13 +1090,7 @@
         <w:rPr>
           <w:sz w:val="21"/>
         </w:rPr>
-        <w:t>Pestaña 3 "Datos del Puesto": grupo ocupaciona</w:t>
-      </w:r>
-      <w:r>
-        <w:rPr>
-          <w:sz w:val="21"/>
-        </w:rPr>
-        <w:t>l, grado, partida presupuestaria, número y vigencia SERCOP, estructura programática (programa/actividad MEF).</w:t>
+        <w:t>Pestaña 3 "Datos del Puesto": grupo ocupacional, grado, partida presupuestaria, número y vigencia SERCOP, estructura programática (programa/actividad MEF).</w:t>
       </w:r>
     </w:p>
     <w:p>
@@ -1266,13 +1114,7 @@
         <w:rPr>
           <w:sz w:val="21"/>
         </w:rPr>
-        <w:t>Haga clic en "Gu</w:t>
-      </w:r>
-      <w:r>
-        <w:rPr>
-          <w:sz w:val="21"/>
-        </w:rPr>
-        <w:t>ardar".</w:t>
+        <w:t>Haga clic en "Guardar".</w:t>
       </w:r>
     </w:p>
     <w:p>
@@ -1285,15 +1127,7 @@
           <w:color w:val="0B5547"/>
           <w:sz w:val="20"/>
         </w:rPr>
-        <w:t>ℹ</w:t>
-      </w:r>
-      <w:r>
-        <w:rPr>
-          <w:i/>
-          <w:color w:val="0B5547"/>
-          <w:sz w:val="20"/>
-        </w:rPr>
-        <w:t xml:space="preserve">  La cédula es el identificador único del empleado (campo id_emp). No se puede modificar una vez creado el registro.</w:t>
+        <w:t>ℹ  La cédula es el identificador único del empleado (campo id_emp). No se puede modificar una vez creado el registro.</w:t>
       </w:r>
     </w:p>
     <w:p>
@@ -1313,13 +1147,7 @@
         <w:rPr>
           <w:sz w:val="21"/>
         </w:rPr>
-        <w:t xml:space="preserve">En la lista de empleados, haga clic en el ícono de editar (lápiz) en la fila del empleado. Se abrirá el </w:t>
-      </w:r>
-      <w:r>
-        <w:rPr>
-          <w:sz w:val="21"/>
-        </w:rPr>
-        <w:t>formulario con los datos actuales. Realice los cambios necesarios y haga clic en "Guardar".</w:t>
+        <w:t>En la lista de empleados, haga clic en el ícono de editar (lápiz) en la fila del empleado. Se abrirá el formulario con los datos actuales. Realice los cambios necesarios y haga clic en "Guardar".</w:t>
       </w:r>
     </w:p>
     <w:p>
@@ -1340,13 +1168,7 @@
         <w:rPr>
           <w:sz w:val="21"/>
         </w:rPr>
-        <w:t>Los empleados nunca se eliminan del sistema. Para marcar un empleado como inactivo (desvinculación, comisión de servicios, etc.), cambie</w:t>
-      </w:r>
-      <w:r>
-        <w:rPr>
-          <w:sz w:val="21"/>
-        </w:rPr>
-        <w:t xml:space="preserve"> el campo "Estado" a "INACTIVO" y seleccione el motivo de salida correspondiente en la pestaña "Cargo y Contrato".</w:t>
+        <w:t>Los empleados nunca se eliminan del sistema. Para marcar un empleado como inactivo (desvinculación, comisión de servicios, etc.), cambie el campo "Estado" a "INACTIVO" y seleccione el motivo de salida correspondiente en la pestaña "Cargo y Contrato".</w:t>
       </w:r>
     </w:p>
     <w:p>
@@ -1437,13 +1259,7 @@
               <w:rPr>
                 <w:sz w:val="19"/>
               </w:rPr>
-              <w:t xml:space="preserve">El empleado solo puede marcar desde las redes internas </w:t>
-            </w:r>
-            <w:r>
-              <w:rPr>
-                <w:sz w:val="19"/>
-              </w:rPr>
-              <w:t>institucionales (VLANs configuradas). Ideal para trabajo en oficina.</w:t>
+              <w:t>El empleado solo puede marcar desde las redes internas institucionales (VLANs configuradas). Ideal para trabajo en oficina.</w:t>
             </w:r>
           </w:p>
         </w:tc>
@@ -1523,10 +1339,7 @@
         <w:jc w:val="both"/>
       </w:pPr>
       <w:r>
-        <w:t>Dat</w:t>
-      </w:r>
-      <w:r>
-        <w:t>os sociales y hijos</w:t>
+        <w:t>Datos sociales y hijos</w:t>
       </w:r>
     </w:p>
     <w:p>
@@ -1585,13 +1398,7 @@
         <w:rPr>
           <w:sz w:val="21"/>
         </w:rPr>
-        <w:t>Persona sustituta: fecha de caducidad y subir el PD</w:t>
-      </w:r>
-      <w:r>
-        <w:rPr>
-          <w:sz w:val="21"/>
-        </w:rPr>
-        <w:t>F del documento en Alfresco</w:t>
+        <w:t>Persona sustituta: fecha de caducidad y subir el PDF del documento en Alfresco</w:t>
       </w:r>
     </w:p>
     <w:p>
@@ -1635,13 +1442,7 @@
         <w:rPr>
           <w:sz w:val="21"/>
         </w:rPr>
-        <w:t xml:space="preserve">"Importar </w:t>
-      </w:r>
-      <w:r>
-        <w:rPr>
-          <w:sz w:val="21"/>
-        </w:rPr>
-        <w:t>desde CSV": carga masiva de empleados desde un archivo Excel/CSV.</w:t>
+        <w:t>"Importar desde CSV": carga masiva de empleados desde un archivo Excel/CSV.</w:t>
       </w:r>
     </w:p>
     <w:p>
@@ -1685,13 +1486,7 @@
         <w:rPr>
           <w:sz w:val="21"/>
         </w:rPr>
-        <w:t>Cada día laboral, el empleado debe registrar 4 marcaciones en orden est</w:t>
-      </w:r>
-      <w:r>
-        <w:rPr>
-          <w:sz w:val="21"/>
-        </w:rPr>
-        <w:t>ricto:</w:t>
+        <w:t>Cada día laboral, el empleado debe registrar 4 marcaciones en orden estricto:</w:t>
       </w:r>
     </w:p>
     <w:tbl>
@@ -1894,13 +1689,7 @@
         <w:rPr>
           <w:sz w:val="21"/>
         </w:rPr>
-        <w:t xml:space="preserve">Para marcar, haga clic en el botón correspondiente. El botón </w:t>
-      </w:r>
-      <w:r>
-        <w:rPr>
-          <w:sz w:val="21"/>
-        </w:rPr>
-        <w:t>activo (verde oscuro) es el siguiente en la secuencia. Los botones ya marcados aparecen en gris.</w:t>
+        <w:t>Para marcar, haga clic en el botón correspondiente. El botón activo (verde oscuro) es el siguiente en la secuencia. Los botones ya marcados aparecen en gris.</w:t>
       </w:r>
     </w:p>
     <w:p>
@@ -1913,15 +1702,7 @@
           <w:color w:val="B8860B"/>
           <w:sz w:val="20"/>
         </w:rPr>
-        <w:t>⚠</w:t>
-      </w:r>
-      <w:r>
-        <w:rPr>
-          <w:i/>
-          <w:color w:val="B8860B"/>
-          <w:sz w:val="20"/>
-        </w:rPr>
-        <w:t xml:space="preserve">  Si intenta marcar la SALIDA antes de las 16:30, el sistema solicitará confirmación.</w:t>
+        <w:t>⚠  Si intenta marcar la SALIDA antes de las 16:30, el sistema solicitará confirmación.</w:t>
       </w:r>
     </w:p>
     <w:p>
@@ -1942,13 +1723,7 @@
         <w:rPr>
           <w:sz w:val="21"/>
         </w:rPr>
-        <w:t>El reloj biométrico también registra</w:t>
-      </w:r>
-      <w:r>
-        <w:rPr>
-          <w:sz w:val="21"/>
-        </w:rPr>
-        <w:t xml:space="preserve"> las marcaciones automáticamente. El sistema asigna el concepto (ENTRADA, SALIDA AL LUNCH, etc.) por la secuencia del día, sin importar si la marcación fue web o biométrica. Ambos tipos de marcación se combinan libremente.</w:t>
+        <w:t>El reloj biométrico también registra las marcaciones automáticamente. El sistema asigna el concepto (ENTRADA, SALIDA AL LUNCH, etc.) por la secuencia del día, sin importar si la marcación fue web o biométrica. Ambos tipos de marcación se combinan libremente.</w:t>
       </w:r>
     </w:p>
     <w:p>
@@ -1968,13 +1743,7 @@
         <w:rPr>
           <w:sz w:val="21"/>
         </w:rPr>
-        <w:t>E</w:t>
-      </w:r>
-      <w:r>
-        <w:rPr>
-          <w:sz w:val="21"/>
-        </w:rPr>
-        <w:t>n la sección "Mis Marcaciones" puede ver el registro diario de sus marcaciones con los atrasos calculados y su estado de justificación:</w:t>
+        <w:t>En la sección "Mis Marcaciones" puede ver el registro diario de sus marcaciones con los atrasos calculados y su estado de justificación:</w:t>
       </w:r>
     </w:p>
     <w:tbl>
@@ -2090,13 +1859,7 @@
               <w:rPr>
                 <w:sz w:val="19"/>
               </w:rPr>
-              <w:t>El</w:t>
-            </w:r>
-            <w:r>
-              <w:rPr>
-                <w:sz w:val="19"/>
-              </w:rPr>
-              <w:t xml:space="preserve"> permiso cubre solo parte del atraso.</w:t>
+              <w:t>El permiso cubre solo parte del atraso.</w:t>
             </w:r>
           </w:p>
         </w:tc>
@@ -2165,13 +1928,7 @@
         <w:rPr>
           <w:sz w:val="21"/>
         </w:rPr>
-        <w:t>Reporte de Atrasos: empleados con atrasos pendientes en el rango de fechas se</w:t>
-      </w:r>
-      <w:r>
-        <w:rPr>
-          <w:sz w:val="21"/>
-        </w:rPr>
-        <w:t>leccionado.</w:t>
+        <w:t>Reporte de Atrasos: empleados con atrasos pendientes en el rango de fechas seleccionado.</w:t>
       </w:r>
     </w:p>
     <w:p>
@@ -2218,13 +1975,7 @@
         <w:rPr>
           <w:sz w:val="21"/>
         </w:rPr>
-        <w:t>Todos los reportes se p</w:t>
-      </w:r>
-      <w:r>
-        <w:rPr>
-          <w:sz w:val="21"/>
-        </w:rPr>
-        <w:t>ueden exportar a Excel o PDF.</w:t>
+        <w:t>Todos los reportes se pueden exportar a Excel o PDF.</w:t>
       </w:r>
     </w:p>
     <w:p>
@@ -2293,13 +2044,7 @@
         <w:rPr>
           <w:sz w:val="21"/>
         </w:rPr>
-        <w:t>Si el permiso es "No</w:t>
-      </w:r>
-      <w:r>
-        <w:rPr>
-          <w:sz w:val="21"/>
-        </w:rPr>
-        <w:t xml:space="preserve"> descontable", puede adjuntar documentos de respaldo.</w:t>
+        <w:t>Si el permiso es "No descontable", puede adjuntar documentos de respaldo.</w:t>
       </w:r>
     </w:p>
     <w:p>
@@ -2324,15 +2069,65 @@
           <w:color w:val="0B5547"/>
           <w:sz w:val="20"/>
         </w:rPr>
-        <w:t>ℹ</w:t>
-      </w:r>
+        <w:t>ℹ  Al abrir el formulario de nuevo permiso, la fecha se inicializa automáticamente con la fecha actual.</w:t>
+      </w:r>
+    </w:p>
+    <w:p>
+      <w:pPr>
+        <w:pStyle w:val="Ttulo3"/>
+        <w:jc w:val="both"/>
+      </w:pPr>
+      <w:r>
+        <w:t>Aprobar o negar un permiso (Supervisor / TH / Admin)</w:t>
+      </w:r>
+    </w:p>
+    <w:p>
+      <w:pPr>
+        <w:pStyle w:val="Listaconnmeros"/>
+        <w:jc w:val="both"/>
+      </w:pPr>
+      <w:r>
+        <w:rPr>
+          <w:sz w:val="21"/>
+        </w:rPr>
+        <w:t>En la lista de permisos, los permisos PENDIENTES aparecen destacados.</w:t>
+      </w:r>
+    </w:p>
+    <w:p>
+      <w:pPr>
+        <w:pStyle w:val="Listaconnmeros"/>
+        <w:jc w:val="both"/>
+      </w:pPr>
+      <w:r>
+        <w:rPr>
+          <w:sz w:val="21"/>
+        </w:rPr>
+        <w:t>Haga clic en el permiso para ver el detalle.</w:t>
+      </w:r>
+    </w:p>
+    <w:p>
+      <w:pPr>
+        <w:pStyle w:val="Listaconnmeros"/>
+        <w:jc w:val="both"/>
+      </w:pPr>
+      <w:r>
+        <w:rPr>
+          <w:sz w:val="21"/>
+        </w:rPr>
+        <w:t>Seleccione "Aprobar" o "Negar" (con motivo en caso de negar).</w:t>
+      </w:r>
+    </w:p>
+    <w:p>
+      <w:pPr>
+        <w:jc w:val="both"/>
+      </w:pPr>
       <w:r>
         <w:rPr>
           <w:i/>
           <w:color w:val="0B5547"/>
           <w:sz w:val="20"/>
         </w:rPr>
-        <w:t xml:space="preserve">  Al abrir el formulario de nuevo permiso, la fecha se inicializa automáticamente con la fecha actual.</w:t>
+        <w:t>ℹ  Al aprobar un permiso descontable, el saldo de vacaciones del empleado se descuenta automáticamente e inmediatamente.</w:t>
       </w:r>
     </w:p>
     <w:p>
@@ -2341,86 +2136,6 @@
         <w:jc w:val="both"/>
       </w:pPr>
       <w:r>
-        <w:t>Aprobar o negar un permiso (Supervisor / TH / Admin)</w:t>
-      </w:r>
-    </w:p>
-    <w:p>
-      <w:pPr>
-        <w:pStyle w:val="Listaconnmeros"/>
-        <w:jc w:val="both"/>
-      </w:pPr>
-      <w:r>
-        <w:rPr>
-          <w:sz w:val="21"/>
-        </w:rPr>
-        <w:t>En la lista de perm</w:t>
-      </w:r>
-      <w:r>
-        <w:rPr>
-          <w:sz w:val="21"/>
-        </w:rPr>
-        <w:t>isos, los permisos PENDIENTES aparecen destacados.</w:t>
-      </w:r>
-    </w:p>
-    <w:p>
-      <w:pPr>
-        <w:pStyle w:val="Listaconnmeros"/>
-        <w:jc w:val="both"/>
-      </w:pPr>
-      <w:r>
-        <w:rPr>
-          <w:sz w:val="21"/>
-        </w:rPr>
-        <w:t>Haga clic en el permiso para ver el detalle.</w:t>
-      </w:r>
-    </w:p>
-    <w:p>
-      <w:pPr>
-        <w:pStyle w:val="Listaconnmeros"/>
-        <w:jc w:val="both"/>
-      </w:pPr>
-      <w:r>
-        <w:rPr>
-          <w:sz w:val="21"/>
-        </w:rPr>
-        <w:t>Seleccione "Aprobar" o "Negar" (con motivo en caso de negar).</w:t>
-      </w:r>
-    </w:p>
-    <w:p>
-      <w:pPr>
-        <w:jc w:val="both"/>
-      </w:pPr>
-      <w:r>
-        <w:rPr>
-          <w:i/>
-          <w:color w:val="0B5547"/>
-          <w:sz w:val="20"/>
-        </w:rPr>
-        <w:t>ℹ</w:t>
-      </w:r>
-      <w:r>
-        <w:rPr>
-          <w:i/>
-          <w:color w:val="0B5547"/>
-          <w:sz w:val="20"/>
-        </w:rPr>
-        <w:t xml:space="preserve">  Al aprobar un permiso descontable, el saldo de vacaciones del empleado se descuenta </w:t>
-      </w:r>
-      <w:r>
-        <w:rPr>
-          <w:i/>
-          <w:color w:val="0B5547"/>
-          <w:sz w:val="20"/>
-        </w:rPr>
-        <w:t>automáticamente e inmediatamente.</w:t>
-      </w:r>
-    </w:p>
-    <w:p>
-      <w:pPr>
-        <w:pStyle w:val="Ttulo3"/>
-        <w:jc w:val="both"/>
-      </w:pPr>
-      <w:r>
         <w:t>Anular un permiso (TH / Admin)</w:t>
       </w:r>
     </w:p>
@@ -2432,13 +2147,7 @@
         <w:rPr>
           <w:sz w:val="21"/>
         </w:rPr>
-        <w:t>Si un permiso fue aprobado pero el empleado no lo utilizó (por ejemplo, llegó a la hora normal), puede anularse. Esto revierte el descuento del saldo de vacaciones y ajusta el cuadre de asist</w:t>
-      </w:r>
-      <w:r>
-        <w:rPr>
-          <w:sz w:val="21"/>
-        </w:rPr>
-        <w:t>encia del día.</w:t>
+        <w:t>Si un permiso fue aprobado pero el empleado no lo utilizó (por ejemplo, llegó a la hora normal), puede anularse. Esto revierte el descuento del saldo de vacaciones y ajusta el cuadre de asistencia del día.</w:t>
       </w:r>
     </w:p>
     <w:p>
@@ -2578,13 +2287,7 @@
               <w:rPr>
                 <w:sz w:val="19"/>
               </w:rPr>
-              <w:t>Llegada tarde. El sistema no penaliza el atra</w:t>
-            </w:r>
-            <w:r>
-              <w:rPr>
-                <w:sz w:val="19"/>
-              </w:rPr>
-              <w:t>so de entrada hasta la hora indicada en el permiso.</w:t>
+              <w:t>Llegada tarde. El sistema no penaliza el atraso de entrada hasta la hora indicada en el permiso.</w:t>
             </w:r>
           </w:p>
         </w:tc>
@@ -2687,13 +2390,7 @@
         <w:rPr>
           <w:sz w:val="21"/>
         </w:rPr>
-        <w:t xml:space="preserve">El sistema calcula </w:t>
-      </w:r>
-      <w:r>
-        <w:rPr>
-          <w:sz w:val="21"/>
-        </w:rPr>
-        <w:t>automáticamente el saldo disponible según:</w:t>
+        <w:t>El sistema calcula automáticamente el saldo disponible según:</w:t>
       </w:r>
     </w:p>
     <w:tbl>
@@ -2809,13 +2506,7 @@
               <w:rPr>
                 <w:sz w:val="19"/>
               </w:rPr>
-              <w:t xml:space="preserve">15 días/año base + días adicionales por antigüedad (Art. 69 CT). Desde el 6° año completo se suma 1 día adicional </w:t>
-            </w:r>
-            <w:r>
-              <w:rPr>
-                <w:sz w:val="19"/>
-              </w:rPr>
-              <w:t>por cada año extra, hasta un máximo de 30 días/año.</w:t>
+              <w:t>15 días/año base + días adicionales por antigüedad (Art. 69 CT). Desde el 6° año completo se suma 1 día adicional por cada año extra, hasta un máximo de 30 días/año.</w:t>
             </w:r>
           </w:p>
         </w:tc>
@@ -2875,13 +2566,7 @@
         <w:rPr>
           <w:sz w:val="21"/>
         </w:rPr>
-        <w:t xml:space="preserve">Si tiene una planificación aprobada, el sistema mostrará sus </w:t>
-      </w:r>
-      <w:r>
-        <w:rPr>
-          <w:sz w:val="21"/>
-        </w:rPr>
-        <w:t>períodos planificados como referencia.</w:t>
+        <w:t>Si tiene una planificación aprobada, el sistema mostrará sus períodos planificados como referencia.</w:t>
       </w:r>
     </w:p>
     <w:p>
@@ -2926,13 +2611,7 @@
         <w:rPr>
           <w:sz w:val="21"/>
         </w:rPr>
-        <w:t>Al aprobar, el sistema solicitará que selecc</w:t>
-      </w:r>
-      <w:r>
-        <w:rPr>
-          <w:sz w:val="21"/>
-        </w:rPr>
-        <w:t>ione un empleado de backup del mismo departamento.</w:t>
+        <w:t>Al aprobar, el sistema solicitará que seleccione un empleado de backup del mismo departamento.</w:t>
       </w:r>
     </w:p>
     <w:p>
@@ -2967,13 +2646,7 @@
         <w:rPr>
           <w:sz w:val="21"/>
         </w:rPr>
-        <w:t>La planificación anual permite organizar los períodos de vacaciones de todos los empleados para el año. Los supervisores</w:t>
-      </w:r>
-      <w:r>
-        <w:rPr>
-          <w:sz w:val="21"/>
-        </w:rPr>
-        <w:t xml:space="preserve"> y TH pueden crear y gestionar la planificación de su equipo.</w:t>
+        <w:t>La planificación anual permite organizar los períodos de vacaciones de todos los empleados para el año. Los supervisores y TH pueden crear y gestionar la planificación de su equipo.</w:t>
       </w:r>
     </w:p>
     <w:tbl>
@@ -3157,13 +2830,7 @@
               <w:rPr>
                 <w:sz w:val="19"/>
               </w:rPr>
-              <w:t>El empleado puede volver</w:t>
-            </w:r>
-            <w:r>
-              <w:rPr>
-                <w:sz w:val="19"/>
-              </w:rPr>
-              <w:t xml:space="preserve"> a planificar ese período.</w:t>
+              <w:t>El empleado puede volver a planificar ese período.</w:t>
             </w:r>
           </w:p>
         </w:tc>
@@ -3247,15 +2914,7 @@
                 <w:color w:val="FFFFFF"/>
                 <w:sz w:val="20"/>
               </w:rPr>
-              <w:t>Descrip</w:t>
-            </w:r>
-            <w:r>
-              <w:rPr>
-                <w:b/>
-                <w:color w:val="FFFFFF"/>
-                <w:sz w:val="20"/>
-              </w:rPr>
-              <w:t>ción</w:t>
+              <w:t>Descripción</w:t>
             </w:r>
           </w:p>
         </w:tc>
@@ -3357,13 +3016,7 @@
               <w:rPr>
                 <w:sz w:val="19"/>
               </w:rPr>
-              <w:t>Reemplazo temporal con fecha fin obligatoria. El sistema cierra la acción automáticamente</w:t>
-            </w:r>
-            <w:r>
-              <w:rPr>
-                <w:sz w:val="19"/>
-              </w:rPr>
-              <w:t xml:space="preserve"> al vencer.</w:t>
+              <w:t>Reemplazo temporal con fecha fin obligatoria. El sistema cierra la acción automáticamente al vencer.</w:t>
             </w:r>
           </w:p>
         </w:tc>
@@ -3501,13 +3154,7 @@
         <w:rPr>
           <w:sz w:val="21"/>
         </w:rPr>
-        <w:t>Haga</w:t>
-      </w:r>
-      <w:r>
-        <w:rPr>
-          <w:sz w:val="21"/>
-        </w:rPr>
-        <w:t xml:space="preserve"> clic en "Nueva Acción".</w:t>
+        <w:t>Haga clic en "Nueva Acción".</w:t>
       </w:r>
     </w:p>
     <w:p>
@@ -3554,13 +3201,7 @@
         <w:rPr>
           <w:sz w:val="21"/>
         </w:rPr>
-        <w:t>Al procesar, el sistema asigna el número de acc</w:t>
-      </w:r>
-      <w:r>
-        <w:rPr>
-          <w:sz w:val="21"/>
-        </w:rPr>
-        <w:t>ión y genera el PDF oficial para firma. El PDF firmado puede subirse a Alfresco desde el botón correspondiente.</w:t>
+        <w:t>Al procesar, el sistema asigna el número de acción y genera el PDF oficial para firma. El PDF firmado puede subirse a Alfresco desde el botón correspondiente.</w:t>
       </w:r>
     </w:p>
     <w:p>
@@ -3573,15 +3214,7 @@
           <w:color w:val="0B5547"/>
           <w:sz w:val="20"/>
         </w:rPr>
-        <w:t>ℹ</w:t>
-      </w:r>
-      <w:r>
-        <w:rPr>
-          <w:i/>
-          <w:color w:val="0B5547"/>
-          <w:sz w:val="20"/>
-        </w:rPr>
-        <w:t xml:space="preserve">  Los firmantes del PDF (Responsable de TH y Autoridad Nominadora) se configuran desde Admin → Configuración.</w:t>
+        <w:t>ℹ  Los firmantes del PDF (Responsable de TH y Autoridad Nominadora) se configuran desde Admin → Configuración.</w:t>
       </w:r>
     </w:p>
     <w:p>
@@ -3604,13 +3237,7 @@
         <w:rPr>
           <w:sz w:val="21"/>
         </w:rPr>
-        <w:t xml:space="preserve">El módulo de </w:t>
-      </w:r>
-      <w:r>
-        <w:rPr>
-          <w:sz w:val="21"/>
-        </w:rPr>
-        <w:t>horas extras gestiona la planificación y el registro de horas trabajadas fuera de la jornada regular. El sistema clasifica automáticamente las horas como extraordinarias o suplementarias según el horario y el día.</w:t>
+        <w:t>El módulo de horas extras gestiona la planificación y el registro de horas trabajadas fuera de la jornada regular. El sistema clasifica automáticamente las horas como extraordinarias o suplementarias según el horario y el día.</w:t>
       </w:r>
     </w:p>
     <w:p>
@@ -3648,15 +3275,7 @@
                 <w:color w:val="FFFFFF"/>
                 <w:sz w:val="20"/>
               </w:rPr>
-              <w:t xml:space="preserve">Horario </w:t>
-            </w:r>
-            <w:r>
-              <w:rPr>
-                <w:b/>
-                <w:color w:val="FFFFFF"/>
-                <w:sz w:val="20"/>
-              </w:rPr>
-              <w:t>/ Día</w:t>
+              <w:t>Horario / Día</w:t>
             </w:r>
           </w:p>
         </w:tc>
@@ -3823,10 +3442,7 @@
         <w:jc w:val="both"/>
       </w:pPr>
       <w:r>
-        <w:t xml:space="preserve">Flujo de </w:t>
-      </w:r>
-      <w:r>
-        <w:t>aprobación</w:t>
+        <w:t>Flujo de aprobación</w:t>
       </w:r>
     </w:p>
     <w:p>
@@ -3874,13 +3490,7 @@
         <w:rPr>
           <w:sz w:val="21"/>
         </w:rPr>
-        <w:t>El empleado registra las horas re</w:t>
-      </w:r>
-      <w:r>
-        <w:rPr>
-          <w:sz w:val="21"/>
-        </w:rPr>
-        <w:t>almente trabajadas. Estado: EN REVISION.</w:t>
+        <w:t>El empleado registra las horas realmente trabajadas. Estado: EN REVISION.</w:t>
       </w:r>
     </w:p>
     <w:p>
@@ -3917,23 +3527,7 @@
           <w:color w:val="0B5547"/>
           <w:sz w:val="20"/>
         </w:rPr>
-        <w:t>ℹ</w:t>
-      </w:r>
-      <w:r>
-        <w:rPr>
-          <w:i/>
-          <w:color w:val="0B5547"/>
-          <w:sz w:val="20"/>
-        </w:rPr>
-        <w:t xml:space="preserve">  Si usted es supervisor o administrador, su planificación se aprueba directamente sin pasar por revisi</w:t>
-      </w:r>
-      <w:r>
-        <w:rPr>
-          <w:i/>
-          <w:color w:val="0B5547"/>
-          <w:sz w:val="20"/>
-        </w:rPr>
-        <w:t>ón.</w:t>
+        <w:t>ℹ  Si usted es supervisor o administrador, su planificación se aprueba directamente sin pasar por revisión.</w:t>
       </w:r>
     </w:p>
     <w:p>
@@ -3990,13 +3584,7 @@
         <w:rPr>
           <w:sz w:val="21"/>
         </w:rPr>
-        <w:t>S</w:t>
-      </w:r>
-      <w:r>
-        <w:rPr>
-          <w:sz w:val="21"/>
-        </w:rPr>
-        <w:t>ubir el PDF firmado a Alfresco con el botón "Subir firmado".</w:t>
+        <w:t>Subir el PDF firmado a Alfresco con el botón "Subir firmado".</w:t>
       </w:r>
     </w:p>
     <w:p>
@@ -4052,13 +3640,7 @@
         <w:rPr>
           <w:sz w:val="21"/>
         </w:rPr>
-        <w:t>En el buscador superior, escriba el nombre o cédula del</w:t>
-      </w:r>
-      <w:r>
-        <w:rPr>
-          <w:sz w:val="21"/>
-        </w:rPr>
-        <w:t xml:space="preserve"> empleado.</w:t>
+        <w:t>En el buscador superior, escriba el nombre o cédula del empleado.</w:t>
       </w:r>
     </w:p>
     <w:p>
@@ -4115,10 +3697,7 @@
         <w:jc w:val="both"/>
       </w:pPr>
       <w:r>
-        <w:t>Subir certificado firmad</w:t>
-      </w:r>
-      <w:r>
-        <w:t>o</w:t>
+        <w:t>Subir certificado firmado</w:t>
       </w:r>
     </w:p>
     <w:p>
@@ -4176,13 +3755,7 @@
         <w:rPr>
           <w:sz w:val="21"/>
         </w:rPr>
-        <w:t>Una vez subido, el botón cambia</w:t>
-      </w:r>
-      <w:r>
-        <w:rPr>
-          <w:sz w:val="21"/>
-        </w:rPr>
-        <w:t xml:space="preserve"> a rojo "PDF" para descargarlo directamente desde Alfresco.</w:t>
+        <w:t>Una vez subido, el botón cambia a rojo "PDF" para descargarlo directamente desde Alfresco.</w:t>
       </w:r>
     </w:p>
     <w:p>
@@ -4214,13 +3787,7 @@
         <w:rPr>
           <w:sz w:val="21"/>
         </w:rPr>
-        <w:t>Disponible en Empleados → Reporte. Permite filtrar empleados por hasta 16 criterios (departamento, estado, tipo de contrato, sexo, discapacidad,</w:t>
-      </w:r>
-      <w:r>
-        <w:rPr>
-          <w:sz w:val="21"/>
-        </w:rPr>
-        <w:t xml:space="preserve"> SERCOP, etc.) y exportar el resultado a Excel o PDF. En la parte superior muestra alertas de SERCOP vencido, sustituta por vencer y empleados con hijos en edad de guardería.</w:t>
+        <w:t>Disponible en Empleados → Reporte. Permite filtrar empleados por hasta 16 criterios (departamento, estado, tipo de contrato, sexo, discapacidad, SERCOP, etc.) y exportar el resultado a Excel o PDF. En la parte superior muestra alertas de SERCOP vencido, sustituta por vencer y empleados con hijos en edad de guardería.</w:t>
       </w:r>
     </w:p>
     <w:p>
@@ -4240,19 +3807,7 @@
         <w:rPr>
           <w:sz w:val="21"/>
         </w:rPr>
-        <w:t>Disponible en Planificación → Reporte de Saldo. Mu</w:t>
-      </w:r>
-      <w:r>
-        <w:rPr>
-          <w:sz w:val="21"/>
-        </w:rPr>
-        <w:t xml:space="preserve">estra el saldo actual de vacaciones de todos los empleados. Haciendo clic en una fila, se expande el kardex completo (saldo inicial → días tomados → devengado → saldo final). Incluye un botón "Cargar Saldos" para actualizar masivamente los saldos desde un </w:t>
-      </w:r>
-      <w:r>
-        <w:rPr>
-          <w:sz w:val="21"/>
-        </w:rPr>
-        <w:t>archivo CSV.</w:t>
+        <w:t>Disponible en Planificación → Reporte de Saldo. Muestra el saldo actual de vacaciones de todos los empleados. Haciendo clic en una fila, se expande el kardex completo (saldo inicial → días tomados → devengado → saldo final). Incluye un botón "Cargar Saldos" para actualizar masivamente los saldos desde un archivo CSV.</w:t>
       </w:r>
     </w:p>
     <w:p>
@@ -4329,13 +3884,7 @@
         <w:rPr>
           <w:sz w:val="21"/>
         </w:rPr>
-        <w:t>Haga clic en "Calcul</w:t>
-      </w:r>
-      <w:r>
-        <w:rPr>
-          <w:sz w:val="21"/>
-        </w:rPr>
-        <w:t>ar". El sistema procesa todos los empleados activos.</w:t>
+        <w:t>Haga clic en "Calcular". El sistema procesa todos los empleados activos.</w:t>
       </w:r>
     </w:p>
     <w:p>
@@ -4372,15 +3921,7 @@
           <w:color w:val="B8860B"/>
           <w:sz w:val="20"/>
         </w:rPr>
-        <w:t>⚠</w:t>
-      </w:r>
-      <w:r>
-        <w:rPr>
-          <w:i/>
-          <w:color w:val="B8860B"/>
-          <w:sz w:val="20"/>
-        </w:rPr>
-        <w:t xml:space="preserve">  Un período CERRADO no puede recalcularse. Verifique los datos antes de cerrar.</w:t>
+        <w:t>⚠  Un período CERRADO no puede recalcularse. Verifique los datos antes de cerrar.</w:t>
       </w:r>
     </w:p>
     <w:p>
@@ -4389,10 +3930,7 @@
         <w:jc w:val="both"/>
       </w:pPr>
       <w:r>
-        <w:t>Fórmulas de cá</w:t>
-      </w:r>
-      <w:r>
-        <w:t>lculo</w:t>
+        <w:t>Fórmulas de cálculo</w:t>
       </w:r>
     </w:p>
     <w:tbl>
@@ -4557,35 +4095,29 @@
         <w:rPr>
           <w:color w:val="068174"/>
         </w:rPr>
-        <w:t xml:space="preserve">4.2 Fondos de </w:t>
-      </w:r>
+        <w:t>4.2 Fondos de Reserva</w:t>
+      </w:r>
+    </w:p>
+    <w:p>
+      <w:pPr>
+        <w:jc w:val="both"/>
+      </w:pPr>
+      <w:r>
+        <w:rPr>
+          <w:sz w:val="21"/>
+        </w:rPr>
+        <w:t>Se calculan para empleados con más de 12 meses de servicio. Puede filtrar por tipo: MENSUAL (pago directo al empleado) o IESS (depósito al IESS). El flujo de cálculo y cierre es igual al de los décimos.</w:t>
+      </w:r>
+    </w:p>
+    <w:p>
+      <w:pPr>
+        <w:pStyle w:val="Ttulo2"/>
+        <w:jc w:val="both"/>
+      </w:pPr>
       <w:r>
         <w:rPr>
           <w:color w:val="068174"/>
         </w:rPr>
-        <w:t>Reserva</w:t>
-      </w:r>
-    </w:p>
-    <w:p>
-      <w:pPr>
-        <w:jc w:val="both"/>
-      </w:pPr>
-      <w:r>
-        <w:rPr>
-          <w:sz w:val="21"/>
-        </w:rPr>
-        <w:t>Se calculan para empleados con más de 12 meses de servicio. Puede filtrar por tipo: MENSUAL (pago directo al empleado) o IESS (depósito al IESS). El flujo de cálculo y cierre es igual al de los décimos.</w:t>
-      </w:r>
-    </w:p>
-    <w:p>
-      <w:pPr>
-        <w:pStyle w:val="Ttulo2"/>
-        <w:jc w:val="both"/>
-      </w:pPr>
-      <w:r>
-        <w:rPr>
-          <w:color w:val="068174"/>
-        </w:rPr>
         <w:t>4.3 Rol de Pagos</w:t>
       </w:r>
     </w:p>
@@ -4597,13 +4129,7 @@
         <w:rPr>
           <w:sz w:val="21"/>
         </w:rPr>
-        <w:t>El rol de pagos incluye el s</w:t>
-      </w:r>
-      <w:r>
-        <w:rPr>
-          <w:sz w:val="21"/>
-        </w:rPr>
-        <w:t>ueldo mensual proporcional, aportes IESS/IECE/SECAP y todos los descuentos.</w:t>
+        <w:t>El rol de pagos incluye el sueldo mensual proporcional, aportes IESS/IECE/SECAP y todos los descuentos.</w:t>
       </w:r>
     </w:p>
     <w:p>
@@ -4728,13 +4254,7 @@
               <w:rPr>
                 <w:sz w:val="19"/>
               </w:rPr>
-              <w:t xml:space="preserve">Descuento al empleado: 11.45% (LOSEP) / 9.45% </w:t>
-            </w:r>
-            <w:r>
-              <w:rPr>
-                <w:sz w:val="19"/>
-              </w:rPr>
-              <w:t>(CT).</w:t>
+              <w:t>Descuento al empleado: 11.45% (LOSEP) / 9.45% (CT).</w:t>
             </w:r>
           </w:p>
         </w:tc>
@@ -4854,13 +4374,7 @@
               <w:rPr>
                 <w:sz w:val="19"/>
               </w:rPr>
-              <w:t>Impuesto</w:t>
-            </w:r>
-            <w:r>
-              <w:rPr>
-                <w:sz w:val="19"/>
-              </w:rPr>
-              <w:t xml:space="preserve"> a la renta</w:t>
+              <w:t>Impuesto a la renta</w:t>
             </w:r>
           </w:p>
         </w:tc>
@@ -4967,13 +4481,7 @@
         <w:rPr>
           <w:sz w:val="21"/>
         </w:rPr>
-        <w:t xml:space="preserve">Haga clic en la celda del campo que desea </w:t>
-      </w:r>
-      <w:r>
-        <w:rPr>
-          <w:sz w:val="21"/>
-        </w:rPr>
-        <w:t>editar (quirografario, hipotecario, impuesto renta, póliza blanket). Ingrese el valor y presione Enter o haga clic fuera de la celda para guardar.</w:t>
+        <w:t>Haga clic en la celda del campo que desea editar (quirografario, hipotecario, impuesto renta, póliza blanket). Ingrese el valor y presione Enter o haga clic fuera de la celda para guardar.</w:t>
       </w:r>
     </w:p>
     <w:p>
@@ -4994,13 +4502,7 @@
         <w:rPr>
           <w:sz w:val="21"/>
         </w:rPr>
-        <w:t>Si tiene varios empleados con descuentos a actualizar, use el botón "Importar C</w:t>
-      </w:r>
-      <w:r>
-        <w:rPr>
-          <w:sz w:val="21"/>
-        </w:rPr>
-        <w:t>SV". El archivo debe tener columnas: cedula, quirografario, hipotecario, impuesto_renta, poliza_blanket.</w:t>
+        <w:t>Si tiene varios empleados con descuentos a actualizar, use el botón "Importar CSV". El archivo debe tener columnas: cedula, quirografario, hipotecario, impuesto_renta, poliza_blanket.</w:t>
       </w:r>
     </w:p>
     <w:p>
@@ -5020,13 +4522,7 @@
         <w:rPr>
           <w:sz w:val="21"/>
         </w:rPr>
-        <w:t>En la segunda pestaña del Rol de Pagos puede ver y descargar en PDF los totales agrupados por programa y actividad</w:t>
-      </w:r>
-      <w:r>
-        <w:rPr>
-          <w:sz w:val="21"/>
-        </w:rPr>
-        <w:t xml:space="preserve"> presupuestaria, para entrega a Financiero.</w:t>
+        <w:t>En la segunda pestaña del Rol de Pagos puede ver y descargar en PDF los totales agrupados por programa y actividad presupuestaria, para entrega a Financiero.</w:t>
       </w:r>
     </w:p>
     <w:p>
@@ -5049,13 +4545,7 @@
         <w:rPr>
           <w:sz w:val="21"/>
         </w:rPr>
-        <w:t>Desde el menú Admin → SBU puede registrar el Salario Básico Unificado vigente por año. Desde Admin → Aportes IESS puede actualizar los porcentajes de aporte para LOSEP y Có</w:t>
-      </w:r>
-      <w:r>
-        <w:rPr>
-          <w:sz w:val="21"/>
-        </w:rPr>
-        <w:t>digo del Trabajo si el Ministerio de Trabajo los modifica.</w:t>
+        <w:t>Desde el menú Admin → SBU puede registrar el Salario Básico Unificado vigente por año. Desde Admin → Aportes IESS puede actualizar los porcentajes de aporte para LOSEP y Código del Trabajo si el Ministerio de Trabajo los modifica.</w:t>
       </w:r>
     </w:p>
     <w:p>
@@ -5120,13 +4610,7 @@
         <w:rPr>
           <w:sz w:val="21"/>
         </w:rPr>
-        <w:t>Vay</w:t>
-      </w:r>
-      <w:r>
-        <w:rPr>
-          <w:sz w:val="21"/>
-        </w:rPr>
-        <w:t>a al menú "Artículos".</w:t>
+        <w:t>Vaya al menú "Artículos".</w:t>
       </w:r>
     </w:p>
     <w:p>
@@ -5207,15 +4691,320 @@
           <w:color w:val="0B5547"/>
           <w:sz w:val="20"/>
         </w:rPr>
-        <w:t>ℹ</w:t>
-      </w:r>
+        <w:t>ℹ  Los artículos no encontrados por código se reportan pero no se crean automáticamente. El nombre del artículo es obligatorio al crearlo.</w:t>
+      </w:r>
+    </w:p>
+    <w:p>
+      <w:pPr>
+        <w:pStyle w:val="Ttulo2"/>
+        <w:jc w:val="both"/>
+      </w:pPr>
+      <w:r>
+        <w:rPr>
+          <w:color w:val="068174"/>
+        </w:rPr>
+        <w:t>5.2 Ingresos de Bienes (Órdenes de Compra)</w:t>
+      </w:r>
+    </w:p>
+    <w:p>
+      <w:pPr>
+        <w:pStyle w:val="Ttulo3"/>
+        <w:jc w:val="both"/>
+      </w:pPr>
+      <w:r>
+        <w:t>Registrar un ingreso</w:t>
+      </w:r>
+    </w:p>
+    <w:p>
+      <w:pPr>
+        <w:pStyle w:val="Listaconnmeros"/>
+        <w:jc w:val="both"/>
+      </w:pPr>
+      <w:r>
+        <w:rPr>
+          <w:sz w:val="21"/>
+        </w:rPr>
+        <w:t>Vaya al menú "Ingresos de Bienes".</w:t>
+      </w:r>
+    </w:p>
+    <w:p>
+      <w:pPr>
+        <w:pStyle w:val="Listaconnmeros"/>
+        <w:jc w:val="both"/>
+      </w:pPr>
+      <w:r>
+        <w:rPr>
+          <w:sz w:val="21"/>
+        </w:rPr>
+        <w:t>Haga clic en "Nuevo Ingreso".</w:t>
+      </w:r>
+    </w:p>
+    <w:p>
+      <w:pPr>
+        <w:pStyle w:val="Listaconnmeros"/>
+        <w:jc w:val="both"/>
+      </w:pPr>
+      <w:r>
+        <w:rPr>
+          <w:sz w:val="21"/>
+        </w:rPr>
+        <w:t>Seleccione el proveedor, proceso de contratación, número de factura y fecha.</w:t>
+      </w:r>
+    </w:p>
+    <w:p>
+      <w:pPr>
+        <w:pStyle w:val="Listaconnmeros"/>
+        <w:jc w:val="both"/>
+      </w:pPr>
+      <w:r>
+        <w:rPr>
+          <w:sz w:val="21"/>
+        </w:rPr>
+        <w:t>Agregue los artículos con su cantidad y precio unitario.</w:t>
+      </w:r>
+    </w:p>
+    <w:p>
+      <w:pPr>
+        <w:pStyle w:val="Listaconnmeros"/>
+        <w:jc w:val="both"/>
+      </w:pPr>
+      <w:r>
+        <w:rPr>
+          <w:sz w:val="21"/>
+        </w:rPr>
+        <w:t>Si hay descuento a nivel de orden, ingréselo en el campo "Descuento".</w:t>
+      </w:r>
+    </w:p>
+    <w:p>
+      <w:pPr>
+        <w:pStyle w:val="Listaconnmeros"/>
+        <w:jc w:val="both"/>
+      </w:pPr>
+      <w:r>
+        <w:rPr>
+          <w:sz w:val="21"/>
+        </w:rPr>
+        <w:t>Guarde en estado BORRADOR para revisión posterior o confirme directamente.</w:t>
+      </w:r>
+    </w:p>
+    <w:p>
+      <w:pPr>
+        <w:pStyle w:val="Ttulo3"/>
+        <w:jc w:val="both"/>
+      </w:pPr>
+      <w:r>
+        <w:t>Confirmar un ingreso</w:t>
+      </w:r>
+    </w:p>
+    <w:p>
+      <w:pPr>
+        <w:pStyle w:val="Listaconnmeros"/>
+        <w:jc w:val="both"/>
+      </w:pPr>
+      <w:r>
+        <w:rPr>
+          <w:sz w:val="21"/>
+        </w:rPr>
+        <w:t>Con la orden en estado BORRADOR, haga clic en "Confirmar".</w:t>
+      </w:r>
+    </w:p>
+    <w:p>
+      <w:pPr>
+        <w:pStyle w:val="Listaconnmeros"/>
+        <w:jc w:val="both"/>
+      </w:pPr>
+      <w:r>
+        <w:rPr>
+          <w:sz w:val="21"/>
+        </w:rPr>
+        <w:t>Al confirmar, el sistema actualiza el stock y calcula el nuevo precio promedio ponderado.</w:t>
+      </w:r>
+    </w:p>
+    <w:p>
+      <w:pPr>
+        <w:jc w:val="both"/>
+      </w:pPr>
+      <w:r>
+        <w:rPr>
+          <w:i/>
+          <w:color w:val="B8860B"/>
+          <w:sz w:val="20"/>
+        </w:rPr>
+        <w:t>⚠  Si el proceso es CAJA CHICA, el sistema preguntará si desea confirmar con egreso simultáneo (salida inmediata a un área/empleado) o sin egreso. En CAJA CHICA no se aplica precio promedio: el precio del artículo siempre se actualiza al último precio de compra.</w:t>
+      </w:r>
+    </w:p>
+    <w:p>
+      <w:pPr>
+        <w:pStyle w:val="Ttulo3"/>
+        <w:jc w:val="both"/>
+      </w:pPr>
+      <w:r>
+        <w:t>Reversar un ingreso</w:t>
+      </w:r>
+    </w:p>
+    <w:p>
+      <w:pPr>
+        <w:jc w:val="both"/>
+      </w:pPr>
+      <w:r>
+        <w:rPr>
+          <w:sz w:val="21"/>
+        </w:rPr>
+        <w:t>Si un ingreso fue confirmado por error, puede reversarse mientras el stock lo permita. El reverso descuenta el stock y restaura el precio anterior.</w:t>
+      </w:r>
+    </w:p>
+    <w:p>
+      <w:pPr>
+        <w:pStyle w:val="Ttulo2"/>
+        <w:jc w:val="both"/>
+      </w:pPr>
+      <w:r>
+        <w:rPr>
+          <w:color w:val="068174"/>
+        </w:rPr>
+        <w:t>5.3 Egresos de Bienes</w:t>
+      </w:r>
+    </w:p>
+    <w:p>
+      <w:pPr>
+        <w:pStyle w:val="Ttulo3"/>
+        <w:jc w:val="both"/>
+      </w:pPr>
+      <w:r>
+        <w:t>Registrar un egreso</w:t>
+      </w:r>
+    </w:p>
+    <w:p>
+      <w:pPr>
+        <w:pStyle w:val="Listaconnmeros"/>
+        <w:jc w:val="both"/>
+      </w:pPr>
+      <w:r>
+        <w:rPr>
+          <w:sz w:val="21"/>
+        </w:rPr>
+        <w:t>Vaya al menú "Egresos de Bienes".</w:t>
+      </w:r>
+    </w:p>
+    <w:p>
+      <w:pPr>
+        <w:pStyle w:val="Listaconnmeros"/>
+        <w:jc w:val="both"/>
+      </w:pPr>
+      <w:r>
+        <w:rPr>
+          <w:sz w:val="21"/>
+        </w:rPr>
+        <w:lastRenderedPageBreak/>
+        <w:t>Haga clic en "Nuevo Egreso".</w:t>
+      </w:r>
+    </w:p>
+    <w:p>
+      <w:pPr>
+        <w:pStyle w:val="Listaconnmeros"/>
+        <w:jc w:val="both"/>
+      </w:pPr>
+      <w:r>
+        <w:rPr>
+          <w:sz w:val="21"/>
+        </w:rPr>
+        <w:t>Seleccione la dirección/área destino y el empleado receptor.</w:t>
+      </w:r>
+    </w:p>
+    <w:p>
+      <w:pPr>
+        <w:pStyle w:val="Listaconnmeros"/>
+        <w:jc w:val="both"/>
+      </w:pPr>
+      <w:r>
+        <w:rPr>
+          <w:sz w:val="21"/>
+        </w:rPr>
+        <w:t>Agregue los artículos y cantidades a despachar.</w:t>
+      </w:r>
+    </w:p>
+    <w:p>
+      <w:pPr>
+        <w:pStyle w:val="Listaconnmeros"/>
+        <w:jc w:val="both"/>
+      </w:pPr>
+      <w:r>
+        <w:rPr>
+          <w:sz w:val="21"/>
+        </w:rPr>
+        <w:t>Confirme el egreso para descontar del stock.</w:t>
+      </w:r>
+    </w:p>
+    <w:p>
+      <w:pPr>
+        <w:pStyle w:val="Ttulo2"/>
+        <w:jc w:val="both"/>
+      </w:pPr>
+      <w:r>
+        <w:rPr>
+          <w:color w:val="068174"/>
+        </w:rPr>
+        <w:t>5.4 Solicitudes de Materiales</w:t>
+      </w:r>
+    </w:p>
+    <w:p>
+      <w:pPr>
+        <w:jc w:val="both"/>
+      </w:pPr>
+      <w:r>
+        <w:rPr>
+          <w:sz w:val="21"/>
+        </w:rPr>
+        <w:t>Permite a cualquier empleado solicitar materiales del inventario. El flujo es:</w:t>
+      </w:r>
+    </w:p>
+    <w:p>
+      <w:pPr>
+        <w:pStyle w:val="Listaconnmeros"/>
+        <w:jc w:val="both"/>
+      </w:pPr>
+      <w:r>
+        <w:rPr>
+          <w:sz w:val="21"/>
+        </w:rPr>
+        <w:t>El empleado crea la solicitud indicando los artículos y cantidades necesarias.</w:t>
+      </w:r>
+    </w:p>
+    <w:p>
+      <w:pPr>
+        <w:pStyle w:val="Listaconnmeros"/>
+        <w:jc w:val="both"/>
+      </w:pPr>
+      <w:r>
+        <w:rPr>
+          <w:sz w:val="21"/>
+        </w:rPr>
+        <w:t>El supervisor revisa y aprueba la solicitud (puede modificar las cantidades autorizadas).</w:t>
+      </w:r>
+    </w:p>
+    <w:p>
+      <w:pPr>
+        <w:pStyle w:val="Listaconnmeros"/>
+        <w:jc w:val="both"/>
+      </w:pPr>
+      <w:r>
+        <w:rPr>
+          <w:sz w:val="21"/>
+        </w:rPr>
+        <w:t>El área de Bienes despacha los artículos y el stock se descuenta automáticamente.</w:t>
+      </w:r>
+    </w:p>
+    <w:p>
+      <w:pPr>
+        <w:jc w:val="both"/>
+      </w:pPr>
       <w:r>
         <w:rPr>
           <w:i/>
           <w:color w:val="0B5547"/>
           <w:sz w:val="20"/>
         </w:rPr>
-        <w:t xml:space="preserve">  Los artículos no encontrados por código se reportan pero no se crean automáticamente. El nombre del artículo es obligatorio al crearlo.</w:t>
+        <w:t>ℹ  El empleado y el supervisor no ven el stock disponible al crear o aprobar la solicitud. Solo el área de Bienes gestiona el despacho.</w:t>
       </w:r>
     </w:p>
     <w:p>
@@ -5227,7 +5016,90 @@
         <w:rPr>
           <w:color w:val="068174"/>
         </w:rPr>
-        <w:t>5.2 Ingresos de Bienes (Órdenes de Compra)</w:t>
+        <w:t>5.5 Ajuste de Inventario (Toma Física)</w:t>
+      </w:r>
+    </w:p>
+    <w:p>
+      <w:pPr>
+        <w:jc w:val="both"/>
+      </w:pPr>
+      <w:r>
+        <w:rPr>
+          <w:sz w:val="21"/>
+        </w:rPr>
+        <w:t>Use el ajuste para corregir diferencias entre el stock del sistema y el conteo físico real:</w:t>
+      </w:r>
+    </w:p>
+    <w:p>
+      <w:pPr>
+        <w:pStyle w:val="Listaconnmeros"/>
+        <w:jc w:val="both"/>
+      </w:pPr>
+      <w:r>
+        <w:rPr>
+          <w:sz w:val="21"/>
+        </w:rPr>
+        <w:t>Vaya al menú "Ajuste de Inventario".</w:t>
+      </w:r>
+    </w:p>
+    <w:p>
+      <w:pPr>
+        <w:pStyle w:val="Listaconnmeros"/>
+        <w:jc w:val="both"/>
+      </w:pPr>
+      <w:r>
+        <w:rPr>
+          <w:sz w:val="21"/>
+        </w:rPr>
+        <w:t>Busque el artículo a ajustar.</w:t>
+      </w:r>
+    </w:p>
+    <w:p>
+      <w:pPr>
+        <w:pStyle w:val="Listaconnmeros"/>
+        <w:jc w:val="both"/>
+      </w:pPr>
+      <w:r>
+        <w:rPr>
+          <w:sz w:val="21"/>
+        </w:rPr>
+        <w:t>Ingrese la cantidad física contada.</w:t>
+      </w:r>
+    </w:p>
+    <w:p>
+      <w:pPr>
+        <w:pStyle w:val="Listaconnmeros"/>
+        <w:jc w:val="both"/>
+      </w:pPr>
+      <w:r>
+        <w:rPr>
+          <w:sz w:val="21"/>
+        </w:rPr>
+        <w:t>El sistema calculará automáticamente si es un ajuste positivo (físico &gt; sistema) o negativo (físico &lt; sistema).</w:t>
+      </w:r>
+    </w:p>
+    <w:p>
+      <w:pPr>
+        <w:pStyle w:val="Listaconnmeros"/>
+        <w:jc w:val="both"/>
+      </w:pPr>
+      <w:r>
+        <w:rPr>
+          <w:sz w:val="21"/>
+        </w:rPr>
+        <w:t>Confirme el ajuste. Se registra en el kardex.</w:t>
+      </w:r>
+    </w:p>
+    <w:p>
+      <w:pPr>
+        <w:pStyle w:val="Ttulo2"/>
+        <w:jc w:val="both"/>
+      </w:pPr>
+      <w:r>
+        <w:rPr>
+          <w:color w:val="068174"/>
+        </w:rPr>
+        <w:t>5.6 Reportes de Adquisiciones</w:t>
       </w:r>
     </w:p>
     <w:p>
@@ -5236,91 +5108,18 @@
         <w:jc w:val="both"/>
       </w:pPr>
       <w:r>
-        <w:t>Registrar un ingreso</w:t>
-      </w:r>
-    </w:p>
-    <w:p>
-      <w:pPr>
-        <w:pStyle w:val="Listaconnmeros"/>
-        <w:jc w:val="both"/>
-      </w:pPr>
-      <w:r>
-        <w:rPr>
-          <w:sz w:val="21"/>
-        </w:rPr>
-        <w:t>Vaya al menú "Ingresos de Bienes".</w:t>
-      </w:r>
-    </w:p>
-    <w:p>
-      <w:pPr>
-        <w:pStyle w:val="Listaconnmeros"/>
-        <w:jc w:val="both"/>
-      </w:pPr>
-      <w:r>
-        <w:rPr>
-          <w:sz w:val="21"/>
-        </w:rPr>
-        <w:t>Haga clic en "Nuev</w:t>
-      </w:r>
-      <w:r>
-        <w:rPr>
-          <w:sz w:val="21"/>
-        </w:rPr>
-        <w:t>o Ingreso".</w:t>
-      </w:r>
-    </w:p>
-    <w:p>
-      <w:pPr>
-        <w:pStyle w:val="Listaconnmeros"/>
-        <w:jc w:val="both"/>
-      </w:pPr>
-      <w:r>
-        <w:rPr>
-          <w:sz w:val="21"/>
-        </w:rPr>
-        <w:t>Seleccione el proveedor, proceso de contratación, número de factura y fecha.</w:t>
-      </w:r>
-    </w:p>
-    <w:p>
-      <w:pPr>
-        <w:pStyle w:val="Listaconnmeros"/>
-        <w:jc w:val="both"/>
-      </w:pPr>
-      <w:r>
-        <w:rPr>
-          <w:sz w:val="21"/>
-        </w:rPr>
-        <w:t>Agregue los artículos con su cantidad y precio unitario.</w:t>
-      </w:r>
-    </w:p>
-    <w:p>
-      <w:pPr>
-        <w:pStyle w:val="Listaconnmeros"/>
-        <w:jc w:val="both"/>
-      </w:pPr>
-      <w:r>
-        <w:rPr>
-          <w:sz w:val="21"/>
-        </w:rPr>
-        <w:t>Si hay descuento a nivel de orden, ingréselo en el campo "Descuento".</w:t>
-      </w:r>
-    </w:p>
-    <w:p>
-      <w:pPr>
-        <w:pStyle w:val="Listaconnmeros"/>
-        <w:jc w:val="both"/>
-      </w:pPr>
-      <w:r>
-        <w:rPr>
-          <w:sz w:val="21"/>
-        </w:rPr>
-        <w:t xml:space="preserve">Guarde en estado BORRADOR para revisión </w:t>
-      </w:r>
-      <w:r>
-        <w:rPr>
-          <w:sz w:val="21"/>
-        </w:rPr>
-        <w:t>posterior o confirme directamente.</w:t>
+        <w:t>Kardex NIC 2</w:t>
+      </w:r>
+    </w:p>
+    <w:p>
+      <w:pPr>
+        <w:jc w:val="both"/>
+      </w:pPr>
+      <w:r>
+        <w:rPr>
+          <w:sz w:val="21"/>
+        </w:rPr>
+        <w:t>Reporte de movimientos valorizado por artículo. Muestra entradas, salidas y saldo con precio unitario y valor total. Puede filtrar por artículo individual, por nivel 1 MEF (categoría) o por nivel 2 MEF (subcategoría). Disponible en PDF.</w:t>
       </w:r>
     </w:p>
     <w:p>
@@ -5329,60 +5128,18 @@
         <w:jc w:val="both"/>
       </w:pPr>
       <w:r>
-        <w:t>Confirmar un ingreso</w:t>
-      </w:r>
-    </w:p>
-    <w:p>
-      <w:pPr>
-        <w:pStyle w:val="Listaconnmeros"/>
-        <w:jc w:val="both"/>
-      </w:pPr>
-      <w:r>
-        <w:rPr>
-          <w:sz w:val="21"/>
-        </w:rPr>
-        <w:t>Con la orden en estado BORRADOR, haga clic en "Confirmar".</w:t>
-      </w:r>
-    </w:p>
-    <w:p>
-      <w:pPr>
-        <w:pStyle w:val="Listaconnmeros"/>
-        <w:jc w:val="both"/>
-      </w:pPr>
-      <w:r>
-        <w:rPr>
-          <w:sz w:val="21"/>
-        </w:rPr>
-        <w:t>Al confirmar, el sistema actualiza el stock y calcula el nuevo precio promedio ponderado.</w:t>
-      </w:r>
-    </w:p>
-    <w:p>
-      <w:pPr>
-        <w:jc w:val="both"/>
-      </w:pPr>
-      <w:r>
-        <w:rPr>
-          <w:i/>
-          <w:color w:val="B8860B"/>
-          <w:sz w:val="20"/>
-        </w:rPr>
-        <w:t>⚠</w:t>
-      </w:r>
-      <w:r>
-        <w:rPr>
-          <w:i/>
-          <w:color w:val="B8860B"/>
-          <w:sz w:val="20"/>
-        </w:rPr>
-        <w:t xml:space="preserve">  Si el proceso es CAJA CHICA, el sistema pregunta</w:t>
-      </w:r>
-      <w:r>
-        <w:rPr>
-          <w:i/>
-          <w:color w:val="B8860B"/>
-          <w:sz w:val="20"/>
-        </w:rPr>
-        <w:t>rá si desea confirmar con egreso simultáneo (salida inmediata a un área/empleado) o sin egreso. En CAJA CHICA no se aplica precio promedio: el precio del artículo siempre se actualiza al último precio de compra.</w:t>
+        <w:t>Libro de Compras</w:t>
+      </w:r>
+    </w:p>
+    <w:p>
+      <w:pPr>
+        <w:jc w:val="both"/>
+      </w:pPr>
+      <w:r>
+        <w:rPr>
+          <w:sz w:val="21"/>
+        </w:rPr>
+        <w:t>Lista todas las compras del período con datos del proveedor y factura, para conciliación con el SRI. Incluye el Top 5 de proveedores por monto. Disponible en PDF.</w:t>
       </w:r>
     </w:p>
     <w:p>
@@ -5391,24 +5148,90 @@
         <w:jc w:val="both"/>
       </w:pPr>
       <w:r>
-        <w:t>Reversar un ingreso</w:t>
-      </w:r>
-    </w:p>
-    <w:p>
-      <w:pPr>
-        <w:jc w:val="both"/>
-      </w:pPr>
-      <w:r>
-        <w:rPr>
-          <w:sz w:val="21"/>
-        </w:rPr>
-        <w:t>Si un ingreso fue confir</w:t>
-      </w:r>
-      <w:r>
-        <w:rPr>
-          <w:sz w:val="21"/>
-        </w:rPr>
-        <w:t>mado por error, puede reversarse mientras el stock lo permita. El reverso descuenta el stock y restaura el precio anterior.</w:t>
+        <w:t>Inventario Mensual</w:t>
+      </w:r>
+    </w:p>
+    <w:p>
+      <w:pPr>
+        <w:jc w:val="both"/>
+      </w:pPr>
+      <w:r>
+        <w:rPr>
+          <w:sz w:val="21"/>
+        </w:rPr>
+        <w:t>Muestra el saldo inicial, ingresos (procesos y caja chica), egresos y saldo final del mes agrupado por partida presupuestaria. Disponible en PDF landscape A4.</w:t>
+      </w:r>
+    </w:p>
+    <w:p>
+      <w:pPr>
+        <w:pStyle w:val="Ttulo3"/>
+        <w:jc w:val="both"/>
+      </w:pPr>
+      <w:r>
+        <w:t>Egresos Valorizados</w:t>
+      </w:r>
+    </w:p>
+    <w:p>
+      <w:pPr>
+        <w:jc w:val="both"/>
+        <w:rPr>
+          <w:lang w:val="es-EC"/>
+        </w:rPr>
+      </w:pPr>
+      <w:r>
+        <w:rPr>
+          <w:sz w:val="21"/>
+          <w:lang w:val="es-EC"/>
+        </w:rPr>
+        <w:t xml:space="preserve">Reporte de todas las salidas </w:t>
+      </w:r>
+      <w:r>
+        <w:rPr>
+          <w:sz w:val="21"/>
+          <w:lang w:val="es-EC"/>
+        </w:rPr>
+        <w:t xml:space="preserve">por proveedor, </w:t>
+      </w:r>
+      <w:r>
+        <w:rPr>
+          <w:sz w:val="21"/>
+          <w:lang w:val="es-EC"/>
+        </w:rPr>
+        <w:t>del período filtrado por dirección/área. Disponible en PDF.</w:t>
+      </w:r>
+    </w:p>
+    <w:p>
+      <w:pPr>
+        <w:jc w:val="both"/>
+      </w:pPr>
+      <w:r>
+        <w:br w:type="page"/>
+      </w:r>
+      <w:bookmarkStart w:id="0" w:name="_GoBack"/>
+      <w:bookmarkEnd w:id="0"/>
+    </w:p>
+    <w:p>
+      <w:pPr>
+        <w:pStyle w:val="Ttulo1"/>
+        <w:jc w:val="both"/>
+      </w:pPr>
+      <w:r>
+        <w:rPr>
+          <w:color w:val="0B5547"/>
+        </w:rPr>
+        <w:lastRenderedPageBreak/>
+        <w:t>6. Módulo Transportes</w:t>
+      </w:r>
+    </w:p>
+    <w:p>
+      <w:pPr>
+        <w:jc w:val="both"/>
+      </w:pPr>
+      <w:r>
+        <w:rPr>
+          <w:sz w:val="21"/>
+        </w:rPr>
+        <w:t>Gestiona el parque vehicular institucional, mantenimiento, movilización y vales de combustible.</w:t>
       </w:r>
     </w:p>
     <w:p>
@@ -5420,425 +5243,6 @@
         <w:rPr>
           <w:color w:val="068174"/>
         </w:rPr>
-        <w:t>5.3 Egresos de Bienes</w:t>
-      </w:r>
-    </w:p>
-    <w:p>
-      <w:pPr>
-        <w:pStyle w:val="Ttulo3"/>
-        <w:jc w:val="both"/>
-      </w:pPr>
-      <w:r>
-        <w:t>Registrar un egreso</w:t>
-      </w:r>
-    </w:p>
-    <w:p>
-      <w:pPr>
-        <w:pStyle w:val="Listaconnmeros"/>
-        <w:jc w:val="both"/>
-      </w:pPr>
-      <w:r>
-        <w:rPr>
-          <w:sz w:val="21"/>
-        </w:rPr>
-        <w:t>Vaya al menú "Egresos de Bienes".</w:t>
-      </w:r>
-    </w:p>
-    <w:p>
-      <w:pPr>
-        <w:pStyle w:val="Listaconnmeros"/>
-        <w:jc w:val="both"/>
-      </w:pPr>
-      <w:r>
-        <w:rPr>
-          <w:sz w:val="21"/>
-        </w:rPr>
-        <w:lastRenderedPageBreak/>
-        <w:t>Haga clic en "Nuevo Egreso".</w:t>
-      </w:r>
-    </w:p>
-    <w:p>
-      <w:pPr>
-        <w:pStyle w:val="Listaconnmeros"/>
-        <w:jc w:val="both"/>
-      </w:pPr>
-      <w:r>
-        <w:rPr>
-          <w:sz w:val="21"/>
-        </w:rPr>
-        <w:t xml:space="preserve">Seleccione la </w:t>
-      </w:r>
-      <w:r>
-        <w:rPr>
-          <w:sz w:val="21"/>
-        </w:rPr>
-        <w:t>dirección/área destino y el empleado receptor.</w:t>
-      </w:r>
-    </w:p>
-    <w:p>
-      <w:pPr>
-        <w:pStyle w:val="Listaconnmeros"/>
-        <w:jc w:val="both"/>
-      </w:pPr>
-      <w:r>
-        <w:rPr>
-          <w:sz w:val="21"/>
-        </w:rPr>
-        <w:t>Agregue los artículos y cantidades a despachar.</w:t>
-      </w:r>
-    </w:p>
-    <w:p>
-      <w:pPr>
-        <w:pStyle w:val="Listaconnmeros"/>
-        <w:jc w:val="both"/>
-      </w:pPr>
-      <w:r>
-        <w:rPr>
-          <w:sz w:val="21"/>
-        </w:rPr>
-        <w:t>Confirme el egreso para descontar del stock.</w:t>
-      </w:r>
-    </w:p>
-    <w:p>
-      <w:pPr>
-        <w:pStyle w:val="Ttulo2"/>
-        <w:jc w:val="both"/>
-      </w:pPr>
-      <w:r>
-        <w:rPr>
-          <w:color w:val="068174"/>
-        </w:rPr>
-        <w:t>5.4 Solicitudes de Materiales</w:t>
-      </w:r>
-    </w:p>
-    <w:p>
-      <w:pPr>
-        <w:jc w:val="both"/>
-      </w:pPr>
-      <w:r>
-        <w:rPr>
-          <w:sz w:val="21"/>
-        </w:rPr>
-        <w:t>Permite a cualquier empleado solicitar materiales del inventario. El flujo es:</w:t>
-      </w:r>
-    </w:p>
-    <w:p>
-      <w:pPr>
-        <w:pStyle w:val="Listaconnmeros"/>
-        <w:jc w:val="both"/>
-      </w:pPr>
-      <w:r>
-        <w:rPr>
-          <w:sz w:val="21"/>
-        </w:rPr>
-        <w:t>El empl</w:t>
-      </w:r>
-      <w:r>
-        <w:rPr>
-          <w:sz w:val="21"/>
-        </w:rPr>
-        <w:t>eado crea la solicitud indicando los artículos y cantidades necesarias.</w:t>
-      </w:r>
-    </w:p>
-    <w:p>
-      <w:pPr>
-        <w:pStyle w:val="Listaconnmeros"/>
-        <w:jc w:val="both"/>
-      </w:pPr>
-      <w:r>
-        <w:rPr>
-          <w:sz w:val="21"/>
-        </w:rPr>
-        <w:t>El supervisor revisa y aprueba la solicitud (puede modificar las cantidades autorizadas).</w:t>
-      </w:r>
-    </w:p>
-    <w:p>
-      <w:pPr>
-        <w:pStyle w:val="Listaconnmeros"/>
-        <w:jc w:val="both"/>
-      </w:pPr>
-      <w:r>
-        <w:rPr>
-          <w:sz w:val="21"/>
-        </w:rPr>
-        <w:t>El área de Bienes despacha los artículos y el stock se descuenta automáticamente.</w:t>
-      </w:r>
-    </w:p>
-    <w:p>
-      <w:pPr>
-        <w:jc w:val="both"/>
-      </w:pPr>
-      <w:r>
-        <w:rPr>
-          <w:i/>
-          <w:color w:val="0B5547"/>
-          <w:sz w:val="20"/>
-        </w:rPr>
-        <w:t>ℹ</w:t>
-      </w:r>
-      <w:r>
-        <w:rPr>
-          <w:i/>
-          <w:color w:val="0B5547"/>
-          <w:sz w:val="20"/>
-        </w:rPr>
-        <w:t xml:space="preserve">  El </w:t>
-      </w:r>
-      <w:r>
-        <w:rPr>
-          <w:i/>
-          <w:color w:val="0B5547"/>
-          <w:sz w:val="20"/>
-        </w:rPr>
-        <w:t>empleado y el supervisor no ven el stock disponible al crear o aprobar la solicitud. Solo el área de Bienes gestiona el despacho.</w:t>
-      </w:r>
-    </w:p>
-    <w:p>
-      <w:pPr>
-        <w:pStyle w:val="Ttulo2"/>
-        <w:jc w:val="both"/>
-      </w:pPr>
-      <w:r>
-        <w:rPr>
-          <w:color w:val="068174"/>
-        </w:rPr>
-        <w:t>5.5 Ajuste de Inventario (Toma Física)</w:t>
-      </w:r>
-    </w:p>
-    <w:p>
-      <w:pPr>
-        <w:jc w:val="both"/>
-      </w:pPr>
-      <w:r>
-        <w:rPr>
-          <w:sz w:val="21"/>
-        </w:rPr>
-        <w:t>Use el ajuste para corregir diferencias entre el stock del sistema y el conteo físico r</w:t>
-      </w:r>
-      <w:r>
-        <w:rPr>
-          <w:sz w:val="21"/>
-        </w:rPr>
-        <w:t>eal:</w:t>
-      </w:r>
-    </w:p>
-    <w:p>
-      <w:pPr>
-        <w:pStyle w:val="Listaconnmeros"/>
-        <w:jc w:val="both"/>
-      </w:pPr>
-      <w:r>
-        <w:rPr>
-          <w:sz w:val="21"/>
-        </w:rPr>
-        <w:t>Vaya al menú "Ajuste de Inventario".</w:t>
-      </w:r>
-    </w:p>
-    <w:p>
-      <w:pPr>
-        <w:pStyle w:val="Listaconnmeros"/>
-        <w:jc w:val="both"/>
-      </w:pPr>
-      <w:r>
-        <w:rPr>
-          <w:sz w:val="21"/>
-        </w:rPr>
-        <w:t>Busque el artículo a ajustar.</w:t>
-      </w:r>
-    </w:p>
-    <w:p>
-      <w:pPr>
-        <w:pStyle w:val="Listaconnmeros"/>
-        <w:jc w:val="both"/>
-      </w:pPr>
-      <w:r>
-        <w:rPr>
-          <w:sz w:val="21"/>
-        </w:rPr>
-        <w:t>Ingrese la cantidad física contada.</w:t>
-      </w:r>
-    </w:p>
-    <w:p>
-      <w:pPr>
-        <w:pStyle w:val="Listaconnmeros"/>
-        <w:jc w:val="both"/>
-      </w:pPr>
-      <w:r>
-        <w:rPr>
-          <w:sz w:val="21"/>
-        </w:rPr>
-        <w:t>El sistema calculará automáticamente si es un ajuste positivo (físico &gt; sistema) o negativo (físico &lt; sistema).</w:t>
-      </w:r>
-    </w:p>
-    <w:p>
-      <w:pPr>
-        <w:pStyle w:val="Listaconnmeros"/>
-        <w:jc w:val="both"/>
-      </w:pPr>
-      <w:r>
-        <w:rPr>
-          <w:sz w:val="21"/>
-        </w:rPr>
-        <w:t>Confirme el ajuste. Se registra en e</w:t>
-      </w:r>
-      <w:r>
-        <w:rPr>
-          <w:sz w:val="21"/>
-        </w:rPr>
-        <w:t>l kardex.</w:t>
-      </w:r>
-    </w:p>
-    <w:p>
-      <w:pPr>
-        <w:pStyle w:val="Ttulo2"/>
-        <w:jc w:val="both"/>
-      </w:pPr>
-      <w:r>
-        <w:rPr>
-          <w:color w:val="068174"/>
-        </w:rPr>
-        <w:t>5.6 Reportes de Adquisiciones</w:t>
-      </w:r>
-    </w:p>
-    <w:p>
-      <w:pPr>
-        <w:pStyle w:val="Ttulo3"/>
-        <w:jc w:val="both"/>
-      </w:pPr>
-      <w:r>
-        <w:t>Kardex NIC 2</w:t>
-      </w:r>
-    </w:p>
-    <w:p>
-      <w:pPr>
-        <w:jc w:val="both"/>
-      </w:pPr>
-      <w:r>
-        <w:rPr>
-          <w:sz w:val="21"/>
-        </w:rPr>
-        <w:t>Reporte de movimientos valorizado por artículo. Muestra entradas, salidas y saldo con precio unitario y valor total. Puede filtrar por artículo individual, por nivel 1 MEF (categoría) o por nivel 2 MEF (</w:t>
-      </w:r>
-      <w:r>
-        <w:rPr>
-          <w:sz w:val="21"/>
-        </w:rPr>
-        <w:t>subcategoría). Disponible en PDF.</w:t>
-      </w:r>
-    </w:p>
-    <w:p>
-      <w:pPr>
-        <w:pStyle w:val="Ttulo3"/>
-        <w:jc w:val="both"/>
-      </w:pPr>
-      <w:r>
-        <w:t>Libro de Compras</w:t>
-      </w:r>
-    </w:p>
-    <w:p>
-      <w:pPr>
-        <w:jc w:val="both"/>
-      </w:pPr>
-      <w:r>
-        <w:rPr>
-          <w:sz w:val="21"/>
-        </w:rPr>
-        <w:t>Lista todas las compras del período con datos del proveedor y factura, para conciliación con el SRI. Incluye el Top 5 de proveedores por monto. Disponible en PDF.</w:t>
-      </w:r>
-    </w:p>
-    <w:p>
-      <w:pPr>
-        <w:pStyle w:val="Ttulo3"/>
-        <w:jc w:val="both"/>
-      </w:pPr>
-      <w:r>
-        <w:t>Inventario Mensual</w:t>
-      </w:r>
-    </w:p>
-    <w:p>
-      <w:pPr>
-        <w:jc w:val="both"/>
-      </w:pPr>
-      <w:r>
-        <w:rPr>
-          <w:sz w:val="21"/>
-        </w:rPr>
-        <w:t>Muestra el saldo inicia</w:t>
-      </w:r>
-      <w:r>
-        <w:rPr>
-          <w:sz w:val="21"/>
-        </w:rPr>
-        <w:t>l, ingresos (procesos y caja chica), egresos y saldo final del mes agrupado por partida presupuestaria. Disponible en PDF landscape A4.</w:t>
-      </w:r>
-    </w:p>
-    <w:p>
-      <w:pPr>
-        <w:pStyle w:val="Ttulo3"/>
-        <w:jc w:val="both"/>
-      </w:pPr>
-      <w:r>
-        <w:t>Egresos Valorizados</w:t>
-      </w:r>
-    </w:p>
-    <w:p>
-      <w:pPr>
-        <w:jc w:val="both"/>
-      </w:pPr>
-      <w:r>
-        <w:rPr>
-          <w:sz w:val="21"/>
-        </w:rPr>
-        <w:t>Reporte de todas las salidas del período filtrado por dirección/área. Disponible en PDF.</w:t>
-      </w:r>
-    </w:p>
-    <w:p>
-      <w:pPr>
-        <w:jc w:val="both"/>
-      </w:pPr>
-      <w:r>
-        <w:br w:type="page"/>
-      </w:r>
-    </w:p>
-    <w:p>
-      <w:pPr>
-        <w:pStyle w:val="Ttulo1"/>
-        <w:jc w:val="both"/>
-      </w:pPr>
-      <w:r>
-        <w:rPr>
-          <w:color w:val="0B5547"/>
-        </w:rPr>
-        <w:lastRenderedPageBreak/>
-        <w:t>6. Módulo</w:t>
-      </w:r>
-      <w:r>
-        <w:rPr>
-          <w:color w:val="0B5547"/>
-        </w:rPr>
-        <w:t xml:space="preserve"> Transportes</w:t>
-      </w:r>
-    </w:p>
-    <w:p>
-      <w:pPr>
-        <w:jc w:val="both"/>
-      </w:pPr>
-      <w:r>
-        <w:rPr>
-          <w:sz w:val="21"/>
-        </w:rPr>
-        <w:t>Gestiona el parque vehicular institucional, mantenimiento, movilización y vales de combustible.</w:t>
-      </w:r>
-    </w:p>
-    <w:p>
-      <w:pPr>
-        <w:pStyle w:val="Ttulo2"/>
-        <w:jc w:val="both"/>
-      </w:pPr>
-      <w:r>
-        <w:rPr>
-          <w:color w:val="068174"/>
-        </w:rPr>
         <w:t>6.1 Vehículos</w:t>
       </w:r>
     </w:p>
@@ -5850,13 +5254,7 @@
         <w:rPr>
           <w:sz w:val="21"/>
         </w:rPr>
-        <w:t>Solo accesible para el rol TRANSPORTE. Permite registrar y administrar los vehículos institucionales con su placa, modelo, año, km ac</w:t>
-      </w:r>
-      <w:r>
-        <w:rPr>
-          <w:sz w:val="21"/>
-        </w:rPr>
-        <w:t>tuales y estado (ACTIVO/INACTIVO/MANTENIMIENTO).</w:t>
+        <w:t>Solo accesible para el rol TRANSPORTE. Permite registrar y administrar los vehículos institucionales con su placa, modelo, año, km actuales y estado (ACTIVO/INACTIVO/MANTENIMIENTO).</w:t>
       </w:r>
     </w:p>
     <w:p>
@@ -6045,13 +5443,7 @@
               <w:rPr>
                 <w:sz w:val="19"/>
               </w:rPr>
-              <w:t xml:space="preserve">Genera la orden </w:t>
-            </w:r>
-            <w:r>
-              <w:rPr>
-                <w:sz w:val="19"/>
-              </w:rPr>
-              <w:t>de trabajo: asigna taller, N° de orden y fecha.</w:t>
+              <w:t>Genera la orden de trabajo: asigna taller, N° de orden y fecha.</w:t>
             </w:r>
           </w:p>
         </w:tc>
@@ -6174,13 +5566,7 @@
         <w:rPr>
           <w:sz w:val="21"/>
         </w:rPr>
-        <w:t xml:space="preserve">El plan preventivo define las actividades de </w:t>
-      </w:r>
-      <w:r>
-        <w:rPr>
-          <w:sz w:val="21"/>
-        </w:rPr>
-        <w:t>mantenimiento programadas por vehículo según los hitos de km (cada 5.000 km, cada 10.000 km, etc.). Se puede cargar mediante importación CSV.</w:t>
+        <w:t>El plan preventivo define las actividades de mantenimiento programadas por vehículo según los hitos de km (cada 5.000 km, cada 10.000 km, etc.). Se puede cargar mediante importación CSV.</w:t>
       </w:r>
     </w:p>
     <w:p>
@@ -6213,13 +5599,7 @@
         <w:rPr>
           <w:sz w:val="21"/>
         </w:rPr>
-        <w:t>Vaya al menú "Movilización" (disponible si tiene el permiso "pu</w:t>
-      </w:r>
-      <w:r>
-        <w:rPr>
-          <w:sz w:val="21"/>
-        </w:rPr>
-        <w:t>ede solicitar vehículo").</w:t>
+        <w:t>Vaya al menú "Movilización" (disponible si tiene el permiso "puede solicitar vehículo").</w:t>
       </w:r>
     </w:p>
     <w:p>
@@ -6264,10 +5644,7 @@
         <w:jc w:val="both"/>
       </w:pPr>
       <w:r>
-        <w:t>Aprobar y asignar moviliza</w:t>
-      </w:r>
-      <w:r>
-        <w:t>ción (TRANSPORTE)</w:t>
+        <w:t>Aprobar y asignar movilización (TRANSPORTE)</w:t>
       </w:r>
     </w:p>
     <w:p>
@@ -6349,23 +5726,196 @@
           <w:color w:val="0B5547"/>
           <w:sz w:val="20"/>
         </w:rPr>
-        <w:t>ℹ</w:t>
-      </w:r>
+        <w:t>ℹ  El PDF de la orden de movilización está disponible desde el estado APROBADO. Incluye la hoja de ruta si el estado es COMPLETADO.</w:t>
+      </w:r>
+    </w:p>
+    <w:p>
+      <w:pPr>
+        <w:pStyle w:val="Ttulo2"/>
+        <w:jc w:val="both"/>
+      </w:pPr>
+      <w:r>
+        <w:rPr>
+          <w:color w:val="068174"/>
+        </w:rPr>
+        <w:t>6.4 Vales de Combustible</w:t>
+      </w:r>
+    </w:p>
+    <w:p>
+      <w:pPr>
+        <w:jc w:val="both"/>
+      </w:pPr>
+      <w:r>
+        <w:rPr>
+          <w:sz w:val="21"/>
+        </w:rPr>
+        <w:t>Accesible para roles CONDUCTOR y TRANSPORTE.</w:t>
+      </w:r>
+    </w:p>
+    <w:p>
+      <w:pPr>
+        <w:pStyle w:val="Listaconnmeros"/>
+        <w:jc w:val="both"/>
+      </w:pPr>
+      <w:r>
+        <w:rPr>
+          <w:sz w:val="21"/>
+        </w:rPr>
+        <w:lastRenderedPageBreak/>
+        <w:t>Vaya al menú "Vales de Combustible".</w:t>
+      </w:r>
+    </w:p>
+    <w:p>
+      <w:pPr>
+        <w:pStyle w:val="Listaconnmeros"/>
+        <w:jc w:val="both"/>
+      </w:pPr>
+      <w:r>
+        <w:rPr>
+          <w:sz w:val="21"/>
+        </w:rPr>
+        <w:t>Haga clic en "Nuevo Vale".</w:t>
+      </w:r>
+    </w:p>
+    <w:p>
+      <w:pPr>
+        <w:pStyle w:val="Listaconnmeros"/>
+        <w:jc w:val="both"/>
+      </w:pPr>
+      <w:r>
+        <w:rPr>
+          <w:sz w:val="21"/>
+        </w:rPr>
+        <w:t>Seleccione el vehículo, gasolinera, fecha y los tipos de combustible con las cantidades y precios.</w:t>
+      </w:r>
+    </w:p>
+    <w:p>
+      <w:pPr>
+        <w:pStyle w:val="Listaconnmeros"/>
+        <w:jc w:val="both"/>
+      </w:pPr>
+      <w:r>
+        <w:rPr>
+          <w:sz w:val="21"/>
+        </w:rPr>
+        <w:t>El valor se calcula automáticamente.</w:t>
+      </w:r>
+    </w:p>
+    <w:p>
+      <w:pPr>
+        <w:pStyle w:val="Listaconnmeros"/>
+        <w:jc w:val="both"/>
+      </w:pPr>
+      <w:r>
+        <w:rPr>
+          <w:sz w:val="21"/>
+        </w:rPr>
+        <w:t>Al guardar, el PDF del vale (formato oficial FR05-PRO.GA-TR.001) se abre automáticamente en una nueva pestaña para imprimir y firmar.</w:t>
+      </w:r>
+    </w:p>
+    <w:p>
+      <w:pPr>
+        <w:jc w:val="both"/>
+      </w:pPr>
       <w:r>
         <w:rPr>
           <w:i/>
           <w:color w:val="0B5547"/>
           <w:sz w:val="20"/>
         </w:rPr>
-        <w:t xml:space="preserve">  El PDF de la orden de movilización está disponible d</w:t>
-      </w:r>
+        <w:t>ℹ  La numeración de vales es secuencial y continua desde el último número de vale en papel. Configure el número inicial en Admin → Configuración → VALE_COMBUSTIBLE_INICIO.</w:t>
+      </w:r>
+    </w:p>
+    <w:p>
+      <w:pPr>
+        <w:jc w:val="both"/>
+      </w:pPr>
+      <w:r>
+        <w:br w:type="page"/>
+      </w:r>
+    </w:p>
+    <w:p>
+      <w:pPr>
+        <w:pStyle w:val="Ttulo1"/>
+        <w:jc w:val="both"/>
+      </w:pPr>
+      <w:r>
+        <w:rPr>
+          <w:color w:val="0B5547"/>
+        </w:rPr>
+        <w:lastRenderedPageBreak/>
+        <w:t>7. Administración del Sistema</w:t>
+      </w:r>
+    </w:p>
+    <w:p>
+      <w:pPr>
+        <w:jc w:val="both"/>
+      </w:pPr>
+      <w:r>
+        <w:rPr>
+          <w:sz w:val="21"/>
+        </w:rPr>
+        <w:t>El módulo de administración es exclusivo del rol ADMINISTRADOR. Permite configurar todos los parámetros del sistema.</w:t>
+      </w:r>
+    </w:p>
+    <w:p>
+      <w:pPr>
+        <w:pStyle w:val="Ttulo2"/>
+        <w:jc w:val="both"/>
+      </w:pPr>
+      <w:r>
+        <w:rPr>
+          <w:color w:val="068174"/>
+        </w:rPr>
+        <w:t>7.1 Departamentos</w:t>
+      </w:r>
+    </w:p>
+    <w:p>
+      <w:pPr>
+        <w:jc w:val="both"/>
+      </w:pPr>
+      <w:r>
+        <w:rPr>
+          <w:sz w:val="21"/>
+        </w:rPr>
+        <w:t>Gestiona la estructura organizacional de la institución. Los departamentos se organizan de forma jerárquica:</w:t>
+      </w:r>
+    </w:p>
+    <w:p>
+      <w:pPr>
+        <w:pStyle w:val="Listaconvietas"/>
+        <w:jc w:val="both"/>
+      </w:pPr>
+      <w:r>
+        <w:rPr>
+          <w:sz w:val="21"/>
+        </w:rPr>
+        <w:t>Departamentos padre: numeración en múltiplos de 10 (10, 50, 60, 70, 80, 90).</w:t>
+      </w:r>
+    </w:p>
+    <w:p>
+      <w:pPr>
+        <w:pStyle w:val="Listaconvietas"/>
+        <w:jc w:val="both"/>
+      </w:pPr>
+      <w:r>
+        <w:rPr>
+          <w:sz w:val="21"/>
+        </w:rPr>
+        <w:t>Departamentos hijo: numeración del padre +1 a +9 (ej: 51, 52, 53 para hijos del departamento 50).</w:t>
+      </w:r>
+    </w:p>
+    <w:p>
+      <w:pPr>
+        <w:jc w:val="both"/>
+      </w:pPr>
       <w:r>
         <w:rPr>
           <w:i/>
           <w:color w:val="0B5547"/>
           <w:sz w:val="20"/>
         </w:rPr>
-        <w:t>esde el estado APROBADO. Incluye la hoja de ruta si el estado es COMPLETADO.</w:t>
+        <w:t>ℹ  El departamento 999 es un placeholder del sistema y se excluye de todas las operaciones.</w:t>
       </w:r>
     </w:p>
     <w:p>
@@ -6377,237 +5927,6 @@
         <w:rPr>
           <w:color w:val="068174"/>
         </w:rPr>
-        <w:t>6.4 Vales de Combustible</w:t>
-      </w:r>
-    </w:p>
-    <w:p>
-      <w:pPr>
-        <w:jc w:val="both"/>
-      </w:pPr>
-      <w:r>
-        <w:rPr>
-          <w:sz w:val="21"/>
-        </w:rPr>
-        <w:t>Accesible para roles CONDUCTOR y TRANSPORTE.</w:t>
-      </w:r>
-    </w:p>
-    <w:p>
-      <w:pPr>
-        <w:pStyle w:val="Listaconnmeros"/>
-        <w:jc w:val="both"/>
-      </w:pPr>
-      <w:r>
-        <w:rPr>
-          <w:sz w:val="21"/>
-        </w:rPr>
-        <w:lastRenderedPageBreak/>
-        <w:t>Vaya al menú "Vales de Combustible".</w:t>
-      </w:r>
-    </w:p>
-    <w:p>
-      <w:pPr>
-        <w:pStyle w:val="Listaconnmeros"/>
-        <w:jc w:val="both"/>
-      </w:pPr>
-      <w:r>
-        <w:rPr>
-          <w:sz w:val="21"/>
-        </w:rPr>
-        <w:t>Haga clic en "Nuevo Vale".</w:t>
-      </w:r>
-    </w:p>
-    <w:p>
-      <w:pPr>
-        <w:pStyle w:val="Listaconnmeros"/>
-        <w:jc w:val="both"/>
-      </w:pPr>
-      <w:r>
-        <w:rPr>
-          <w:sz w:val="21"/>
-        </w:rPr>
-        <w:t xml:space="preserve">Seleccione el vehículo, gasolinera, fecha y </w:t>
-      </w:r>
-      <w:r>
-        <w:rPr>
-          <w:sz w:val="21"/>
-        </w:rPr>
-        <w:t>los tipos de combustible con las cantidades y precios.</w:t>
-      </w:r>
-    </w:p>
-    <w:p>
-      <w:pPr>
-        <w:pStyle w:val="Listaconnmeros"/>
-        <w:jc w:val="both"/>
-      </w:pPr>
-      <w:r>
-        <w:rPr>
-          <w:sz w:val="21"/>
-        </w:rPr>
-        <w:t>El valor se calcula automáticamente.</w:t>
-      </w:r>
-    </w:p>
-    <w:p>
-      <w:pPr>
-        <w:pStyle w:val="Listaconnmeros"/>
-        <w:jc w:val="both"/>
-      </w:pPr>
-      <w:r>
-        <w:rPr>
-          <w:sz w:val="21"/>
-        </w:rPr>
-        <w:t>Al guardar, el PDF del vale (formato oficial FR05-PRO.GA-TR.001) se abre automáticamente en una nueva pestaña para imprimir y firmar.</w:t>
-      </w:r>
-    </w:p>
-    <w:p>
-      <w:pPr>
-        <w:jc w:val="both"/>
-      </w:pPr>
-      <w:r>
-        <w:rPr>
-          <w:i/>
-          <w:color w:val="0B5547"/>
-          <w:sz w:val="20"/>
-        </w:rPr>
-        <w:t>ℹ</w:t>
-      </w:r>
-      <w:r>
-        <w:rPr>
-          <w:i/>
-          <w:color w:val="0B5547"/>
-          <w:sz w:val="20"/>
-        </w:rPr>
-        <w:t xml:space="preserve">  La numeración de vales es s</w:t>
-      </w:r>
-      <w:r>
-        <w:rPr>
-          <w:i/>
-          <w:color w:val="0B5547"/>
-          <w:sz w:val="20"/>
-        </w:rPr>
-        <w:t>ecuencial y continua desde el último número de vale en papel. Configure el número inicial en Admin → Configuración → VALE_COMBUSTIBLE_INICIO.</w:t>
-      </w:r>
-    </w:p>
-    <w:p>
-      <w:pPr>
-        <w:jc w:val="both"/>
-      </w:pPr>
-      <w:r>
-        <w:br w:type="page"/>
-      </w:r>
-    </w:p>
-    <w:p>
-      <w:pPr>
-        <w:pStyle w:val="Ttulo1"/>
-        <w:jc w:val="both"/>
-      </w:pPr>
-      <w:r>
-        <w:rPr>
-          <w:color w:val="0B5547"/>
-        </w:rPr>
-        <w:lastRenderedPageBreak/>
-        <w:t>7. Administración del Sistema</w:t>
-      </w:r>
-    </w:p>
-    <w:p>
-      <w:pPr>
-        <w:jc w:val="both"/>
-      </w:pPr>
-      <w:r>
-        <w:rPr>
-          <w:sz w:val="21"/>
-        </w:rPr>
-        <w:t>El módulo de administración es exclusivo del rol ADMINISTRADOR. Permite configurar</w:t>
-      </w:r>
-      <w:r>
-        <w:rPr>
-          <w:sz w:val="21"/>
-        </w:rPr>
-        <w:t xml:space="preserve"> todos los parámetros del sistema.</w:t>
-      </w:r>
-    </w:p>
-    <w:p>
-      <w:pPr>
-        <w:pStyle w:val="Ttulo2"/>
-        <w:jc w:val="both"/>
-      </w:pPr>
-      <w:r>
-        <w:rPr>
-          <w:color w:val="068174"/>
-        </w:rPr>
-        <w:t>7.1 Departamentos</w:t>
-      </w:r>
-    </w:p>
-    <w:p>
-      <w:pPr>
-        <w:jc w:val="both"/>
-      </w:pPr>
-      <w:r>
-        <w:rPr>
-          <w:sz w:val="21"/>
-        </w:rPr>
-        <w:t>Gestiona la estructura organizacional de la institución. Los departamentos se organizan de forma jerárquica:</w:t>
-      </w:r>
-    </w:p>
-    <w:p>
-      <w:pPr>
-        <w:pStyle w:val="Listaconvietas"/>
-        <w:jc w:val="both"/>
-      </w:pPr>
-      <w:r>
-        <w:rPr>
-          <w:sz w:val="21"/>
-        </w:rPr>
-        <w:t>Departamentos padre: numeración en múltiplos de 10 (10, 50, 60, 70, 80, 90).</w:t>
-      </w:r>
-    </w:p>
-    <w:p>
-      <w:pPr>
-        <w:pStyle w:val="Listaconvietas"/>
-        <w:jc w:val="both"/>
-      </w:pPr>
-      <w:r>
-        <w:rPr>
-          <w:sz w:val="21"/>
-        </w:rPr>
-        <w:t>Departamentos hij</w:t>
-      </w:r>
-      <w:r>
-        <w:rPr>
-          <w:sz w:val="21"/>
-        </w:rPr>
-        <w:t>o: numeración del padre +1 a +9 (ej: 51, 52, 53 para hijos del departamento 50).</w:t>
-      </w:r>
-    </w:p>
-    <w:p>
-      <w:pPr>
-        <w:jc w:val="both"/>
-      </w:pPr>
-      <w:r>
-        <w:rPr>
-          <w:i/>
-          <w:color w:val="0B5547"/>
-          <w:sz w:val="20"/>
-        </w:rPr>
-        <w:t>ℹ</w:t>
-      </w:r>
-      <w:r>
-        <w:rPr>
-          <w:i/>
-          <w:color w:val="0B5547"/>
-          <w:sz w:val="20"/>
-        </w:rPr>
-        <w:t xml:space="preserve">  El departamento 999 es un placeholder del sistema y se excluye de todas las operaciones.</w:t>
-      </w:r>
-    </w:p>
-    <w:p>
-      <w:pPr>
-        <w:pStyle w:val="Ttulo2"/>
-        <w:jc w:val="both"/>
-      </w:pPr>
-      <w:r>
-        <w:rPr>
-          <w:color w:val="068174"/>
-        </w:rPr>
         <w:t>7.2 Gestión de Usuarios y Roles</w:t>
       </w:r>
     </w:p>
@@ -6619,13 +5938,7 @@
         <w:rPr>
           <w:sz w:val="21"/>
         </w:rPr>
-        <w:t>En el menú "Empleados" → botón de roles, puede asig</w:t>
-      </w:r>
-      <w:r>
-        <w:rPr>
-          <w:sz w:val="21"/>
-        </w:rPr>
-        <w:t>nar o revocar roles a cualquier empleado. Un empleado puede tener múltiples roles simultáneamente.</w:t>
+        <w:t>En el menú "Empleados" → botón de roles, puede asignar o revocar roles a cualquier empleado. Un empleado puede tener múltiples roles simultáneamente.</w:t>
       </w:r>
     </w:p>
     <w:p>
@@ -6638,15 +5951,7 @@
           <w:color w:val="B8860B"/>
           <w:sz w:val="20"/>
         </w:rPr>
-        <w:t>⚠</w:t>
-      </w:r>
-      <w:r>
-        <w:rPr>
-          <w:i/>
-          <w:color w:val="B8860B"/>
-          <w:sz w:val="20"/>
-        </w:rPr>
-        <w:t xml:space="preserve">  Revise cuidadosamente los roles asignados. Roles como TH NOMINA y ADMINISTRADOR tienen acceso a información financiera sensible.</w:t>
+        <w:t>⚠  Revise cuidadosamente los roles asignados. Roles como TH NOMINA y ADMINISTRADOR tienen acceso a información financiera sensible.</w:t>
       </w:r>
     </w:p>
     <w:p>
@@ -6658,13 +5963,7 @@
         <w:rPr>
           <w:color w:val="068174"/>
         </w:rPr>
-        <w:t xml:space="preserve">7.3 Configuración del </w:t>
-      </w:r>
-      <w:r>
-        <w:rPr>
-          <w:color w:val="068174"/>
-        </w:rPr>
-        <w:t>Sistema</w:t>
+        <w:t>7.3 Configuración del Sistema</w:t>
       </w:r>
     </w:p>
     <w:p>
@@ -6791,13 +6090,7 @@
               <w:rPr>
                 <w:sz w:val="19"/>
               </w:rPr>
-              <w:t xml:space="preserve">1 = una IP solo puede ser </w:t>
-            </w:r>
-            <w:r>
-              <w:rPr>
-                <w:sz w:val="19"/>
-              </w:rPr>
-              <w:t>usada por un empleado por día.</w:t>
+              <w:t>1 = una IP solo puede ser usada por un empleado por día.</w:t>
             </w:r>
           </w:p>
         </w:tc>
@@ -6883,13 +6176,7 @@
               <w:rPr>
                 <w:sz w:val="19"/>
               </w:rPr>
-              <w:t>FI</w:t>
-            </w:r>
-            <w:r>
-              <w:rPr>
-                <w:sz w:val="19"/>
-              </w:rPr>
-              <w:t>RMANTE_AUTORIDAD_NOMBRE / CARGO</w:t>
+              <w:t>FIRMANTE_AUTORIDAD_NOMBRE / CARGO</w:t>
             </w:r>
           </w:p>
         </w:tc>
@@ -6973,13 +6260,7 @@
               <w:rPr>
                 <w:sz w:val="19"/>
               </w:rPr>
-              <w:t>Número inicial para la numeració</w:t>
-            </w:r>
-            <w:r>
-              <w:rPr>
-                <w:sz w:val="19"/>
-              </w:rPr>
-              <w:t>n secuencial de vales de combustible.</w:t>
+              <w:t>Número inicial para la numeración secuencial de vales de combustible.</w:t>
             </w:r>
           </w:p>
         </w:tc>
@@ -7084,13 +6365,7 @@
         <w:rPr>
           <w:sz w:val="21"/>
         </w:rPr>
-        <w:t xml:space="preserve">Haciendo clic en cualquier fila del log se expande el </w:t>
-      </w:r>
-      <w:r>
-        <w:rPr>
-          <w:sz w:val="21"/>
-        </w:rPr>
-        <w:t>detalle con los datos anteriores y nuevos en formato JSON, permitiendo rastrear exactamente qué cambió, cuándo y quién lo hizo.</w:t>
+        <w:t>Haciendo clic en cualquier fila del log se expande el detalle con los datos anteriores y nuevos en formato JSON, permitiendo rastrear exactamente qué cambió, cuándo y quién lo hizo.</w:t>
       </w:r>
     </w:p>
     <w:p>
@@ -7114,13 +6389,7 @@
         <w:rPr>
           <w:sz w:val="21"/>
         </w:rPr>
-        <w:t>Los avisos informativos se muestran en la pantalla de selección de módulos (Launcher). Puede crear, editar, or</w:t>
-      </w:r>
-      <w:r>
-        <w:rPr>
-          <w:sz w:val="21"/>
-        </w:rPr>
-        <w:t>denar y activar/desactivar avisos desde Admin → Avisos. La dirección de desplazamiento (horizontal o vertical) se configura en Admin → Configuración.</w:t>
+        <w:t>Los avisos informativos se muestran en la pantalla de selección de módulos (Launcher). Puede crear, editar, ordenar y activar/desactivar avisos desde Admin → Avisos. La dirección de desplazamiento (horizontal o vertical) se configura en Admin → Configuración.</w:t>
       </w:r>
     </w:p>
     <w:p>
@@ -7143,13 +6412,7 @@
         <w:rPr>
           <w:sz w:val="21"/>
         </w:rPr>
-        <w:t>Cuando se conecta un nuevo reloj biométrico, este se registra automáticamente en e</w:t>
-      </w:r>
-      <w:r>
-        <w:rPr>
-          <w:sz w:val="21"/>
-        </w:rPr>
-        <w:t>l sistema al arrancar. Desde Admin → ZKTeco puede:</w:t>
+        <w:t>Cuando se conecta un nuevo reloj biométrico, este se registra automáticamente en el sistema al arrancar. Desde Admin → ZKTeco puede:</w:t>
       </w:r>
     </w:p>
     <w:p>
@@ -7197,13 +6460,7 @@
         <w:rPr>
           <w:sz w:val="21"/>
         </w:rPr>
-        <w:t>Eli</w:t>
-      </w:r>
-      <w:r>
-        <w:rPr>
-          <w:sz w:val="21"/>
-        </w:rPr>
-        <w:t>minar dispositivos que ya no estén en uso.</w:t>
+        <w:t>Eliminar dispositivos que ya no estén en uso.</w:t>
       </w:r>
     </w:p>
     <w:p>
@@ -7226,13 +6483,7 @@
         <w:rPr>
           <w:sz w:val="21"/>
         </w:rPr>
-        <w:t>Desde Admin → Calendario puede registrar los feriados y días no laborables del año. Estos días se usan para el cálculo de horas extras (todo el día festivo = horas extraordinarias) y par</w:t>
-      </w:r>
-      <w:r>
-        <w:rPr>
-          <w:sz w:val="21"/>
-        </w:rPr>
-        <w:t>a el control de asistencia.</w:t>
+        <w:t>Desde Admin → Calendario puede registrar los feriados y días no laborables del año. Estos días se usan para el cálculo de horas extras (todo el día festivo = horas extraordinarias) y para el control de asistencia.</w:t>
       </w:r>
     </w:p>
     <w:p>
@@ -7276,13 +6527,7 @@
           <w:color w:val="0B5547"/>
         </w:rPr>
         <w:lastRenderedPageBreak/>
-        <w:t>8. Gestión de Documentos (</w:t>
-      </w:r>
-      <w:r>
-        <w:rPr>
-          <w:color w:val="0B5547"/>
-        </w:rPr>
-        <w:t>Alfresco)</w:t>
+        <w:t>8. Gestión de Documentos (Alfresco)</w:t>
       </w:r>
     </w:p>
     <w:p>
@@ -7317,13 +6562,7 @@
         <w:rPr>
           <w:sz w:val="21"/>
         </w:rPr>
-        <w:t>El sistema genera el PDF del documento (acción de person</w:t>
-      </w:r>
-      <w:r>
-        <w:rPr>
-          <w:sz w:val="21"/>
-        </w:rPr>
-        <w:t>al, horas extras, certificado laboral, etc.).</w:t>
+        <w:t>El sistema genera el PDF del documento (acción de personal, horas extras, certificado laboral, etc.).</w:t>
       </w:r>
     </w:p>
     <w:p>
@@ -7371,13 +6610,7 @@
         <w:rPr>
           <w:sz w:val="21"/>
         </w:rPr>
-        <w:t xml:space="preserve">A partir de ese momento, el botón </w:t>
-      </w:r>
-      <w:r>
-        <w:rPr>
-          <w:sz w:val="21"/>
-        </w:rPr>
-        <w:t>cambia a "Descargar" y el documento queda disponible desde Alfresco.</w:t>
+        <w:t>A partir de ese momento, el botón cambia a "Descargar" y el documento queda disponible desde Alfresco.</w:t>
       </w:r>
     </w:p>
     <w:p>
@@ -7677,31 +6910,46 @@
           <w:b/>
           <w:color w:val="0B5547"/>
         </w:rPr>
-        <w:t>P:</w:t>
-      </w:r>
+        <w:t>P: ¿Por qué no puedo marcar asistencia desde mi casa?</w:t>
+      </w:r>
+    </w:p>
+    <w:p>
+      <w:pPr>
+        <w:jc w:val="both"/>
+      </w:pPr>
+      <w:r>
+        <w:rPr>
+          <w:sz w:val="21"/>
+        </w:rPr>
+        <w:t>R: Si su modalidad de marcación es PRESENCIAL, el sistema solo acepta marcaciones desde las redes internas institucionales (VLANs configuradas). Si trabaja desde casa, solicite al área de TH que cambie su modalidad a TELETRABAJO o TEMPORAL según corresponda.</w:t>
+      </w:r>
+    </w:p>
+    <w:p>
+      <w:pPr>
+        <w:jc w:val="both"/>
+      </w:pPr>
+    </w:p>
+    <w:p>
+      <w:pPr>
+        <w:jc w:val="both"/>
+      </w:pPr>
       <w:r>
         <w:rPr>
           <w:b/>
           <w:color w:val="0B5547"/>
         </w:rPr>
-        <w:t xml:space="preserve"> ¿Por qué no puedo marcar asistencia desde mi casa?</w:t>
-      </w:r>
-    </w:p>
-    <w:p>
-      <w:pPr>
-        <w:jc w:val="both"/>
-      </w:pPr>
-      <w:r>
-        <w:rPr>
-          <w:sz w:val="21"/>
-        </w:rPr>
-        <w:t>R: Si su modalidad de marcación es PRESENCIAL, el sistema solo acepta marcaciones desde las redes internas institucionales (VLANs configuradas). Si trabaja desde casa, solicite al área de TH que cambie su</w:t>
-      </w:r>
-      <w:r>
-        <w:rPr>
-          <w:sz w:val="21"/>
-        </w:rPr>
-        <w:t xml:space="preserve"> modalidad a TELETRABAJO o TEMPORAL según corresponda.</w:t>
+        <w:t>P: ¿Qué pasa si no realizo una marcación?</w:t>
+      </w:r>
+    </w:p>
+    <w:p>
+      <w:pPr>
+        <w:jc w:val="both"/>
+      </w:pPr>
+      <w:r>
+        <w:rPr>
+          <w:sz w:val="21"/>
+        </w:rPr>
+        <w:t>R: Si le falta una marcación en el día, el sistema lo registra como "marcación no realizada". Esto puede generar un atraso o discrepancia en el cuadre de asistencia. Contacte a TH para que registre la marcación manualmente si hubo un inconveniente técnico.</w:t>
       </w:r>
     </w:p>
     <w:p>
@@ -7718,24 +6966,18 @@
           <w:b/>
           <w:color w:val="0B5547"/>
         </w:rPr>
-        <w:t>P: ¿Qué pasa si no realizo una marcación?</w:t>
-      </w:r>
-    </w:p>
-    <w:p>
-      <w:pPr>
-        <w:jc w:val="both"/>
-      </w:pPr>
-      <w:r>
-        <w:rPr>
-          <w:sz w:val="21"/>
-        </w:rPr>
-        <w:t>R: Si le falta una marcación en el día, el sistema lo registra como "marcación no realizada". Esto puede generar un atraso o discrepancia en el cuadre de asis</w:t>
-      </w:r>
-      <w:r>
-        <w:rPr>
-          <w:sz w:val="21"/>
-        </w:rPr>
-        <w:t>tencia. Contacte a TH para que registre la marcación manualmente si hubo un inconveniente técnico.</w:t>
+        <w:t>P: ¿Cómo sé cuántos días de vacaciones tengo disponibles?</w:t>
+      </w:r>
+    </w:p>
+    <w:p>
+      <w:pPr>
+        <w:jc w:val="both"/>
+      </w:pPr>
+      <w:r>
+        <w:rPr>
+          <w:sz w:val="21"/>
+        </w:rPr>
+        <w:t>R: En el Dashboard, la tarjeta "Saldo Vacaciones" muestra su saldo actual. También puede verlo al abrir el formulario de nueva solicitud de vacaciones. Si tiene contrato Código del Trabajo y más de 5 años de servicio, verá el desglose de días base más los adicionales por antigüedad.</w:t>
       </w:r>
     </w:p>
     <w:p>
@@ -7752,24 +6994,18 @@
           <w:b/>
           <w:color w:val="0B5547"/>
         </w:rPr>
-        <w:t>P: ¿Cómo sé cuántos días de vacaciones tengo disponibles?</w:t>
-      </w:r>
-    </w:p>
-    <w:p>
-      <w:pPr>
-        <w:jc w:val="both"/>
-      </w:pPr>
-      <w:r>
-        <w:rPr>
-          <w:sz w:val="21"/>
-        </w:rPr>
-        <w:t xml:space="preserve">R: En el Dashboard, la tarjeta "Saldo Vacaciones" muestra su saldo actual. También puede verlo al </w:t>
-      </w:r>
-      <w:r>
-        <w:rPr>
-          <w:sz w:val="21"/>
-        </w:rPr>
-        <w:t>abrir el formulario de nueva solicitud de vacaciones. Si tiene contrato Código del Trabajo y más de 5 años de servicio, verá el desglose de días base más los adicionales por antigüedad.</w:t>
+        <w:t>P: ¿Puedo solicitar vacaciones sin planificación previa?</w:t>
+      </w:r>
+    </w:p>
+    <w:p>
+      <w:pPr>
+        <w:jc w:val="both"/>
+      </w:pPr>
+      <w:r>
+        <w:rPr>
+          <w:sz w:val="21"/>
+        </w:rPr>
+        <w:t>R: Sí. La planificación anual es una guía organizacional pero no bloquea la solicitud directa. Sin embargo, es recomendable coordinar con su supervisor.</w:t>
       </w:r>
     </w:p>
     <w:p>
@@ -7786,24 +7022,18 @@
           <w:b/>
           <w:color w:val="0B5547"/>
         </w:rPr>
-        <w:t>P: ¿Puedo solicitar vacaciones sin planificación previa?</w:t>
-      </w:r>
-    </w:p>
-    <w:p>
-      <w:pPr>
-        <w:jc w:val="both"/>
-      </w:pPr>
-      <w:r>
-        <w:rPr>
-          <w:sz w:val="21"/>
-        </w:rPr>
-        <w:t>R: Sí. La pl</w:t>
-      </w:r>
-      <w:r>
-        <w:rPr>
-          <w:sz w:val="21"/>
-        </w:rPr>
-        <w:t>anificación anual es una guía organizacional pero no bloquea la solicitud directa. Sin embargo, es recomendable coordinar con su supervisor.</w:t>
+        <w:t>P: ¿Qué significa el estado "ANULADO" en un permiso?</w:t>
+      </w:r>
+    </w:p>
+    <w:p>
+      <w:pPr>
+        <w:jc w:val="both"/>
+      </w:pPr>
+      <w:r>
+        <w:rPr>
+          <w:sz w:val="21"/>
+        </w:rPr>
+        <w:t>R: Significa que el permiso fue aprobado pero luego se anuló (generalmente porque el empleado no lo utilizó y llegó a su hora normal). Al anularlo, el saldo de vacaciones descontado se devuelve automáticamente.</w:t>
       </w:r>
     </w:p>
     <w:p>
@@ -7820,24 +7050,18 @@
           <w:b/>
           <w:color w:val="0B5547"/>
         </w:rPr>
-        <w:t>P: ¿Qué significa el estado "ANULADO" en un permiso?</w:t>
-      </w:r>
-    </w:p>
-    <w:p>
-      <w:pPr>
-        <w:jc w:val="both"/>
-      </w:pPr>
-      <w:r>
-        <w:rPr>
-          <w:sz w:val="21"/>
-        </w:rPr>
-        <w:t xml:space="preserve">R: Significa que el permiso fue aprobado pero luego se anuló </w:t>
-      </w:r>
-      <w:r>
-        <w:rPr>
-          <w:sz w:val="21"/>
-        </w:rPr>
-        <w:t>(generalmente porque el empleado no lo utilizó y llegó a su hora normal). Al anularlo, el saldo de vacaciones descontado se devuelve automáticamente.</w:t>
+        <w:t>P: ¿Por qué mi solicitud de horas extras fue devuelta?</w:t>
+      </w:r>
+    </w:p>
+    <w:p>
+      <w:pPr>
+        <w:jc w:val="both"/>
+      </w:pPr>
+      <w:r>
+        <w:rPr>
+          <w:sz w:val="21"/>
+        </w:rPr>
+        <w:t>R: TH NOMINA revisó el registro y encontró inconsistencias. Revise las observaciones del registro devuelto (indicadas con el badge naranja "Dev."), corrija la información y vuelva a enviar.</w:t>
       </w:r>
     </w:p>
     <w:p>
@@ -7854,24 +7078,19 @@
           <w:b/>
           <w:color w:val="0B5547"/>
         </w:rPr>
-        <w:t>P: ¿Por qué mi solicitud de horas extras fue devuelta?</w:t>
-      </w:r>
-    </w:p>
-    <w:p>
-      <w:pPr>
-        <w:jc w:val="both"/>
-      </w:pPr>
-      <w:r>
-        <w:rPr>
-          <w:sz w:val="21"/>
-        </w:rPr>
-        <w:t>R: TH NOMINA revisó el registro y encontró inconsi</w:t>
-      </w:r>
-      <w:r>
-        <w:rPr>
-          <w:sz w:val="21"/>
-        </w:rPr>
-        <w:t>stencias. Revise las observaciones del registro devuelto (indicadas con el badge naranja "Dev."), corrija la información y vuelva a enviar.</w:t>
+        <w:t>P: ¿Cómo sé si mi certificado laboral fue subido y firmado?</w:t>
+      </w:r>
+    </w:p>
+    <w:p>
+      <w:pPr>
+        <w:jc w:val="both"/>
+      </w:pPr>
+      <w:r>
+        <w:rPr>
+          <w:sz w:val="21"/>
+        </w:rPr>
+        <w:lastRenderedPageBreak/>
+        <w:t>R: En el historial de certificados laborales, si el botón de acción es rojo y dice "PDF", el certificado firmado ya está en Alfresco y puede descargarlo. Si el botón es azul y dice "Subir firmado", aún no se ha subido el documento escaneado.</w:t>
       </w:r>
     </w:p>
     <w:p>
@@ -7888,25 +7107,18 @@
           <w:b/>
           <w:color w:val="0B5547"/>
         </w:rPr>
-        <w:t>P: ¿Cómo sé si mi certificado laboral fue subido y firmado?</w:t>
-      </w:r>
-    </w:p>
-    <w:p>
-      <w:pPr>
-        <w:jc w:val="both"/>
-      </w:pPr>
-      <w:r>
-        <w:rPr>
-          <w:sz w:val="21"/>
-        </w:rPr>
-        <w:lastRenderedPageBreak/>
-        <w:t>R: En el historial de certificados laborales, si el bot</w:t>
-      </w:r>
-      <w:r>
-        <w:rPr>
-          <w:sz w:val="21"/>
-        </w:rPr>
-        <w:t>ón de acción es rojo y dice "PDF", el certificado firmado ya está en Alfresco y puede descargarlo. Si el botón es azul y dice "Subir firmado", aún no se ha subido el documento escaneado.</w:t>
+        <w:t>P: ¿Por qué el precio de un artículo cambió después de un ingreso?</w:t>
+      </w:r>
+    </w:p>
+    <w:p>
+      <w:pPr>
+        <w:jc w:val="both"/>
+      </w:pPr>
+      <w:r>
+        <w:rPr>
+          <w:sz w:val="21"/>
+        </w:rPr>
+        <w:t>R: Al confirmar un ingreso de bienes, el sistema recalcula el precio unitario usando el método de precio promedio ponderado (cantidad en stock × precio anterior + nueva cantidad × nuevo precio). Esto es normal según la norma NIC 2. La excepción es CAJA CHICA, donde el precio siempre se actualiza al último precio de compra.</w:t>
       </w:r>
     </w:p>
     <w:p>
@@ -7923,30 +7135,18 @@
           <w:b/>
           <w:color w:val="0B5547"/>
         </w:rPr>
-        <w:t>P: ¿Por qué el precio de un artículo cambió después de un ingreso?</w:t>
-      </w:r>
-    </w:p>
-    <w:p>
-      <w:pPr>
-        <w:jc w:val="both"/>
-      </w:pPr>
-      <w:r>
-        <w:rPr>
-          <w:sz w:val="21"/>
-        </w:rPr>
-        <w:t>R</w:t>
-      </w:r>
-      <w:r>
-        <w:rPr>
-          <w:sz w:val="21"/>
-        </w:rPr>
-        <w:t>: Al confirmar un ingreso de bienes, el sistema recalcula el precio unitario usando el método de precio promedio ponderado (cantidad en stock × precio anterior + nueva cantidad × nuevo precio). Esto es normal según la norma NIC 2. La excepción es CAJA CHIC</w:t>
-      </w:r>
-      <w:r>
-        <w:rPr>
-          <w:sz w:val="21"/>
-        </w:rPr>
-        <w:t>A, donde el precio siempre se actualiza al último precio de compra.</w:t>
+        <w:t>P: ¿Por qué no encuentro el menú de un módulo?</w:t>
+      </w:r>
+    </w:p>
+    <w:p>
+      <w:pPr>
+        <w:jc w:val="both"/>
+      </w:pPr>
+      <w:r>
+        <w:rPr>
+          <w:sz w:val="21"/>
+        </w:rPr>
+        <w:t>R: Los ítems del menú se asignan por rol. Si no ve una opción, posiblemente su rol no tiene acceso a esa función. Contacte al administrador del sistema para revisar sus roles asignados.</w:t>
       </w:r>
     </w:p>
     <w:p>
@@ -7963,40 +7163,6 @@
           <w:b/>
           <w:color w:val="0B5547"/>
         </w:rPr>
-        <w:t>P: ¿Por qué no encuentro el menú de un módulo?</w:t>
-      </w:r>
-    </w:p>
-    <w:p>
-      <w:pPr>
-        <w:jc w:val="both"/>
-      </w:pPr>
-      <w:r>
-        <w:rPr>
-          <w:sz w:val="21"/>
-        </w:rPr>
-        <w:t xml:space="preserve">R: Los ítems del menú se asignan por rol. Si no ve una opción, posiblemente su rol no tiene acceso a esa función. Contacte al administrador </w:t>
-      </w:r>
-      <w:r>
-        <w:rPr>
-          <w:sz w:val="21"/>
-        </w:rPr>
-        <w:t>del sistema para revisar sus roles asignados.</w:t>
-      </w:r>
-    </w:p>
-    <w:p>
-      <w:pPr>
-        <w:jc w:val="both"/>
-      </w:pPr>
-    </w:p>
-    <w:p>
-      <w:pPr>
-        <w:jc w:val="both"/>
-      </w:pPr>
-      <w:r>
-        <w:rPr>
-          <w:b/>
-          <w:color w:val="0B5547"/>
-        </w:rPr>
         <w:t>P: ¿Qué hago si el sistema muestra la pantalla de mantenimiento?</w:t>
       </w:r>
     </w:p>
@@ -8008,13 +7174,7 @@
         <w:rPr>
           <w:sz w:val="21"/>
         </w:rPr>
-        <w:t>R: El sistema está en mantenimiento programado. Espere a que el equipo de TI lo habilite nuevamente. Si tiene rol de administrador, puede ver un</w:t>
-      </w:r>
-      <w:r>
-        <w:rPr>
-          <w:sz w:val="21"/>
-        </w:rPr>
-        <w:t xml:space="preserve"> banner naranja y seguir trabajando en modo restringido.</w:t>
+        <w:t>R: El sistema está en mantenimiento programado. Espere a que el equipo de TI lo habilite nuevamente. Si tiene rol de administrador, puede ver un banner naranja y seguir trabajando en modo restringido.</w:t>
       </w:r>
     </w:p>
     <w:p>
@@ -8063,13 +7223,7 @@
         <w:rPr>
           <w:sz w:val="21"/>
         </w:rPr>
-        <w:t>Dirección de Tecnologías de la Información — extensión interna según directorio instituc</w:t>
-      </w:r>
-      <w:r>
-        <w:rPr>
-          <w:sz w:val="21"/>
-        </w:rPr>
-        <w:t>ional.</w:t>
+        <w:t>Dirección de Tecnologías de la Información — extensión interna según directorio institucional.</w:t>
       </w:r>
     </w:p>
     <w:p>
@@ -8153,13 +7307,7 @@
         <w:rPr>
           <w:sz w:val="21"/>
         </w:rPr>
-        <w:t>Use los navegadores Google Chrome o Microsoft Edge pa</w:t>
-      </w:r>
-      <w:r>
-        <w:rPr>
-          <w:sz w:val="21"/>
-        </w:rPr>
-        <w:t>ra mejor compatibilidad.</w:t>
+        <w:t>Use los navegadores Google Chrome o Microsoft Edge para mejor compatibilidad.</w:t>
       </w:r>
     </w:p>
     <w:p>
@@ -8218,13 +7366,7 @@
         <w:rPr>
           <w:sz w:val="21"/>
         </w:rPr>
-        <w:t xml:space="preserve">El sistema incluye un asistente de ayuda accesible desde cualquier pantalla. Puede reconocerlo por el </w:t>
-      </w:r>
-      <w:r>
-        <w:rPr>
-          <w:sz w:val="21"/>
-        </w:rPr>
-        <w:t>botón circular verde con ícono de chat ubicado en la esquina inferior derecha de la pantalla.</w:t>
+        <w:t>El sistema incluye un asistente de ayuda accesible desde cualquier pantalla. Puede reconocerlo por el botón circular verde con ícono de chat ubicado en la esquina inferior derecha de la pantalla.</w:t>
       </w:r>
     </w:p>
     <w:p>
@@ -8260,13 +7402,7 @@
         <w:rPr>
           <w:sz w:val="21"/>
         </w:rPr>
-        <w:t>Se abrirá una ventana de chat con un mensaje d</w:t>
-      </w:r>
-      <w:r>
-        <w:rPr>
-          <w:sz w:val="21"/>
-        </w:rPr>
-        <w:t>e bienvenida.</w:t>
+        <w:t>Se abrirá una ventana de chat con un mensaje de bienvenida.</w:t>
       </w:r>
     </w:p>
     <w:p>
@@ -8314,13 +7450,7 @@
         <w:rPr>
           <w:sz w:val="21"/>
         </w:rPr>
-        <w:t>Para cerrar, haga clic en el botón X de</w:t>
-      </w:r>
-      <w:r>
-        <w:rPr>
-          <w:sz w:val="21"/>
-        </w:rPr>
-        <w:t>l encabezado o en el botón FAB nuevamente.</w:t>
+        <w:t>Para cerrar, haga clic en el botón X del encabezado o en el botón FAB nuevamente.</w:t>
       </w:r>
     </w:p>
     <w:p>
@@ -8333,15 +7463,7 @@
           <w:color w:val="0B5547"/>
           <w:sz w:val="20"/>
         </w:rPr>
-        <w:t>ℹ</w:t>
-      </w:r>
-      <w:r>
-        <w:rPr>
-          <w:i/>
-          <w:color w:val="0B5547"/>
-          <w:sz w:val="20"/>
-        </w:rPr>
-        <w:t xml:space="preserve">  El asistente conserva el historial de la conversación mientras no cambie de módulo o recargue la página.</w:t>
+        <w:t>ℹ  El asistente conserva el historial de la conversación mientras no cambie de módulo o recargue la página.</w:t>
       </w:r>
     </w:p>
     <w:p>
@@ -8364,13 +7486,7 @@
         <w:rPr>
           <w:sz w:val="21"/>
         </w:rPr>
-        <w:t>El asistente puede responder preguntas sobre el uso del sistema</w:t>
-      </w:r>
-      <w:r>
-        <w:rPr>
-          <w:sz w:val="21"/>
-        </w:rPr>
-        <w:t>, por ejemplo:</w:t>
+        <w:t>El asistente puede responder preguntas sobre el uso del sistema, por ejemplo:</w:t>
       </w:r>
     </w:p>
     <w:tbl>
@@ -8593,13 +7709,7 @@
               <w:rPr>
                 <w:sz w:val="19"/>
               </w:rPr>
-              <w:t>"¿Cómo se calcula el Décimo Tercero?</w:t>
-            </w:r>
-            <w:r>
-              <w:rPr>
-                <w:sz w:val="19"/>
-              </w:rPr>
-              <w:t>" / "¿Qué es el Rol de Pagos?"</w:t>
+              <w:t>"¿Cómo se calcula el Décimo Tercero?" / "¿Qué es el Rol de Pagos?"</w:t>
             </w:r>
           </w:p>
         </w:tc>
@@ -8669,13 +7779,7 @@
               <w:rPr>
                 <w:sz w:val="19"/>
               </w:rPr>
-              <w:t>"¿Cómo solicito un vehículo?" / "¿Cómo registro la hoja de ruta?" / "¿Cómo emito un vale de combus</w:t>
-            </w:r>
-            <w:r>
-              <w:rPr>
-                <w:sz w:val="19"/>
-              </w:rPr>
-              <w:t>tible?"</w:t>
+              <w:t>"¿Cómo solicito un vehículo?" / "¿Cómo registro la hoja de ruta?" / "¿Cómo emito un vale de combustible?"</w:t>
             </w:r>
           </w:p>
         </w:tc>
@@ -8741,13 +7845,7 @@
         <w:rPr>
           <w:sz w:val="21"/>
         </w:rPr>
-        <w:t xml:space="preserve">Si hace una pregunta que no esté relacionada con el uso del aplicativo (por ejemplo, preguntas sobre otros sistemas, sobre </w:t>
-      </w:r>
-      <w:r>
-        <w:rPr>
-          <w:sz w:val="21"/>
-        </w:rPr>
-        <w:t>contabilidad, o temas personales), el asistente responderá únicamente:</w:t>
+        <w:t>Si hace una pregunta que no esté relacionada con el uso del aplicativo (por ejemplo, preguntas sobre otros sistemas, sobre contabilidad, o temas personales), el asistente responderá únicamente:</w:t>
       </w:r>
     </w:p>
     <w:p>
@@ -8773,23 +7871,7 @@
           <w:color w:val="B8860B"/>
           <w:sz w:val="20"/>
         </w:rPr>
-        <w:t>⚠</w:t>
-      </w:r>
-      <w:r>
-        <w:rPr>
-          <w:i/>
-          <w:color w:val="B8860B"/>
-          <w:sz w:val="20"/>
-        </w:rPr>
-        <w:t xml:space="preserve">  El asistente NO puede realizar acciones en el sistema: no solicita permisos, no genera reportes, </w:t>
-      </w:r>
-      <w:r>
-        <w:rPr>
-          <w:i/>
-          <w:color w:val="B8860B"/>
-          <w:sz w:val="20"/>
-        </w:rPr>
-        <w:t>no aprueba solicitudes. Solo proporciona guías sobre cómo usar el sistema.</w:t>
+        <w:t>⚠  El asistente NO puede realizar acciones en el sistema: no solicita permisos, no genera reportes, no aprueba solicitudes. Solo proporciona guías sobre cómo usar el sistema.</w:t>
       </w:r>
     </w:p>
     <w:p>
@@ -8861,13 +7943,7 @@
         <w:rPr>
           <w:sz w:val="21"/>
         </w:rPr>
-        <w:t>Mód</w:t>
-      </w:r>
-      <w:r>
-        <w:rPr>
-          <w:sz w:val="21"/>
-        </w:rPr>
-        <w:t>ulo Transportes (todas las vistas)</w:t>
+        <w:t>Módulo Transportes (todas las vistas)</w:t>
       </w:r>
     </w:p>
     <w:p>
@@ -8880,15 +7956,7 @@
           <w:color w:val="0B5547"/>
           <w:sz w:val="20"/>
         </w:rPr>
-        <w:t>ℹ</w:t>
-      </w:r>
-      <w:r>
-        <w:rPr>
-          <w:i/>
-          <w:color w:val="0B5547"/>
-          <w:sz w:val="20"/>
-        </w:rPr>
-        <w:t xml:space="preserve">  Durante el modo de mantenimiento del sistema, el asistente no está disponible (queda tapado por la pantalla de mantenimiento).</w:t>
+        <w:t>ℹ  Durante el modo de mantenimiento del sistema, el asistente no está disponible (queda tapado por la pantalla de mantenimiento).</w:t>
       </w:r>
     </w:p>
     <w:sectPr>
@@ -20807,7 +19875,7 @@
 </file>
 
 <file path=customXml/itemProps1.xml><?xml version="1.0" encoding="utf-8"?>
-<ds:datastoreItem xmlns:ds="http://schemas.openxmlformats.org/officeDocument/2006/customXml" ds:itemID="{FD1F857A-9D20-44F8-AD60-D64DE4B623DF}">
+<ds:datastoreItem xmlns:ds="http://schemas.openxmlformats.org/officeDocument/2006/customXml" ds:itemID="{105DD092-1A88-4F57-86D6-13E21A99E889}">
   <ds:schemaRefs>
     <ds:schemaRef ds:uri="http://schemas.openxmlformats.org/officeDocument/2006/bibliography"/>
   </ds:schemaRefs>

</xml_diff>

<commit_message>
Agrega reportes al modulo de tecnología
</commit_message>
<xml_diff>
--- a/Manual_Usuario_Sistema_RRHH.docx
+++ b/Manual_Usuario_Sistema_RRHH.docx
@@ -5207,8 +5207,6 @@
       <w:r>
         <w:br w:type="page"/>
       </w:r>
-      <w:bookmarkStart w:id="0" w:name="_GoBack"/>
-      <w:bookmarkEnd w:id="0"/>
     </w:p>
     <w:p>
       <w:pPr>
@@ -7957,6 +7955,1837 @@
           <w:sz w:val="20"/>
         </w:rPr>
         <w:t>ℹ  Durante el modo de mantenimiento del sistema, el asistente no está disponible (queda tapado por la pantalla de mantenimiento).</w:t>
+      </w:r>
+    </w:p>
+    <w:p>
+      <w:r>
+        <w:br w:type="page"/>
+      </w:r>
+    </w:p>
+    <w:p>
+      <w:pPr>
+        <w:pStyle w:val="Ttulo1"/>
+      </w:pPr>
+      <w:r>
+        <w:rPr>
+          <w:color w:val="4D7C8A"/>
+        </w:rPr>
+        <w:lastRenderedPageBreak/>
+        <w:t>MÓDULO INVENTARIO TECNOLÓGICO</w:t>
+      </w:r>
+    </w:p>
+    <w:p>
+      <w:r>
+        <w:t xml:space="preserve">Este módulo permite a la Dirección de Tecnologías </w:t>
+      </w:r>
+      <w:r>
+        <w:t>llevar el control completo del inventario de equipos tecnológicos institucionales: estado físico, custodia (quién tiene cada equipo), mantenimiento preventivo anual y trazabilidad de piezas y repuestos cambiados.</w:t>
+      </w:r>
+    </w:p>
+    <w:p>
+      <w:pPr>
+        <w:pStyle w:val="Ttulo2"/>
+      </w:pPr>
+      <w:bookmarkStart w:id="0" w:name="_GoBack"/>
+      <w:bookmarkEnd w:id="0"/>
+      <w:r>
+        <w:rPr>
+          <w:color w:val="4D7C8A"/>
+        </w:rPr>
+        <w:t>Acceso y roles</w:t>
+      </w:r>
+    </w:p>
+    <w:tbl>
+      <w:tblPr>
+        <w:tblStyle w:val="Tablaconcuadrcula"/>
+        <w:tblW w:w="0" w:type="auto"/>
+        <w:tblLook w:val="04A0" w:firstRow="1" w:lastRow="0" w:firstColumn="1" w:lastColumn="0" w:noHBand="0" w:noVBand="1"/>
+      </w:tblPr>
+      <w:tblGrid>
+        <w:gridCol w:w="4164"/>
+        <w:gridCol w:w="5174"/>
+      </w:tblGrid>
+      <w:tr>
+        <w:tc>
+          <w:tcPr>
+            <w:tcW w:w="4561" w:type="dxa"/>
+          </w:tcPr>
+          <w:p/>
+        </w:tc>
+        <w:tc>
+          <w:tcPr>
+            <w:tcW w:w="4561" w:type="dxa"/>
+          </w:tcPr>
+          <w:p/>
+        </w:tc>
+      </w:tr>
+      <w:tr>
+        <w:tc>
+          <w:tcPr>
+            <w:tcW w:w="3600" w:type="dxa"/>
+            <w:shd w:val="clear" w:color="auto" w:fill="4D7C8A"/>
+          </w:tcPr>
+          <w:p>
+            <w:r>
+              <w:rPr>
+                <w:b/>
+                <w:color w:val="FFFFFF"/>
+                <w:sz w:val="20"/>
+              </w:rPr>
+              <w:t>ROL</w:t>
+            </w:r>
+          </w:p>
+        </w:tc>
+        <w:tc>
+          <w:tcPr>
+            <w:tcW w:w="5760" w:type="dxa"/>
+            <w:shd w:val="clear" w:color="auto" w:fill="4D7C8A"/>
+          </w:tcPr>
+          <w:p>
+            <w:r>
+              <w:rPr>
+                <w:b/>
+                <w:color w:val="FFFFFF"/>
+                <w:sz w:val="20"/>
+              </w:rPr>
+              <w:t>PERMISOS</w:t>
+            </w:r>
+          </w:p>
+        </w:tc>
+      </w:tr>
+      <w:tr>
+        <w:tc>
+          <w:tcPr>
+            <w:tcW w:w="3600" w:type="dxa"/>
+          </w:tcPr>
+          <w:p>
+            <w:r>
+              <w:rPr>
+                <w:sz w:val="20"/>
+              </w:rPr>
+              <w:t>TECNOLOGÍA</w:t>
+            </w:r>
+          </w:p>
+        </w:tc>
+        <w:tc>
+          <w:tcPr>
+            <w:tcW w:w="5760" w:type="dxa"/>
+          </w:tcPr>
+          <w:p>
+            <w:r>
+              <w:rPr>
+                <w:sz w:val="20"/>
+              </w:rPr>
+              <w:t>• Acceso completo a todos los equipos</w:t>
+            </w:r>
+            <w:r>
+              <w:rPr>
+                <w:sz w:val="20"/>
+              </w:rPr>
+              <w:br/>
+              <w:t>• Gestionar custodia (asignar / devolver)</w:t>
+            </w:r>
+            <w:r>
+              <w:rPr>
+                <w:sz w:val="20"/>
+              </w:rPr>
+              <w:br/>
+              <w:t>• Registrar y aprobar mantenimientos</w:t>
+            </w:r>
+            <w:r>
+              <w:rPr>
+                <w:sz w:val="20"/>
+              </w:rPr>
+              <w:br/>
+              <w:t>• Administrar piezas y repuestos</w:t>
+            </w:r>
+            <w:r>
+              <w:rPr>
+                <w:sz w:val="20"/>
+              </w:rPr>
+              <w:br/>
+              <w:t>• Importar inventario desde CSV</w:t>
+            </w:r>
+            <w:r>
+              <w:rPr>
+                <w:sz w:val="20"/>
+              </w:rPr>
+              <w:br/>
+              <w:t>• Configurar tipos de equipo y checklist</w:t>
+            </w:r>
+          </w:p>
+        </w:tc>
+      </w:tr>
+      <w:tr>
+        <w:tc>
+          <w:tcPr>
+            <w:tcW w:w="3600" w:type="dxa"/>
+          </w:tcPr>
+          <w:p>
+            <w:r>
+              <w:rPr>
+                <w:sz w:val="20"/>
+              </w:rPr>
+              <w:t>ADMINISTRADOR</w:t>
+            </w:r>
+          </w:p>
+        </w:tc>
+        <w:tc>
+          <w:tcPr>
+            <w:tcW w:w="5760" w:type="dxa"/>
+          </w:tcPr>
+          <w:p>
+            <w:r>
+              <w:rPr>
+                <w:sz w:val="20"/>
+              </w:rPr>
+              <w:t>Mismos permisos q</w:t>
+            </w:r>
+            <w:r>
+              <w:rPr>
+                <w:sz w:val="20"/>
+              </w:rPr>
+              <w:t>ue el rol Tecnología. Acceso desde el launcher institucional.</w:t>
+            </w:r>
+          </w:p>
+        </w:tc>
+      </w:tr>
+    </w:tbl>
+    <w:p/>
+    <w:tbl>
+      <w:tblPr>
+        <w:tblW w:w="0" w:type="auto"/>
+        <w:tblLook w:val="04A0" w:firstRow="1" w:lastRow="0" w:firstColumn="1" w:lastColumn="0" w:noHBand="0" w:noVBand="1"/>
+      </w:tblPr>
+      <w:tblGrid>
+        <w:gridCol w:w="9122"/>
+      </w:tblGrid>
+      <w:tr>
+        <w:tc>
+          <w:tcPr>
+            <w:tcW w:w="9122" w:type="dxa"/>
+            <w:tcBorders>
+              <w:top w:val="single" w:sz="12" w:space="0" w:color="4D7C8A"/>
+              <w:left w:val="single" w:sz="12" w:space="0" w:color="4D7C8A"/>
+              <w:bottom w:val="single" w:sz="12" w:space="0" w:color="4D7C8A"/>
+              <w:right w:val="single" w:sz="12" w:space="0" w:color="4D7C8A"/>
+            </w:tcBorders>
+            <w:shd w:val="clear" w:color="auto" w:fill="E8F2F5"/>
+          </w:tcPr>
+          <w:p>
+            <w:r>
+              <w:rPr>
+                <w:b/>
+                <w:color w:val="4D7C8A"/>
+                <w:sz w:val="20"/>
+              </w:rPr>
+              <w:t>ℹ</w:t>
+            </w:r>
+            <w:r>
+              <w:rPr>
+                <w:b/>
+                <w:color w:val="4D7C8A"/>
+                <w:sz w:val="20"/>
+              </w:rPr>
+              <w:t>️</w:t>
+            </w:r>
+            <w:r>
+              <w:rPr>
+                <w:b/>
+                <w:color w:val="4D7C8A"/>
+                <w:sz w:val="20"/>
+              </w:rPr>
+              <w:t xml:space="preserve">  Importante:   </w:t>
+            </w:r>
+            <w:r>
+              <w:rPr>
+                <w:sz w:val="20"/>
+              </w:rPr>
+              <w:t>Para asignar el rol Tecnología a un empleado, ir a Administración → Roles.</w:t>
+            </w:r>
+          </w:p>
+        </w:tc>
+      </w:tr>
+    </w:tbl>
+    <w:p/>
+    <w:p>
+      <w:pPr>
+        <w:pStyle w:val="Ttulo2"/>
+      </w:pPr>
+      <w:r>
+        <w:rPr>
+          <w:color w:val="4D7C8A"/>
+        </w:rPr>
+        <w:t>Menú de navegación</w:t>
+      </w:r>
+    </w:p>
+    <w:tbl>
+      <w:tblPr>
+        <w:tblStyle w:val="Tablaconcuadrcula"/>
+        <w:tblW w:w="0" w:type="auto"/>
+        <w:tblLook w:val="04A0" w:firstRow="1" w:lastRow="0" w:firstColumn="1" w:lastColumn="0" w:noHBand="0" w:noVBand="1"/>
+      </w:tblPr>
+      <w:tblGrid>
+        <w:gridCol w:w="4313"/>
+        <w:gridCol w:w="5025"/>
+      </w:tblGrid>
+      <w:tr>
+        <w:tc>
+          <w:tcPr>
+            <w:tcW w:w="4561" w:type="dxa"/>
+          </w:tcPr>
+          <w:p/>
+        </w:tc>
+        <w:tc>
+          <w:tcPr>
+            <w:tcW w:w="4561" w:type="dxa"/>
+          </w:tcPr>
+          <w:p/>
+        </w:tc>
+      </w:tr>
+      <w:tr>
+        <w:tc>
+          <w:tcPr>
+            <w:tcW w:w="4032" w:type="dxa"/>
+            <w:shd w:val="clear" w:color="auto" w:fill="4D7C8A"/>
+          </w:tcPr>
+          <w:p>
+            <w:r>
+              <w:rPr>
+                <w:b/>
+                <w:color w:val="FFFFFF"/>
+                <w:sz w:val="20"/>
+              </w:rPr>
+              <w:t>Opción del menú</w:t>
+            </w:r>
+          </w:p>
+        </w:tc>
+        <w:tc>
+          <w:tcPr>
+            <w:tcW w:w="5328" w:type="dxa"/>
+            <w:shd w:val="clear" w:color="auto" w:fill="4D7C8A"/>
+          </w:tcPr>
+          <w:p>
+            <w:r>
+              <w:rPr>
+                <w:b/>
+                <w:color w:val="FFFFFF"/>
+                <w:sz w:val="20"/>
+              </w:rPr>
+              <w:t>Descripción</w:t>
+            </w:r>
+          </w:p>
+        </w:tc>
+      </w:tr>
+      <w:tr>
+        <w:tc>
+          <w:tcPr>
+            <w:tcW w:w="4032" w:type="dxa"/>
+          </w:tcPr>
+          <w:p>
+            <w:r>
+              <w:rPr>
+                <w:sz w:val="20"/>
+              </w:rPr>
+              <w:t>Inventario de Equipos</w:t>
+            </w:r>
+          </w:p>
+        </w:tc>
+        <w:tc>
+          <w:tcPr>
+            <w:tcW w:w="5328" w:type="dxa"/>
+          </w:tcPr>
+          <w:p>
+            <w:r>
+              <w:rPr>
+                <w:sz w:val="20"/>
+              </w:rPr>
+              <w:t xml:space="preserve">Ver, registrar, asignar </w:t>
+            </w:r>
+            <w:r>
+              <w:rPr>
+                <w:sz w:val="20"/>
+              </w:rPr>
+              <w:t>y gestionar todos los equipos tecnológicos</w:t>
+            </w:r>
+          </w:p>
+        </w:tc>
+      </w:tr>
+      <w:tr>
+        <w:tc>
+          <w:tcPr>
+            <w:tcW w:w="4032" w:type="dxa"/>
+          </w:tcPr>
+          <w:p>
+            <w:r>
+              <w:rPr>
+                <w:sz w:val="20"/>
+              </w:rPr>
+              <w:t>Mantenimiento</w:t>
+            </w:r>
+          </w:p>
+        </w:tc>
+        <w:tc>
+          <w:tcPr>
+            <w:tcW w:w="5328" w:type="dxa"/>
+          </w:tcPr>
+          <w:p>
+            <w:r>
+              <w:rPr>
+                <w:sz w:val="20"/>
+              </w:rPr>
+              <w:t>Registrar mantenimientos preventivos anuales por equipo</w:t>
+            </w:r>
+          </w:p>
+        </w:tc>
+      </w:tr>
+      <w:tr>
+        <w:tc>
+          <w:tcPr>
+            <w:tcW w:w="4032" w:type="dxa"/>
+          </w:tcPr>
+          <w:p>
+            <w:r>
+              <w:rPr>
+                <w:sz w:val="20"/>
+              </w:rPr>
+              <w:t>Piezas y Repuestos</w:t>
+            </w:r>
+          </w:p>
+        </w:tc>
+        <w:tc>
+          <w:tcPr>
+            <w:tcW w:w="5328" w:type="dxa"/>
+          </w:tcPr>
+          <w:p>
+            <w:r>
+              <w:rPr>
+                <w:sz w:val="20"/>
+              </w:rPr>
+              <w:t>Catálogo de piezas entregadas por Bienes e historial de instalación</w:t>
+            </w:r>
+          </w:p>
+        </w:tc>
+      </w:tr>
+      <w:tr>
+        <w:tc>
+          <w:tcPr>
+            <w:tcW w:w="4032" w:type="dxa"/>
+          </w:tcPr>
+          <w:p>
+            <w:r>
+              <w:rPr>
+                <w:sz w:val="20"/>
+              </w:rPr>
+              <w:t>Tipos de Equipo</w:t>
+            </w:r>
+          </w:p>
+        </w:tc>
+        <w:tc>
+          <w:tcPr>
+            <w:tcW w:w="5328" w:type="dxa"/>
+          </w:tcPr>
+          <w:p>
+            <w:r>
+              <w:rPr>
+                <w:sz w:val="20"/>
+              </w:rPr>
+              <w:t xml:space="preserve">Configurar las categorías de equipos </w:t>
+            </w:r>
+            <w:r>
+              <w:rPr>
+                <w:sz w:val="20"/>
+              </w:rPr>
+              <w:t>(Laptop, Impresora, etc.)</w:t>
+            </w:r>
+          </w:p>
+        </w:tc>
+      </w:tr>
+      <w:tr>
+        <w:tc>
+          <w:tcPr>
+            <w:tcW w:w="4032" w:type="dxa"/>
+          </w:tcPr>
+          <w:p>
+            <w:r>
+              <w:rPr>
+                <w:sz w:val="20"/>
+              </w:rPr>
+              <w:t>Actividades de Mantenimiento</w:t>
+            </w:r>
+          </w:p>
+        </w:tc>
+        <w:tc>
+          <w:tcPr>
+            <w:tcW w:w="5328" w:type="dxa"/>
+          </w:tcPr>
+          <w:p>
+            <w:r>
+              <w:rPr>
+                <w:sz w:val="20"/>
+              </w:rPr>
+              <w:t>Configurar el checklist del formulario de mantenimiento</w:t>
+            </w:r>
+          </w:p>
+        </w:tc>
+      </w:tr>
+    </w:tbl>
+    <w:p/>
+    <w:p>
+      <w:pPr>
+        <w:pStyle w:val="Ttulo2"/>
+      </w:pPr>
+      <w:r>
+        <w:rPr>
+          <w:color w:val="4D7C8A"/>
+        </w:rPr>
+        <w:t>Gestión de equipos</w:t>
+      </w:r>
+    </w:p>
+    <w:p>
+      <w:pPr>
+        <w:pStyle w:val="Ttulo3"/>
+      </w:pPr>
+      <w:r>
+        <w:rPr>
+          <w:color w:val="4D7C8A"/>
+        </w:rPr>
+        <w:t>Panel principal — Inventario</w:t>
+      </w:r>
+    </w:p>
+    <w:p>
+      <w:r>
+        <w:t>Al ingresar a Inventario de Equipos se muestran seis tarjetas de resumen en la parte superior.</w:t>
+      </w:r>
+      <w:r>
+        <w:t xml:space="preserve"> Hacer clic en cualquier tarjeta filtra automáticamente la tabla:</w:t>
+      </w:r>
+    </w:p>
+    <w:tbl>
+      <w:tblPr>
+        <w:tblStyle w:val="Tablaconcuadrcula"/>
+        <w:tblW w:w="0" w:type="auto"/>
+        <w:tblLook w:val="04A0" w:firstRow="1" w:lastRow="0" w:firstColumn="1" w:lastColumn="0" w:noHBand="0" w:noVBand="1"/>
+      </w:tblPr>
+      <w:tblGrid>
+        <w:gridCol w:w="3902"/>
+        <w:gridCol w:w="5436"/>
+      </w:tblGrid>
+      <w:tr>
+        <w:tc>
+          <w:tcPr>
+            <w:tcW w:w="4561" w:type="dxa"/>
+          </w:tcPr>
+          <w:p/>
+        </w:tc>
+        <w:tc>
+          <w:tcPr>
+            <w:tcW w:w="4561" w:type="dxa"/>
+          </w:tcPr>
+          <w:p/>
+        </w:tc>
+      </w:tr>
+      <w:tr>
+        <w:tc>
+          <w:tcPr>
+            <w:tcW w:w="2880" w:type="dxa"/>
+            <w:shd w:val="clear" w:color="auto" w:fill="4D7C8A"/>
+          </w:tcPr>
+          <w:p>
+            <w:r>
+              <w:rPr>
+                <w:b/>
+                <w:color w:val="FFFFFF"/>
+                <w:sz w:val="20"/>
+              </w:rPr>
+              <w:t>Tarjeta</w:t>
+            </w:r>
+          </w:p>
+        </w:tc>
+        <w:tc>
+          <w:tcPr>
+            <w:tcW w:w="6480" w:type="dxa"/>
+            <w:shd w:val="clear" w:color="auto" w:fill="4D7C8A"/>
+          </w:tcPr>
+          <w:p>
+            <w:r>
+              <w:rPr>
+                <w:b/>
+                <w:color w:val="FFFFFF"/>
+                <w:sz w:val="20"/>
+              </w:rPr>
+              <w:t>Descripción</w:t>
+            </w:r>
+          </w:p>
+        </w:tc>
+      </w:tr>
+      <w:tr>
+        <w:tc>
+          <w:tcPr>
+            <w:tcW w:w="2880" w:type="dxa"/>
+          </w:tcPr>
+          <w:p>
+            <w:r>
+              <w:rPr>
+                <w:sz w:val="20"/>
+              </w:rPr>
+              <w:t>DISPONIBLE</w:t>
+            </w:r>
+          </w:p>
+        </w:tc>
+        <w:tc>
+          <w:tcPr>
+            <w:tcW w:w="6480" w:type="dxa"/>
+          </w:tcPr>
+          <w:p>
+            <w:r>
+              <w:rPr>
+                <w:sz w:val="20"/>
+              </w:rPr>
+              <w:t>Equipos sin asignar, listos para custodia</w:t>
+            </w:r>
+          </w:p>
+        </w:tc>
+      </w:tr>
+      <w:tr>
+        <w:tc>
+          <w:tcPr>
+            <w:tcW w:w="2880" w:type="dxa"/>
+          </w:tcPr>
+          <w:p>
+            <w:r>
+              <w:rPr>
+                <w:sz w:val="20"/>
+              </w:rPr>
+              <w:t>ASIGNADO</w:t>
+            </w:r>
+          </w:p>
+        </w:tc>
+        <w:tc>
+          <w:tcPr>
+            <w:tcW w:w="6480" w:type="dxa"/>
+          </w:tcPr>
+          <w:p>
+            <w:r>
+              <w:rPr>
+                <w:sz w:val="20"/>
+              </w:rPr>
+              <w:t>Equipos que tienen un custodio activo</w:t>
+            </w:r>
+          </w:p>
+        </w:tc>
+      </w:tr>
+      <w:tr>
+        <w:tc>
+          <w:tcPr>
+            <w:tcW w:w="2880" w:type="dxa"/>
+          </w:tcPr>
+          <w:p>
+            <w:r>
+              <w:rPr>
+                <w:sz w:val="20"/>
+              </w:rPr>
+              <w:t>DAÑADO</w:t>
+            </w:r>
+          </w:p>
+        </w:tc>
+        <w:tc>
+          <w:tcPr>
+            <w:tcW w:w="6480" w:type="dxa"/>
+          </w:tcPr>
+          <w:p>
+            <w:r>
+              <w:rPr>
+                <w:sz w:val="20"/>
+              </w:rPr>
+              <w:t>Equipos devueltos por daño; pendientes de revisión o baja</w:t>
+            </w:r>
+          </w:p>
+        </w:tc>
+      </w:tr>
+      <w:tr>
+        <w:tc>
+          <w:tcPr>
+            <w:tcW w:w="2880" w:type="dxa"/>
+          </w:tcPr>
+          <w:p>
+            <w:r>
+              <w:rPr>
+                <w:sz w:val="20"/>
+              </w:rPr>
+              <w:t>DE BAJA</w:t>
+            </w:r>
+          </w:p>
+        </w:tc>
+        <w:tc>
+          <w:tcPr>
+            <w:tcW w:w="6480" w:type="dxa"/>
+          </w:tcPr>
+          <w:p>
+            <w:r>
+              <w:rPr>
+                <w:sz w:val="20"/>
+              </w:rPr>
+              <w:t>Equipos dados de baja; no se reasignan</w:t>
+            </w:r>
+          </w:p>
+        </w:tc>
+      </w:tr>
+      <w:tr>
+        <w:tc>
+          <w:tcPr>
+            <w:tcW w:w="2880" w:type="dxa"/>
+          </w:tcPr>
+          <w:p>
+            <w:r>
+              <w:rPr>
+                <w:sz w:val="20"/>
+              </w:rPr>
+              <w:t>Vida útil vencida</w:t>
+            </w:r>
+          </w:p>
+        </w:tc>
+        <w:tc>
+          <w:tcPr>
+            <w:tcW w:w="6480" w:type="dxa"/>
+          </w:tcPr>
+          <w:p>
+            <w:r>
+              <w:rPr>
+                <w:sz w:val="20"/>
+              </w:rPr>
+              <w:t>Equipos cuya vida útil (en años) ya expiró — requieren atención</w:t>
+            </w:r>
+          </w:p>
+        </w:tc>
+      </w:tr>
+      <w:tr>
+        <w:tc>
+          <w:tcPr>
+            <w:tcW w:w="2880" w:type="dxa"/>
+          </w:tcPr>
+          <w:p>
+            <w:r>
+              <w:rPr>
+                <w:sz w:val="20"/>
+              </w:rPr>
+              <w:lastRenderedPageBreak/>
+              <w:t>Total</w:t>
+            </w:r>
+          </w:p>
+        </w:tc>
+        <w:tc>
+          <w:tcPr>
+            <w:tcW w:w="6480" w:type="dxa"/>
+          </w:tcPr>
+          <w:p>
+            <w:r>
+              <w:rPr>
+                <w:sz w:val="20"/>
+              </w:rPr>
+              <w:t>Conteo total del inventario</w:t>
+            </w:r>
+          </w:p>
+        </w:tc>
+      </w:tr>
+    </w:tbl>
+    <w:p/>
+    <w:p>
+      <w:pPr>
+        <w:pStyle w:val="Ttulo3"/>
+      </w:pPr>
+      <w:r>
+        <w:rPr>
+          <w:color w:val="4D7C8A"/>
+        </w:rPr>
+        <w:t>Registrar un nuevo equipo</w:t>
+      </w:r>
+    </w:p>
+    <w:p>
+      <w:pPr>
+        <w:pStyle w:val="Listaconnmeros"/>
+      </w:pPr>
+      <w:r>
+        <w:rPr>
+          <w:b/>
+          <w:sz w:val="20"/>
+        </w:rPr>
+        <w:t xml:space="preserve">Clic en Nuevo Equipo </w:t>
+      </w:r>
+      <w:r>
+        <w:rPr>
+          <w:sz w:val="20"/>
+        </w:rPr>
+        <w:t>(botón esquina superior derecha).</w:t>
+      </w:r>
+    </w:p>
+    <w:p>
+      <w:pPr>
+        <w:pStyle w:val="Listaconnmeros"/>
+      </w:pPr>
+      <w:r>
+        <w:rPr>
+          <w:b/>
+          <w:sz w:val="20"/>
+        </w:rPr>
+        <w:t xml:space="preserve">Completar los campos: </w:t>
+      </w:r>
+      <w:r>
+        <w:rPr>
+          <w:sz w:val="20"/>
+        </w:rPr>
+        <w:t>Código del bien, Tipo de equipo, Marca, Modelo, Serie, Descripción, Condición (Bueno / Regular / Malo), Fecha de ingreso y Vida útil (años).</w:t>
+      </w:r>
+    </w:p>
+    <w:p>
+      <w:pPr>
+        <w:pStyle w:val="Listaconnmeros"/>
+      </w:pPr>
+      <w:r>
+        <w:rPr>
+          <w:b/>
+          <w:sz w:val="20"/>
+        </w:rPr>
+        <w:t xml:space="preserve">Clic en Guardar. </w:t>
+      </w:r>
+      <w:r>
+        <w:rPr>
+          <w:sz w:val="20"/>
+        </w:rPr>
+        <w:t>El equipo queda en estado DISPONIBLE.</w:t>
+      </w:r>
+    </w:p>
+    <w:p/>
+    <w:p>
+      <w:pPr>
+        <w:pStyle w:val="Ttulo3"/>
+      </w:pPr>
+      <w:r>
+        <w:rPr>
+          <w:color w:val="4D7C8A"/>
+        </w:rPr>
+        <w:t>Importar inventario desde CSV</w:t>
+      </w:r>
+    </w:p>
+    <w:p>
+      <w:r>
+        <w:t xml:space="preserve">Para </w:t>
+      </w:r>
+      <w:r>
+        <w:t>cargar múltiples equipos a la vez, usar el botón Importar CSV. Columnas requeridas:</w:t>
+      </w:r>
+    </w:p>
+    <w:p>
+      <w:pPr>
+        <w:ind w:left="432"/>
+      </w:pPr>
+      <w:r>
+        <w:rPr>
+          <w:rFonts w:ascii="Courier New" w:hAnsi="Courier New"/>
+          <w:sz w:val="18"/>
+        </w:rPr>
+        <w:t>codigo_bien  |  tipo_equipo  |  marca  |  modelo  |  descripcion  |  serie  |  estado  |  fecha_ingreso  |  vida_util_anios</w:t>
+      </w:r>
+    </w:p>
+    <w:tbl>
+      <w:tblPr>
+        <w:tblW w:w="0" w:type="auto"/>
+        <w:tblLook w:val="04A0" w:firstRow="1" w:lastRow="0" w:firstColumn="1" w:lastColumn="0" w:noHBand="0" w:noVBand="1"/>
+      </w:tblPr>
+      <w:tblGrid>
+        <w:gridCol w:w="9122"/>
+      </w:tblGrid>
+      <w:tr>
+        <w:tc>
+          <w:tcPr>
+            <w:tcW w:w="9122" w:type="dxa"/>
+            <w:tcBorders>
+              <w:top w:val="single" w:sz="12" w:space="0" w:color="4D7C8A"/>
+              <w:left w:val="single" w:sz="12" w:space="0" w:color="4D7C8A"/>
+              <w:bottom w:val="single" w:sz="12" w:space="0" w:color="4D7C8A"/>
+              <w:right w:val="single" w:sz="12" w:space="0" w:color="4D7C8A"/>
+            </w:tcBorders>
+            <w:shd w:val="clear" w:color="auto" w:fill="E8F2F5"/>
+          </w:tcPr>
+          <w:p>
+            <w:r>
+              <w:rPr>
+                <w:b/>
+                <w:color w:val="4D7C8A"/>
+                <w:sz w:val="20"/>
+              </w:rPr>
+              <w:t>📋</w:t>
+            </w:r>
+            <w:r>
+              <w:rPr>
+                <w:b/>
+                <w:color w:val="4D7C8A"/>
+                <w:sz w:val="20"/>
+              </w:rPr>
+              <w:t xml:space="preserve">  Nota:   </w:t>
+            </w:r>
+            <w:r>
+              <w:rPr>
+                <w:sz w:val="20"/>
+              </w:rPr>
+              <w:t>El sistema acepta archivos separados</w:t>
+            </w:r>
+            <w:r>
+              <w:rPr>
+                <w:sz w:val="20"/>
+              </w:rPr>
+              <w:t xml:space="preserve"> por coma (,) o punto y coma (;). Las fechas pueden estar en formato DD/MM/AAAA o AAAA-MM-DD. Si hay un error en cualquier fila, no se importa nada y se muestran todos los errores juntos.</w:t>
+            </w:r>
+          </w:p>
+        </w:tc>
+      </w:tr>
+    </w:tbl>
+    <w:p/>
+    <w:p>
+      <w:pPr>
+        <w:pStyle w:val="Ttulo2"/>
+      </w:pPr>
+      <w:r>
+        <w:rPr>
+          <w:color w:val="4D7C8A"/>
+        </w:rPr>
+        <w:t>Custodia de equipos</w:t>
+      </w:r>
+    </w:p>
+    <w:p>
+      <w:pPr>
+        <w:pStyle w:val="Ttulo3"/>
+      </w:pPr>
+      <w:r>
+        <w:rPr>
+          <w:color w:val="4D7C8A"/>
+        </w:rPr>
+        <w:t>Asignar un equipo</w:t>
+      </w:r>
+    </w:p>
+    <w:p>
+      <w:r>
+        <w:t>Solo se puede asignar un equ</w:t>
+      </w:r>
+      <w:r>
+        <w:t>ipo con estado DISPONIBLE.</w:t>
+      </w:r>
+    </w:p>
+    <w:p>
+      <w:pPr>
+        <w:pStyle w:val="Listaconnmeros"/>
+      </w:pPr>
+      <w:r>
+        <w:rPr>
+          <w:b/>
+          <w:sz w:val="20"/>
+        </w:rPr>
+        <w:t xml:space="preserve">En la fila del equipo, </w:t>
+      </w:r>
+      <w:r>
+        <w:rPr>
+          <w:sz w:val="20"/>
+        </w:rPr>
+        <w:t>clic en el botón Asignar.</w:t>
+      </w:r>
+    </w:p>
+    <w:p>
+      <w:pPr>
+        <w:pStyle w:val="Listaconnmeros"/>
+      </w:pPr>
+      <w:r>
+        <w:rPr>
+          <w:b/>
+          <w:sz w:val="20"/>
+        </w:rPr>
+        <w:t xml:space="preserve">En el modal, </w:t>
+      </w:r>
+      <w:r>
+        <w:rPr>
+          <w:sz w:val="20"/>
+        </w:rPr>
+        <w:t>buscar al empleado escribiendo su nombre o cédula.</w:t>
+      </w:r>
+    </w:p>
+    <w:p>
+      <w:pPr>
+        <w:pStyle w:val="Listaconnmeros"/>
+      </w:pPr>
+      <w:r>
+        <w:rPr>
+          <w:b/>
+          <w:sz w:val="20"/>
+        </w:rPr>
+        <w:t xml:space="preserve">Seleccionar el empleado </w:t>
+      </w:r>
+      <w:r>
+        <w:rPr>
+          <w:sz w:val="20"/>
+        </w:rPr>
+        <w:t>y registrar la fecha de asignación.</w:t>
+      </w:r>
+    </w:p>
+    <w:p>
+      <w:pPr>
+        <w:pStyle w:val="Listaconnmeros"/>
+      </w:pPr>
+      <w:r>
+        <w:rPr>
+          <w:b/>
+          <w:sz w:val="20"/>
+        </w:rPr>
+        <w:t xml:space="preserve">Clic en Guardar asignación. </w:t>
+      </w:r>
+      <w:r>
+        <w:rPr>
+          <w:sz w:val="20"/>
+        </w:rPr>
+        <w:t xml:space="preserve">El equipo pasa a estado </w:t>
+      </w:r>
+      <w:r>
+        <w:rPr>
+          <w:sz w:val="20"/>
+        </w:rPr>
+        <w:t>ASIGNADO y muestra el nombre del custodio.</w:t>
+      </w:r>
+    </w:p>
+    <w:p/>
+    <w:p>
+      <w:pPr>
+        <w:pStyle w:val="Ttulo3"/>
+      </w:pPr>
+      <w:r>
+        <w:rPr>
+          <w:color w:val="4D7C8A"/>
+        </w:rPr>
+        <w:t>Devolver un equipo</w:t>
+      </w:r>
+    </w:p>
+    <w:p>
+      <w:r>
+        <w:t>Solo se puede devolver un equipo con estado ASIGNADO.</w:t>
+      </w:r>
+    </w:p>
+    <w:p>
+      <w:pPr>
+        <w:pStyle w:val="Listaconnmeros"/>
+      </w:pPr>
+      <w:r>
+        <w:rPr>
+          <w:b/>
+          <w:sz w:val="20"/>
+        </w:rPr>
+        <w:t xml:space="preserve">Clic en Devolver </w:t>
+      </w:r>
+      <w:r>
+        <w:rPr>
+          <w:sz w:val="20"/>
+        </w:rPr>
+        <w:t>en la fila del equipo.</w:t>
+      </w:r>
+    </w:p>
+    <w:p>
+      <w:pPr>
+        <w:pStyle w:val="Listaconnmeros"/>
+      </w:pPr>
+      <w:r>
+        <w:rPr>
+          <w:b/>
+          <w:sz w:val="20"/>
+        </w:rPr>
+        <w:t xml:space="preserve">Registrar la fecha de devolución </w:t>
+      </w:r>
+      <w:r>
+        <w:rPr>
+          <w:sz w:val="20"/>
+        </w:rPr>
+        <w:t>(puede ser retroactiva).</w:t>
+      </w:r>
+    </w:p>
+    <w:p>
+      <w:pPr>
+        <w:pStyle w:val="Listaconnmeros"/>
+      </w:pPr>
+      <w:r>
+        <w:rPr>
+          <w:b/>
+          <w:sz w:val="20"/>
+        </w:rPr>
+        <w:t xml:space="preserve">Seleccionar el motivo: </w:t>
+      </w:r>
+      <w:r>
+        <w:rPr>
+          <w:sz w:val="20"/>
+        </w:rPr>
+        <w:t>Reasignación / Sal</w:t>
+      </w:r>
+      <w:r>
+        <w:rPr>
+          <w:sz w:val="20"/>
+        </w:rPr>
+        <w:t>ida del empleado / Daño / Otro.</w:t>
+      </w:r>
+    </w:p>
+    <w:p>
+      <w:pPr>
+        <w:pStyle w:val="Listaconnmeros"/>
+      </w:pPr>
+      <w:r>
+        <w:rPr>
+          <w:b/>
+          <w:sz w:val="20"/>
+        </w:rPr>
+        <w:t xml:space="preserve">Agregar observación </w:t>
+      </w:r>
+      <w:r>
+        <w:rPr>
+          <w:sz w:val="20"/>
+        </w:rPr>
+        <w:t>si es necesario y clic en Guardar.</w:t>
+      </w:r>
+    </w:p>
+    <w:p/>
+    <w:tbl>
+      <w:tblPr>
+        <w:tblW w:w="0" w:type="auto"/>
+        <w:tblLook w:val="04A0" w:firstRow="1" w:lastRow="0" w:firstColumn="1" w:lastColumn="0" w:noHBand="0" w:noVBand="1"/>
+      </w:tblPr>
+      <w:tblGrid>
+        <w:gridCol w:w="9122"/>
+      </w:tblGrid>
+      <w:tr>
+        <w:tc>
+          <w:tcPr>
+            <w:tcW w:w="9122" w:type="dxa"/>
+            <w:tcBorders>
+              <w:top w:val="single" w:sz="12" w:space="0" w:color="92400E"/>
+              <w:left w:val="single" w:sz="12" w:space="0" w:color="92400E"/>
+              <w:bottom w:val="single" w:sz="12" w:space="0" w:color="92400E"/>
+              <w:right w:val="single" w:sz="12" w:space="0" w:color="92400E"/>
+            </w:tcBorders>
+            <w:shd w:val="clear" w:color="auto" w:fill="FEF3C7"/>
+          </w:tcPr>
+          <w:p>
+            <w:r>
+              <w:rPr>
+                <w:b/>
+                <w:color w:val="92400E"/>
+                <w:sz w:val="20"/>
+              </w:rPr>
+              <w:t>⚠</w:t>
+            </w:r>
+            <w:r>
+              <w:rPr>
+                <w:b/>
+                <w:color w:val="92400E"/>
+                <w:sz w:val="20"/>
+              </w:rPr>
+              <w:t>️</w:t>
+            </w:r>
+            <w:r>
+              <w:rPr>
+                <w:b/>
+                <w:color w:val="92400E"/>
+                <w:sz w:val="20"/>
+              </w:rPr>
+              <w:t xml:space="preserve">  Motivo Daño:   </w:t>
+            </w:r>
+            <w:r>
+              <w:rPr>
+                <w:sz w:val="20"/>
+              </w:rPr>
+              <w:t>Cuando se selecciona motivo Daño, el equipo cambia automáticamente al estado DAÑADO en lugar de volver a Disponible.</w:t>
+            </w:r>
+          </w:p>
+        </w:tc>
+      </w:tr>
+    </w:tbl>
+    <w:p/>
+    <w:p>
+      <w:pPr>
+        <w:pStyle w:val="Ttulo3"/>
+      </w:pPr>
+      <w:r>
+        <w:rPr>
+          <w:color w:val="4D7C8A"/>
+        </w:rPr>
+        <w:t>Historial de custodia</w:t>
+      </w:r>
+    </w:p>
+    <w:p>
+      <w:r>
+        <w:t>El botón</w:t>
+      </w:r>
+      <w:r>
+        <w:t xml:space="preserve"> Historial (columna de acciones) abre una línea de tiempo completa de todas las asignaciones del equipo: custodio, fechas de asignación y devolución, y motivo de cada devolución. La asignación activa se muestra con un punto verde; las históricas con punto </w:t>
+      </w:r>
+      <w:r>
+        <w:t>gris.</w:t>
+      </w:r>
+    </w:p>
+    <w:p/>
+    <w:p>
+      <w:pPr>
+        <w:pStyle w:val="Ttulo2"/>
+      </w:pPr>
+      <w:r>
+        <w:rPr>
+          <w:color w:val="4D7C8A"/>
+        </w:rPr>
+        <w:t>Mantenimiento</w:t>
+      </w:r>
+    </w:p>
+    <w:p>
+      <w:r>
+        <w:t>El mantenimiento preventivo se realiza una vez al año por equipo. La vista tiene dos pestañas: Pendientes {año} (equipos sin mantenimiento en el año actual) y Realizados {año} (equipos con mantenimiento ya registrado). El gráfico de do</w:t>
+      </w:r>
+      <w:r>
+        <w:t>na muestra el porcentaje de avance anual.</w:t>
+      </w:r>
+    </w:p>
+    <w:p/>
+    <w:p>
+      <w:pPr>
+        <w:pStyle w:val="Ttulo3"/>
+      </w:pPr>
+      <w:r>
+        <w:rPr>
+          <w:color w:val="4D7C8A"/>
+        </w:rPr>
+        <w:t>Mantenimiento interno (individual)</w:t>
+      </w:r>
+    </w:p>
+    <w:p>
+      <w:r>
+        <w:t>Lo ejecuta un técnico de la Dirección de Tecnología directamente en el equipo.</w:t>
+      </w:r>
+    </w:p>
+    <w:p>
+      <w:pPr>
+        <w:pStyle w:val="Listaconnmeros"/>
+      </w:pPr>
+      <w:r>
+        <w:rPr>
+          <w:b/>
+          <w:sz w:val="20"/>
+        </w:rPr>
+        <w:t xml:space="preserve">En la pestaña Pendientes, </w:t>
+      </w:r>
+      <w:r>
+        <w:rPr>
+          <w:sz w:val="20"/>
+        </w:rPr>
+        <w:t>ubicar el equipo y clic en Registrar mantenimiento.</w:t>
+      </w:r>
+    </w:p>
+    <w:p>
+      <w:pPr>
+        <w:pStyle w:val="Listaconnmeros"/>
+      </w:pPr>
+      <w:r>
+        <w:rPr>
+          <w:b/>
+          <w:sz w:val="20"/>
+        </w:rPr>
+        <w:t xml:space="preserve">Ingresar la fecha, </w:t>
+      </w:r>
+      <w:r>
+        <w:rPr>
+          <w:sz w:val="20"/>
+        </w:rPr>
+        <w:t>hora de inicio y hora de fin del trabajo.</w:t>
+      </w:r>
+    </w:p>
+    <w:p>
+      <w:pPr>
+        <w:pStyle w:val="Listaconnmeros"/>
+      </w:pPr>
+      <w:r>
+        <w:rPr>
+          <w:b/>
+          <w:sz w:val="20"/>
+        </w:rPr>
+        <w:t xml:space="preserve">Completar el checklist </w:t>
+      </w:r>
+      <w:r>
+        <w:rPr>
+          <w:sz w:val="20"/>
+        </w:rPr>
+        <w:t>marcando Sí / No para cada actividad (10 ítems). El técnico y el custodio se capturan automáticamente.</w:t>
+      </w:r>
+    </w:p>
+    <w:p>
+      <w:pPr>
+        <w:pStyle w:val="Listaconnmeros"/>
+      </w:pPr>
+      <w:r>
+        <w:rPr>
+          <w:b/>
+          <w:sz w:val="20"/>
+        </w:rPr>
+        <w:t xml:space="preserve">Si se instalaron piezas, </w:t>
+      </w:r>
+      <w:r>
+        <w:rPr>
+          <w:sz w:val="20"/>
+        </w:rPr>
+        <w:t>agregarlas en la sección Piezas Cambiadas.</w:t>
+      </w:r>
+    </w:p>
+    <w:p>
+      <w:pPr>
+        <w:pStyle w:val="Listaconnmeros"/>
+      </w:pPr>
+      <w:r>
+        <w:rPr>
+          <w:b/>
+          <w:sz w:val="20"/>
+        </w:rPr>
+        <w:t xml:space="preserve">Clic en Guardar. </w:t>
+      </w:r>
+      <w:r>
+        <w:rPr>
+          <w:sz w:val="20"/>
+        </w:rPr>
+        <w:t xml:space="preserve">Se </w:t>
+      </w:r>
+      <w:r>
+        <w:rPr>
+          <w:sz w:val="20"/>
+        </w:rPr>
+        <w:t>genera el acta de mantenimiento en PDF con checklist y firmas.</w:t>
+      </w:r>
+    </w:p>
+    <w:p>
+      <w:pPr>
+        <w:pStyle w:val="Listaconnmeros"/>
+      </w:pPr>
+      <w:r>
+        <w:rPr>
+          <w:b/>
+          <w:sz w:val="20"/>
+        </w:rPr>
+        <w:t xml:space="preserve">Imprimir el acta, obtener firmas físicas </w:t>
+      </w:r>
+      <w:r>
+        <w:rPr>
+          <w:sz w:val="20"/>
+        </w:rPr>
+        <w:t>y subir el PDF firmado con el botón Subir Firmado.</w:t>
+      </w:r>
+    </w:p>
+    <w:p/>
+    <w:p>
+      <w:pPr>
+        <w:pStyle w:val="Ttulo3"/>
+      </w:pPr>
+      <w:r>
+        <w:rPr>
+          <w:color w:val="4D7C8A"/>
+        </w:rPr>
+        <w:t>Checklist de mantenimiento (10 ítems estándar)</w:t>
+      </w:r>
+    </w:p>
+    <w:p>
+      <w:pPr>
+        <w:pStyle w:val="Listaconvietas"/>
+      </w:pPr>
+      <w:r>
+        <w:rPr>
+          <w:sz w:val="20"/>
+        </w:rPr>
+        <w:t>Ingreso al equipo</w:t>
+      </w:r>
+    </w:p>
+    <w:p>
+      <w:pPr>
+        <w:pStyle w:val="Listaconvietas"/>
+      </w:pPr>
+      <w:r>
+        <w:rPr>
+          <w:sz w:val="20"/>
+        </w:rPr>
+        <w:t>Limpieza interna del equipo</w:t>
+      </w:r>
+    </w:p>
+    <w:p>
+      <w:pPr>
+        <w:pStyle w:val="Listaconvietas"/>
+      </w:pPr>
+      <w:r>
+        <w:rPr>
+          <w:sz w:val="20"/>
+        </w:rPr>
+        <w:t>Limpieza externa del equipo</w:t>
+      </w:r>
+    </w:p>
+    <w:p>
+      <w:pPr>
+        <w:pStyle w:val="Listaconvietas"/>
+      </w:pPr>
+      <w:r>
+        <w:rPr>
+          <w:sz w:val="20"/>
+        </w:rPr>
+        <w:t>Borrado de archivos temporales</w:t>
+      </w:r>
+    </w:p>
+    <w:p>
+      <w:pPr>
+        <w:pStyle w:val="Listaconvietas"/>
+      </w:pPr>
+      <w:r>
+        <w:rPr>
+          <w:sz w:val="20"/>
+        </w:rPr>
+        <w:t>Ingreso al equipo por la IP</w:t>
+      </w:r>
+    </w:p>
+    <w:p>
+      <w:pPr>
+        <w:pStyle w:val="Listaconvietas"/>
+      </w:pPr>
+      <w:r>
+        <w:rPr>
+          <w:sz w:val="20"/>
+        </w:rPr>
+        <w:t>Actualización del antivirus</w:t>
+      </w:r>
+    </w:p>
+    <w:p>
+      <w:pPr>
+        <w:pStyle w:val="Listaconvietas"/>
+      </w:pPr>
+      <w:r>
+        <w:rPr>
+          <w:sz w:val="20"/>
+        </w:rPr>
+        <w:t>Formateo del equipo</w:t>
+      </w:r>
+    </w:p>
+    <w:p>
+      <w:pPr>
+        <w:pStyle w:val="Listaconvietas"/>
+      </w:pPr>
+      <w:r>
+        <w:rPr>
+          <w:sz w:val="20"/>
+        </w:rPr>
+        <w:t>Respaldo carpeta Escritorio</w:t>
+      </w:r>
+    </w:p>
+    <w:p>
+      <w:pPr>
+        <w:pStyle w:val="Listaconvietas"/>
+      </w:pPr>
+      <w:r>
+        <w:rPr>
+          <w:sz w:val="20"/>
+        </w:rPr>
+        <w:t>Respaldo carpeta Mis documentos</w:t>
+      </w:r>
+    </w:p>
+    <w:p>
+      <w:pPr>
+        <w:pStyle w:val="Listaconvietas"/>
+      </w:pPr>
+      <w:r>
+        <w:rPr>
+          <w:sz w:val="20"/>
+        </w:rPr>
+        <w:t>Respaldo correo electrónico institucional (PST)</w:t>
+      </w:r>
+    </w:p>
+    <w:p/>
+    <w:p>
+      <w:pPr>
+        <w:pStyle w:val="Ttulo3"/>
+      </w:pPr>
+      <w:r>
+        <w:rPr>
+          <w:color w:val="4D7C8A"/>
+        </w:rPr>
+        <w:lastRenderedPageBreak/>
+        <w:t>Mantenimient</w:t>
+      </w:r>
+      <w:r>
+        <w:rPr>
+          <w:color w:val="4D7C8A"/>
+        </w:rPr>
+        <w:t>o externo (por proveedor, en lote)</w:t>
+      </w:r>
+    </w:p>
+    <w:p>
+      <w:r>
+        <w:t>Para equipos que atiende un proveedor externo bajo una orden de compra (por ejemplo infraestructura de Data Center o equipos de videovigilancia). El proveedor atiende todos los equipos de una categoría en una sola interve</w:t>
+      </w:r>
+      <w:r>
+        <w:t>nción.</w:t>
+      </w:r>
+    </w:p>
+    <w:p>
+      <w:pPr>
+        <w:pStyle w:val="Listaconnmeros"/>
+      </w:pPr>
+      <w:r>
+        <w:rPr>
+          <w:b/>
+          <w:sz w:val="20"/>
+        </w:rPr>
+        <w:t xml:space="preserve">En la pestaña Pendientes, </w:t>
+      </w:r>
+      <w:r>
+        <w:rPr>
+          <w:sz w:val="20"/>
+        </w:rPr>
+        <w:t>clic en Registrar mantenimiento externo.</w:t>
+      </w:r>
+    </w:p>
+    <w:p>
+      <w:pPr>
+        <w:pStyle w:val="Listaconnmeros"/>
+      </w:pPr>
+      <w:r>
+        <w:rPr>
+          <w:b/>
+          <w:sz w:val="20"/>
+        </w:rPr>
+        <w:t xml:space="preserve">Seleccionar: </w:t>
+      </w:r>
+      <w:r>
+        <w:rPr>
+          <w:sz w:val="20"/>
+        </w:rPr>
+        <w:t>Categoría de equipo, Fecha, Proveedor, Proceso de contratación y N.° de orden de compra.</w:t>
+      </w:r>
+    </w:p>
+    <w:p>
+      <w:pPr>
+        <w:pStyle w:val="Listaconnmeros"/>
+      </w:pPr>
+      <w:r>
+        <w:rPr>
+          <w:b/>
+          <w:sz w:val="20"/>
+        </w:rPr>
+        <w:t xml:space="preserve">Clic en Guardar. </w:t>
+      </w:r>
+      <w:r>
+        <w:rPr>
+          <w:sz w:val="20"/>
+        </w:rPr>
+        <w:t xml:space="preserve">El sistema registra el mantenimiento para todos los equipos de </w:t>
+      </w:r>
+      <w:r>
+        <w:rPr>
+          <w:sz w:val="20"/>
+        </w:rPr>
+        <w:t>esa categoría que no lo tenían en el año y genera el acta grupal en PDF.</w:t>
+      </w:r>
+    </w:p>
+    <w:p/>
+    <w:tbl>
+      <w:tblPr>
+        <w:tblW w:w="0" w:type="auto"/>
+        <w:tblLook w:val="04A0" w:firstRow="1" w:lastRow="0" w:firstColumn="1" w:lastColumn="0" w:noHBand="0" w:noVBand="1"/>
+      </w:tblPr>
+      <w:tblGrid>
+        <w:gridCol w:w="9122"/>
+      </w:tblGrid>
+      <w:tr>
+        <w:tc>
+          <w:tcPr>
+            <w:tcW w:w="9122" w:type="dxa"/>
+            <w:tcBorders>
+              <w:top w:val="single" w:sz="12" w:space="0" w:color="4D7C8A"/>
+              <w:left w:val="single" w:sz="12" w:space="0" w:color="4D7C8A"/>
+              <w:bottom w:val="single" w:sz="12" w:space="0" w:color="4D7C8A"/>
+              <w:right w:val="single" w:sz="12" w:space="0" w:color="4D7C8A"/>
+            </w:tcBorders>
+            <w:shd w:val="clear" w:color="auto" w:fill="E8F2F5"/>
+          </w:tcPr>
+          <w:p>
+            <w:r>
+              <w:rPr>
+                <w:b/>
+                <w:color w:val="4D7C8A"/>
+                <w:sz w:val="20"/>
+              </w:rPr>
+              <w:t>ℹ</w:t>
+            </w:r>
+            <w:r>
+              <w:rPr>
+                <w:b/>
+                <w:color w:val="4D7C8A"/>
+                <w:sz w:val="20"/>
+              </w:rPr>
+              <w:t>️</w:t>
+            </w:r>
+            <w:r>
+              <w:rPr>
+                <w:b/>
+                <w:color w:val="4D7C8A"/>
+                <w:sz w:val="20"/>
+              </w:rPr>
+              <w:t xml:space="preserve">  En la pestaña Realizados:   </w:t>
+            </w:r>
+            <w:r>
+              <w:rPr>
+                <w:sz w:val="20"/>
+              </w:rPr>
+              <w:t>Los mantenimientos externos se agrupan en una sola tarjeta con etiqueta EXTERNO mostrando el proveedor, proceso y cantidad de equipos. Los internos se</w:t>
+            </w:r>
+            <w:r>
+              <w:rPr>
+                <w:sz w:val="20"/>
+              </w:rPr>
+              <w:t xml:space="preserve"> muestran uno por uno con etiqueta INTERNO.</w:t>
+            </w:r>
+          </w:p>
+        </w:tc>
+      </w:tr>
+    </w:tbl>
+    <w:p/>
+    <w:p>
+      <w:pPr>
+        <w:pStyle w:val="Ttulo2"/>
+      </w:pPr>
+      <w:r>
+        <w:rPr>
+          <w:color w:val="4D7C8A"/>
+        </w:rPr>
+        <w:t>Piezas y repuestos</w:t>
+      </w:r>
+    </w:p>
+    <w:p>
+      <w:r>
+        <w:t xml:space="preserve">Registra las piezas (discos, memorias RAM, fuentes de poder, etc.) que la Unidad de Bienes entrega a Tecnología para instalación en equipos. Tecnología no tiene bodega propia — las piezas </w:t>
+      </w:r>
+      <w:r>
+        <w:t>llegan ya codificadas desde Bienes.</w:t>
+      </w:r>
+    </w:p>
+    <w:p/>
+    <w:p>
+      <w:pPr>
+        <w:pStyle w:val="Ttulo3"/>
+      </w:pPr>
+      <w:r>
+        <w:rPr>
+          <w:color w:val="4D7C8A"/>
+        </w:rPr>
+        <w:t>Ciclo de vida de una pieza</w:t>
+      </w:r>
+    </w:p>
+    <w:p>
+      <w:r>
+        <w:rPr>
+          <w:color w:val="4D7C8A"/>
+          <w:sz w:val="20"/>
+        </w:rPr>
+        <w:t>DISPONIBLE (entregada por Bienes)  →  INSTALADA (en un equipo)  →  DISPONIBLE (retirada, reutilizable)  o  DE BAJA (retirada por daño)</w:t>
+      </w:r>
+    </w:p>
+    <w:p/>
+    <w:p>
+      <w:pPr>
+        <w:pStyle w:val="Ttulo3"/>
+      </w:pPr>
+      <w:r>
+        <w:rPr>
+          <w:color w:val="4D7C8A"/>
+        </w:rPr>
+        <w:t>Registrar una nueva pieza</w:t>
+      </w:r>
+    </w:p>
+    <w:p>
+      <w:pPr>
+        <w:pStyle w:val="Listaconnmeros"/>
+      </w:pPr>
+      <w:r>
+        <w:rPr>
+          <w:sz w:val="20"/>
+        </w:rPr>
+        <w:t>En Piezas y Repuestos, clic en</w:t>
+      </w:r>
+      <w:r>
+        <w:rPr>
+          <w:sz w:val="20"/>
+        </w:rPr>
+        <w:t xml:space="preserve"> Nueva Pieza.</w:t>
+      </w:r>
+    </w:p>
+    <w:p>
+      <w:pPr>
+        <w:pStyle w:val="Listaconnmeros"/>
+      </w:pPr>
+      <w:r>
+        <w:rPr>
+          <w:b/>
+          <w:sz w:val="20"/>
+        </w:rPr>
+        <w:t xml:space="preserve">Completar: </w:t>
+      </w:r>
+      <w:r>
+        <w:rPr>
+          <w:sz w:val="20"/>
+        </w:rPr>
+        <w:t>Descripción (obligatoria), Código y Serie (opcionales) y Fecha de entrega de Bienes (obligatoria — fecha en que Bienes entregó la pieza a Tecnología).</w:t>
+      </w:r>
+    </w:p>
+    <w:p>
+      <w:pPr>
+        <w:pStyle w:val="Listaconnmeros"/>
+      </w:pPr>
+      <w:r>
+        <w:rPr>
+          <w:b/>
+          <w:sz w:val="20"/>
+        </w:rPr>
+        <w:t xml:space="preserve">Clic en Guardar. </w:t>
+      </w:r>
+      <w:r>
+        <w:rPr>
+          <w:sz w:val="20"/>
+        </w:rPr>
+        <w:t>La pieza queda en estado DISPONIBLE.</w:t>
+      </w:r>
+    </w:p>
+    <w:p/>
+    <w:p>
+      <w:pPr>
+        <w:pStyle w:val="Ttulo3"/>
+      </w:pPr>
+      <w:r>
+        <w:rPr>
+          <w:color w:val="4D7C8A"/>
+        </w:rPr>
+        <w:t>Instalar y retirar piezas</w:t>
+      </w:r>
+    </w:p>
+    <w:p>
+      <w:r>
+        <w:t>Hay dos formas de instalar una pieza:</w:t>
+      </w:r>
+    </w:p>
+    <w:p>
+      <w:pPr>
+        <w:pStyle w:val="Listaconvietas"/>
+      </w:pPr>
+      <w:r>
+        <w:rPr>
+          <w:b/>
+          <w:sz w:val="20"/>
+        </w:rPr>
+        <w:t xml:space="preserve">Desde Piezas y Repuestos: </w:t>
+      </w:r>
+      <w:r>
+        <w:rPr>
+          <w:sz w:val="20"/>
+        </w:rPr>
+        <w:t>buscar la pieza → botón Instalar → buscar el equipo → Guardar.</w:t>
+      </w:r>
+    </w:p>
+    <w:p>
+      <w:pPr>
+        <w:pStyle w:val="Listaconvietas"/>
+      </w:pPr>
+      <w:r>
+        <w:rPr>
+          <w:b/>
+          <w:sz w:val="20"/>
+        </w:rPr>
+        <w:t xml:space="preserve">Desde el formulario de Mantenimiento: </w:t>
+      </w:r>
+      <w:r>
+        <w:rPr>
+          <w:sz w:val="20"/>
+        </w:rPr>
+        <w:t>sección "Piezas Cambiadas", buscar piezas disponibles o crear una nueva al vuelo. Al guard</w:t>
+      </w:r>
+      <w:r>
+        <w:rPr>
+          <w:sz w:val="20"/>
+        </w:rPr>
+        <w:t>ar el mantenimiento, las piezas se instalan automáticamente.</w:t>
+      </w:r>
+    </w:p>
+    <w:p/>
+    <w:p>
+      <w:r>
+        <w:lastRenderedPageBreak/>
+        <w:t>Para retirar una pieza instalada, usar el botón Retirar en la fila de la pieza. La pieza vuelve a estado DISPONIBLE o se puede marcar como DE BAJA si está dañada.</w:t>
+      </w:r>
+    </w:p>
+    <w:p/>
+    <w:p>
+      <w:pPr>
+        <w:pStyle w:val="Ttulo3"/>
+      </w:pPr>
+      <w:r>
+        <w:rPr>
+          <w:color w:val="4D7C8A"/>
+        </w:rPr>
+        <w:t>Historial de una pieza</w:t>
+      </w:r>
+    </w:p>
+    <w:p>
+      <w:r>
+        <w:t>El botó</w:t>
+      </w:r>
+      <w:r>
+        <w:t>n Historial muestra la línea de tiempo de todos los equipos en los que ha estado instalada la pieza, con fechas y el mantenimiento vinculado (si aplica).</w:t>
+      </w:r>
+    </w:p>
+    <w:p/>
+    <w:p>
+      <w:pPr>
+        <w:pStyle w:val="Ttulo2"/>
+      </w:pPr>
+      <w:r>
+        <w:rPr>
+          <w:color w:val="4D7C8A"/>
+        </w:rPr>
+        <w:t>Configuración</w:t>
+      </w:r>
+    </w:p>
+    <w:p>
+      <w:pPr>
+        <w:pStyle w:val="Ttulo3"/>
+      </w:pPr>
+      <w:r>
+        <w:rPr>
+          <w:color w:val="4D7C8A"/>
+        </w:rPr>
+        <w:t>Tipos de equipo</w:t>
+      </w:r>
+    </w:p>
+    <w:p>
+      <w:r>
+        <w:t xml:space="preserve">Desde Tipos de Equipo se puede agregar, editar o desactivar las </w:t>
+      </w:r>
+      <w:r>
+        <w:t>categorías del inventario. Ejemplos predeterminados: Computador de Escritorio, Laptop, Impresora, Monitor, Escáner, Proyector.</w:t>
+      </w:r>
+    </w:p>
+    <w:p/>
+    <w:p>
+      <w:pPr>
+        <w:pStyle w:val="Ttulo3"/>
+      </w:pPr>
+      <w:r>
+        <w:rPr>
+          <w:color w:val="4D7C8A"/>
+        </w:rPr>
+        <w:t>Actividades de mantenimiento</w:t>
+      </w:r>
+    </w:p>
+    <w:p>
+      <w:r>
+        <w:t>Desde Actividades de Mantenimiento se puede gestionar el checklist que aparece en cada mantenimient</w:t>
+      </w:r>
+      <w:r>
+        <w:t>o interno: cambiar el nombre de un ítem, agregar nuevos o desactivar los que ya no aplican. El orden se ajusta con el campo Orden.</w:t>
       </w:r>
     </w:p>
     <w:sectPr>
@@ -19875,7 +21704,7 @@
 </file>
 
 <file path=customXml/itemProps1.xml><?xml version="1.0" encoding="utf-8"?>
-<ds:datastoreItem xmlns:ds="http://schemas.openxmlformats.org/officeDocument/2006/customXml" ds:itemID="{105DD092-1A88-4F57-86D6-13E21A99E889}">
+<ds:datastoreItem xmlns:ds="http://schemas.openxmlformats.org/officeDocument/2006/customXml" ds:itemID="{023430FD-C389-43FB-8D1E-604C070782E3}">
   <ds:schemaRefs>
     <ds:schemaRef ds:uri="http://schemas.openxmlformats.org/officeDocument/2006/bibliography"/>
   </ds:schemaRefs>

</xml_diff>